<commit_message>
Report draft 2 (in progress): held-out validation, 4-player diagnostics, condensed text
- validation on disjoint deals (seed block 100 000): 3 players, 100 ms done; others queued
- 4-player search diagnostics (Bench4, TreeStats4, Agree4) and iterations probe of v3/v4
- report text revised after the first independent review: numbers computed from the
  result files, 15 references, main text within four pages, Gen-AI statement
- README: tree statistics updated to the new diagnostics

Co-Authored-By: Claude Opus 5.5 <noreply@anthropic.com>
Claude-Session: https://claude.ai/code/session_01Jg1ytYCX7c7JubKoggMArC
</commit_message>
<xml_diff>
--- a/report/ECS7032P_Assignment1_Report_GroupA.docx
+++ b/report/ECS7032P_Assignment1_Report_GroupA.docx
@@ -169,7 +169,7 @@
         <w:sectPr>
           <w:type w:val="continuous"/>
           <w:pgSz w:w="11906" w:h="16838"/>
-          <w:pgMar w:left="893" w:right="893" w:gutter="0" w:header="0" w:top="540" w:footer="720" w:bottom="1440"/>
+          <w:pgMar w:left="893" w:right="893" w:gutter="0" w:header="0" w:top="1080" w:footer="720" w:bottom="1440"/>
           <w:cols w:num="3" w:space="720" w:equalWidth="true" w:sep="false"/>
           <w:formProt w:val="false"/>
           <w:titlePg/>
@@ -183,7 +183,7 @@
         <w:sectPr>
           <w:type w:val="continuous"/>
           <w:pgSz w:w="11906" w:h="16838"/>
-          <w:pgMar w:left="893" w:right="893" w:gutter="0" w:header="0" w:top="540" w:footer="720" w:bottom="1440"/>
+          <w:pgMar w:left="893" w:right="893" w:gutter="0" w:header="0" w:top="1080" w:footer="720" w:bottom="1440"/>
           <w:cols w:num="3" w:space="720" w:equalWidth="true" w:sep="false"/>
           <w:formProt w:val="false"/>
           <w:titlePg/>
@@ -203,7 +203,7 @@
         <w:t>Abstract—</w:t>
       </w:r>
       <w:r>
-        <w:t>In the card-drafting game Sushi Go! two to five players pick cards simultaneously from hidden hands that are passed around the table, so a planning agent faces hidden information, simultaneous moves and delayed scoring. Starting from TAG's BasicMCTS, we added a model of the game's scoring that drives both the evaluation and the rollouts, rollouts that end with the round, max-n backups, decoupled UCT for the simultaneous choices and single-observer information-set search. In 500 three-player games at 100 ms per decision the agent wins 55.0% [50.6, 59.3] against TAG's tuned ISMCTS and our previous agent (chance 33.3%) and 84–87% against BasicMCTS, RHEA and OSLA. Paired ablations show that the heuristic and the game-matched tree matter most, whereas a much stronger rollout policy does not help.</w:t>
+        <w:t>In Sushi Go! players pick cards simultaneously from hidden hands that rotate around the table, which basic Monte Carlo tree search (MCTS) does not model. Starting from TAG's BasicMCTS, we added a model of the game's scoring that drives evaluation and rollouts, rollouts that end with the round, max-n backups, decoupled UCT for the simultaneous choices and information-set search. On held-out deals the agent wins 52.6% of 500 three-player games at 100 ms against TAG's ISMCTS and our previous agent (chance 33.3%), [pending]% with four players (chance 25%) and [pending]% at 900 ms. Ablations show that the heuristic and the simultaneous-move tree matter most, that the tree's advantage tends to grow with the time budget, and that four players need different settings.</w:t>
       </w:r>
     </w:p>
     <w:p>
@@ -233,7 +233,7 @@
         <w:pStyle w:val="BodyText"/>
       </w:pPr>
       <w:r>
-        <w:t xml:space="preserve">Tabletop games are a long-standing test bed for game AI: they combine chance, hidden information and several interacting players within small, well-defined rule sets. The Tabletop Games framework (TAG) [1] gives such games a common Java interface so that agents can be compared on them. One of its games is </w:t>
+        <w:t xml:space="preserve">Tabletop games combine chance, hidden information and several interacting players within small, well-defined rule sets, which makes them a long-standing test bed for game AI; the Tabletop Games framework (TAG) [1] gives many of them a common interface so that agents can be compared. Monte Carlo tree search (MCTS) [2] is the usual starting point for such agents, but its basic form assumes that the state is fully observed and that players move one after another [3]. </w:t>
       </w:r>
       <w:r>
         <w:rPr>
@@ -242,7 +242,7 @@
         <w:t>Sushi Go!</w:t>
       </w:r>
       <w:r>
-        <w:t xml:space="preserve"> (P. Walker-Harding, Gamewright, 2013): every player secretly picks one card from its hand, all players reveal their cards at the same time and pass the rest of their hands to the next player, and after three rounds the player with the most points wins. Klang et al. [2] introduced the game to TAG and assessed simultaneous action selection and complete information in it; the current version, which we use, shows an agent only the cards it has seen.</w:t>
+        <w:t>, one of TAG's games, breaks both assumptions: every player secretly picks one card from its hand, all players reveal their cards together and pass the rest of their hands on, and after three rounds the highest score wins. Klang et al. [4] introduced the game to TAG and assessed simultaneous action selection and complete information in it; the current version, which we use, shows an agent only the cards it has seen.</w:t>
       </w:r>
     </w:p>
     <w:p>
@@ -250,7 +250,7 @@
         <w:pStyle w:val="BodyText"/>
       </w:pPr>
       <w:r>
-        <w:t>Four properties make Sushi Go! hard for a search agent. (i) The opponents' hands are hidden until they are passed on, so the true state is unknown at the start of every round. (ii) Moves are simultaneous: no card can be chosen in reaction to an opponent's card of the same turn. (iii) Most points are delayed and conditional – sets pay out only when completed, Maki rolls at the end of the round and Pudding at the end of the game – so short simulations miss them and long ones are noisy. (iv) With up to ten cards per hand and three or four players a turn has hundreds of joint moves, and an agent has 0.1–1 s per decision. TAG's BasicMCTS addresses none of the first three: it searches the single shuffled sample of the hidden cards it receives as if it were the true state, treats the players of a turn as moving one after another and evaluates random rollouts with the raw score.</w:t>
+        <w:t>Four properties make the game hard for a search agent. (i) The opponents' hands are hidden until they are passed on. (ii) Moves are simultaneous: no card can be chosen in reaction to an opponent's card of the same turn. (iii) Many points are delayed and conditional – sets pay out only when completed, Maki rolls at the end of the round and Pudding at the end of the game – so short simulations miss them and long ones are noisy. (iv) Hands of nine (three players) or eight cards (four players) give up to 729 or 4 096 joint moves per turn, with 0.1–1 s per decision. TAG's BasicMCTS addresses none of the first three: it searches the one shuffled sample of the hidden cards it receives as if it were the true state, treats the players of a turn as moving one after another and evaluates random rollouts by the player's own score.</w:t>
       </w:r>
     </w:p>
     <w:p>
@@ -258,7 +258,7 @@
         <w:pStyle w:val="BodyText"/>
       </w:pPr>
       <w:r>
-        <w:t>We ask which adaptations of Monte Carlo tree search (MCTS) to these properties make an agent stronger, and how their value changes with the time per decision and the number of players. We answer this by extending BasicMCTS in steps, keeping every modification as a switch, and measuring each in experiments of 500 games. Our contributions are:</w:t>
+        <w:t>We ask which adaptations of MCTS to these properties make an agent stronger (RQ1), and how their value changes with the time per decision (RQ2) and the number of players (RQ3). We extend BasicMCTS in steps, keeping every modification as a switch, and test each in experiments of (mostly) 500 games. Our contributions are:</w:t>
       </w:r>
     </w:p>
     <w:p>
@@ -284,7 +284,7 @@
         <w:ind w:left="576" w:hanging="288"/>
       </w:pPr>
       <w:r>
-        <w:t>a search matched to the game – rollouts that end with the round, max-n backups, decoupled UCT and single-observer information-set MCTS – built on BasicMCTS, which keeps its strength at long budgets, unlike our sequential-tree agent, whose win rate fell from 50% to 33% between 100 and 900 ms;</w:t>
+        <w:t>a re-implementation on BasicMCTS of round-end rollouts, max-n backups, decoupled UCT and information-set search, combined with this model and compared with TAG's own decoupled information-set MCTS;</w:t>
       </w:r>
     </w:p>
     <w:p>
@@ -297,7 +297,7 @@
         <w:ind w:left="576" w:hanging="288"/>
       </w:pPr>
       <w:r>
-        <w:t>settings and a fast simulator for four players;</w:t>
+        <w:t>evidence that the best settings differ between three and four players;</w:t>
       </w:r>
     </w:p>
     <w:p>
@@ -310,7 +310,7 @@
         <w:ind w:left="576" w:hanging="288"/>
       </w:pPr>
       <w:r>
-        <w:t>an experimental study of 161 runs (67 500 games) with leave-one-out ablations, a 2</w:t>
+        <w:t>a study of 159 runs (67 850 games) with leave-one-out ablations, a 2</w:t>
       </w:r>
       <w:r>
         <w:rPr>
@@ -319,7 +319,7 @@
         <w:t>4</w:t>
       </w:r>
       <w:r>
-        <w:t xml:space="preserve"> factorial design, validation on unseen deals and negative results showing that the model of the game, not the search effort, now limits the agent.</w:t>
+        <w:t xml:space="preserve"> factorial design, validation on held-out deals and negative results that locate the agent's remaining limits.</w:t>
       </w:r>
     </w:p>
     <w:p>
@@ -343,7 +343,7 @@
         <w:pStyle w:val="BodyText"/>
       </w:pPr>
       <w:r>
-        <w:t xml:space="preserve">TAG [1] splits a game into a state, a forward model and parameters; an agent receives a copy of the state, in which every card it has not seen has been reshuffled, and uses the forward model to simulate moves. In TAG's Sushi Go! the 108-card deck holds Tempura (5 points per pair), Sashimi (10 per triple), Dumplings (1, 3, 6, 10 or 15 points for one to five), Salmon, Squid and Egg Nigiri (2, 3 and 1 points, tripled on an earlier Wasabi), Maki rolls with one to three icons (6 and 3 points for the most and second-most icons of a round), Chopsticks (two cards in a later turn) and Pudding (+6 for the most and, with three or more players, −6 for the fewest at the end of the game). Each round deals 12 − </w:t>
+        <w:t xml:space="preserve">TAG [1] splits a game into a state, a forward model and parameters; an agent receives a copy of the state, in which every card it has not seen is reshuffled, and uses the forward model to simulate moves. In TAG's Sushi Go! the 108-card deck holds Tempura (5 points per pair), Sashimi (10 per triple), Dumplings (1, 3, 6, 10 or 15 points for one to five), Salmon, Squid and Egg Nigiri (2, 3 and 1 points, tripled on an earlier Wasabi), Maki rolls with one to three icons (6 and 3 points for the most and second-most icons of a round), Chopsticks (two cards in a later turn) and Pudding (+6 for the most and, with three or more players, −6 for the fewest at the end of the game). Each round deals 12 − </w:t>
       </w:r>
       <w:r>
         <w:rPr>
@@ -386,7 +386,7 @@
         <w:pStyle w:val="BodyText"/>
       </w:pPr>
       <w:r>
-        <w:t xml:space="preserve">MCTS [3] builds a search tree by repeating four steps: selection, expansion, simulation (rollout) and backpropagation. UCT [4] selects children with the UCB1 rule [5], maximising </w:t>
+        <w:t xml:space="preserve">MCTS [2] builds a search tree by repeating selection, expansion, simulation (rollout) and backpropagation. Upper Confidence bounds applied to Trees (UCT) [5] selects the child that maximises </w:t>
       </w:r>
       <w:r>
         <w:rPr>
@@ -422,7 +422,7 @@
         <w:t>n</w:t>
       </w:r>
       <w:r>
-        <w:t xml:space="preserve">) for a child with mean reward </w:t>
+        <w:t xml:space="preserve">), where </w:t>
       </w:r>
       <w:r>
         <w:rPr>
@@ -431,7 +431,7 @@
         <w:t>Q</w:t>
       </w:r>
       <w:r>
-        <w:t xml:space="preserve"> visited </w:t>
+        <w:t xml:space="preserve"> is the child's mean reward, </w:t>
       </w:r>
       <w:r>
         <w:rPr>
@@ -440,7 +440,7 @@
         <w:t>n</w:t>
       </w:r>
       <w:r>
-        <w:t xml:space="preserve"> of </w:t>
+        <w:t xml:space="preserve"> its visits and </w:t>
       </w:r>
       <w:r>
         <w:rPr>
@@ -449,7 +449,7 @@
         <w:t>N</w:t>
       </w:r>
       <w:r>
-        <w:t xml:space="preserve"> times, which balances exploitation and exploration. Domain knowledge can enter through heuristic rollout policies [6] or through priors such as progressive bias [7]. A stronger rollout policy does not guarantee better estimates, however: Silver and Tesauro [8] showed that rollout outcomes need to be unbiased rather than produced by a strong player (simulation balancing).</w:t>
+        <w:t xml:space="preserve"> those of its parent. Domain knowledge can enter through heuristic rollout policies [2] or priors such as progressive bias [6]. A stronger rollout policy does not guarantee better estimates, however: Silver and Tesauro [7] showed that rollouts should be balanced, i.e., give unbiased value estimates, rather than be played by a strong policy.</w:t>
       </w:r>
     </w:p>
     <w:p>
@@ -465,7 +465,7 @@
         <w:pStyle w:val="BodyText"/>
       </w:pPr>
       <w:r>
-        <w:t xml:space="preserve">Determinization, or perfect-information Monte Carlo (PIMC) sampling, samples the hidden information, searches each sample as if it were the true state and combines the results. Long et al. [9] related its success in card games to properties such as how quickly hidden information is revealed during play, which in Sushi Go! happens within </w:t>
+        <w:t xml:space="preserve">Determinisation, or perfect-information Monte Carlo (PIMC) sampling, samples the hidden information, searches each sample as if it were the true state and combines the results. Long et al. [8] related its success in card games to properties such as how quickly hidden information is revealed during play, which in Sushi Go! happens within </w:t>
       </w:r>
       <w:r>
         <w:rPr>
@@ -474,16 +474,7 @@
         <w:t>n</w:t>
       </w:r>
       <w:r>
-        <w:t xml:space="preserve"> − 1 turns. Its known flaw is strategy fusion: the search assumes that it can act differently in states it cannot tell apart [10], and in a drafting game it plans around opponent cards it cannot know. Information-set MCTS (ISMCTS) [11] avoids this by searching one tree over the searching player's information sets and sampling the hidden information anew in every iteration; it was developed for card games such as Dou Di Zhu. Its single-observer form treats the opponents as if they knew what the searcher knows, whereas the multiple-observer form models their knowledge with one tree per player at a higher cost [11]. In Sushi Go! every player knows its own hand at the start of a round and all hands after </w:t>
-      </w:r>
-      <w:r>
-        <w:rPr>
-          <w:i/>
-        </w:rPr>
-        <w:t>n</w:t>
-      </w:r>
-      <w:r>
-        <w:t xml:space="preserve"> − 1 passes, so the single-observer approximation errs only early in each round.</w:t>
+        <w:t xml:space="preserve"> − 1 turns. Its known flaws are strategy fusion – the search assumes that it can act differently in states it cannot tell apart – and non-locality [9]. Information-set MCTS (ISMCTS) [3] avoids strategy fusion by searching one tree over the searcher's information sets and sampling the hidden information anew in every iteration; it was developed for card games such as the three-player Dou Di Zhu. In its single-observer form the opponents' choices in the tree are not conditioned on their own private information; the multiple-observer form models it with one tree per player at a higher cost [3], an idea TAG's advanced MCTS agent offers as MultiTree MCTS [10].</w:t>
       </w:r>
     </w:p>
     <w:p>
@@ -491,7 +482,7 @@
         <w:pStyle w:val="BodyText"/>
       </w:pPr>
       <w:r>
-        <w:t>Simultaneous moves are usually handled by decoupled UCT (DUCT): every player chooses its own action at a node from its own bandit statistics and the joint action leads to a child [12]. With UCB selection DUCT is not guaranteed to converge to an equilibrium, so variants with EXP3 or regret matching were proposed [12], and which variant works best depends on the game [13]; these studies used two-player games such as Goofspiel. In multi-player games the max-n backup, in which every player maximises its own value, generally outperforms the paranoid assumption that all opponents play against us [14].</w:t>
+        <w:t>Simultaneous moves are usually handled by decoupled UCT (DUCT): every player chooses its own action at a node from its own bandit statistics and the joint action leads to a child [11]. UCB-based DUCT need not converge to an equilibrium, so Lanctot et al. [11] compared it with EXP3 and regret-matching selection, and Tak et al. [12] found that the best variant depends on the game; both studies used two-player games such as Goofspiel. In multi-player games, UCT with max-n backups, in which every player maximises its own value, computes a mixed-strategy equilibrium and played as well as or better than earlier multi-player search algorithms in Sturtevant's experiments [13].</w:t>
       </w:r>
     </w:p>
     <w:p>
@@ -499,7 +490,7 @@
         <w:pStyle w:val="BodyText"/>
       </w:pPr>
       <w:r>
-        <w:t>BasicMCTS, the starting point allowed for this work, uses none of these ideas, and the earlier Sushi Go! study in TAG [2] predates the version of the game with hidden hands. ISMCTS and DUCT have been studied separately and mostly in two-player games; how they combine with domain knowledge in a multi-player drafting game, what each contributes, and how this depends on the time budget and the number of players is not known – the questions this report answers.</w:t>
+        <w:t>TAG's advanced MCTS agent already offers information sets, one tree per player and a decoupled option, but the assignment does not allow it as a basis; BasicMCTS has none of these ideas. How they combine with domain knowledge in a multi-player drafting game, what each contributes, and how this depends on the time budget and the number of players has not been studied: the earlier Sushi Go! study [4] predates the version with hidden hands. These are the questions this paper answers.</w:t>
       </w:r>
     </w:p>
     <w:p>
@@ -524,7 +515,7 @@
         <w:t>players.basicMCTS</w:t>
       </w:r>
       <w:r>
-        <w:t>) and uses no code of TAG's advanced MCTS agent. Every modification is a switch in its parameter class, so all variants in our experiments run the same code. Table I lists the modifications and Fig. 1 shows one iteration of the final agent. Beyond the published techniques we combine, three elements are our own: one card-value model serves both the evaluation and every player's simulation, decoupled selection runs on an open-loop information-set tree whose statistics are keyed by card type, and the agent switches its settings with the number of players.</w:t>
+        <w:t>) and uses no code of TAG's advanced MCTS agent. Every modification is a switch in its parameter class (Table I), so all variants run the same code; Fig. 1 shows one iteration of the final agent. The search techniques come from the literature; our own elements are the card-value model shared by the evaluation and every player's simulation, and its integration with these techniques on BasicMCTS.</w:t>
       </w:r>
     </w:p>
     <w:p>
@@ -549,8 +540,8 @@
         <w:tblLayout w:type="fixed"/>
       </w:tblPr>
       <w:tblGrid>
-        <w:gridCol w:w="892"/>
-        <w:gridCol w:w="2880"/>
+        <w:gridCol w:w="720"/>
+        <w:gridCol w:w="3052"/>
         <w:gridCol w:w="1094"/>
       </w:tblGrid>
       <w:tr>
@@ -559,7 +550,7 @@
         </w:trPr>
         <w:tc>
           <w:tcPr>
-            <w:tcW w:type="dxa" w:w="893"/>
+            <w:tcW w:type="dxa" w:w="720"/>
             <w:tcMar>
               <w:left w:w="50" w:type="dxa"/>
               <w:right w:w="50" w:type="dxa"/>
@@ -581,7 +572,7 @@
         </w:tc>
         <w:tc>
           <w:tcPr>
-            <w:tcW w:type="dxa" w:w="2880"/>
+            <w:tcW w:type="dxa" w:w="3053"/>
             <w:tcMar>
               <w:left w:w="50" w:type="dxa"/>
               <w:right w:w="50" w:type="dxa"/>
@@ -630,7 +621,7 @@
         </w:trPr>
         <w:tc>
           <w:tcPr>
-            <w:tcW w:type="dxa" w:w="893"/>
+            <w:tcW w:type="dxa" w:w="720"/>
             <w:tcMar>
               <w:left w:w="50" w:type="dxa"/>
               <w:right w:w="50" w:type="dxa"/>
@@ -649,7 +640,7 @@
         </w:tc>
         <w:tc>
           <w:tcPr>
-            <w:tcW w:type="dxa" w:w="2880"/>
+            <w:tcW w:type="dxa" w:w="3053"/>
             <w:tcMar>
               <w:left w:w="50" w:type="dxa"/>
               <w:right w:w="50" w:type="dxa"/>
@@ -692,7 +683,7 @@
         </w:trPr>
         <w:tc>
           <w:tcPr>
-            <w:tcW w:type="dxa" w:w="893"/>
+            <w:tcW w:type="dxa" w:w="720"/>
             <w:tcMar>
               <w:left w:w="50" w:type="dxa"/>
               <w:right w:w="50" w:type="dxa"/>
@@ -711,7 +702,7 @@
         </w:tc>
         <w:tc>
           <w:tcPr>
-            <w:tcW w:type="dxa" w:w="2880"/>
+            <w:tcW w:type="dxa" w:w="3053"/>
             <w:tcMar>
               <w:left w:w="50" w:type="dxa"/>
               <w:right w:w="50" w:type="dxa"/>
@@ -724,7 +715,7 @@
               <w:jc w:val="left"/>
             </w:pPr>
             <w:r>
-              <w:t>ε-greedy card-value rollouts for every player [6]</w:t>
+              <w:t>ε-greedy card-value rollouts for every player</w:t>
             </w:r>
           </w:p>
         </w:tc>
@@ -754,7 +745,7 @@
         </w:trPr>
         <w:tc>
           <w:tcPr>
-            <w:tcW w:type="dxa" w:w="893"/>
+            <w:tcW w:type="dxa" w:w="720"/>
             <w:tcMar>
               <w:left w:w="50" w:type="dxa"/>
               <w:right w:w="50" w:type="dxa"/>
@@ -773,7 +764,7 @@
         </w:tc>
         <w:tc>
           <w:tcPr>
-            <w:tcW w:type="dxa" w:w="2880"/>
+            <w:tcW w:type="dxa" w:w="3053"/>
             <w:tcMar>
               <w:left w:w="50" w:type="dxa"/>
               <w:right w:w="50" w:type="dxa"/>
@@ -816,7 +807,7 @@
         </w:trPr>
         <w:tc>
           <w:tcPr>
-            <w:tcW w:type="dxa" w:w="893"/>
+            <w:tcW w:type="dxa" w:w="720"/>
             <w:tcMar>
               <w:left w:w="50" w:type="dxa"/>
               <w:right w:w="50" w:type="dxa"/>
@@ -835,7 +826,7 @@
         </w:tc>
         <w:tc>
           <w:tcPr>
-            <w:tcW w:type="dxa" w:w="2880"/>
+            <w:tcW w:type="dxa" w:w="3053"/>
             <w:tcMar>
               <w:left w:w="50" w:type="dxa"/>
               <w:right w:w="50" w:type="dxa"/>
@@ -878,7 +869,7 @@
         </w:trPr>
         <w:tc>
           <w:tcPr>
-            <w:tcW w:type="dxa" w:w="893"/>
+            <w:tcW w:type="dxa" w:w="720"/>
             <w:tcMar>
               <w:left w:w="50" w:type="dxa"/>
               <w:right w:w="50" w:type="dxa"/>
@@ -897,7 +888,7 @@
         </w:tc>
         <w:tc>
           <w:tcPr>
-            <w:tcW w:type="dxa" w:w="2880"/>
+            <w:tcW w:type="dxa" w:w="3053"/>
             <w:tcMar>
               <w:left w:w="50" w:type="dxa"/>
               <w:right w:w="50" w:type="dxa"/>
@@ -910,7 +901,7 @@
               <w:jc w:val="left"/>
             </w:pPr>
             <w:r>
-              <w:t>max-n backups [14]</w:t>
+              <w:t>max-n backups [13]</w:t>
             </w:r>
           </w:p>
         </w:tc>
@@ -940,7 +931,7 @@
         </w:trPr>
         <w:tc>
           <w:tcPr>
-            <w:tcW w:type="dxa" w:w="893"/>
+            <w:tcW w:type="dxa" w:w="720"/>
             <w:tcMar>
               <w:left w:w="50" w:type="dxa"/>
               <w:right w:w="50" w:type="dxa"/>
@@ -959,7 +950,7 @@
         </w:tc>
         <w:tc>
           <w:tcPr>
-            <w:tcW w:type="dxa" w:w="2880"/>
+            <w:tcW w:type="dxa" w:w="3053"/>
             <w:tcMar>
               <w:left w:w="50" w:type="dxa"/>
               <w:right w:w="50" w:type="dxa"/>
@@ -972,7 +963,7 @@
               <w:jc w:val="left"/>
             </w:pPr>
             <w:r>
-              <w:t>decoupled UCT, one node per turn [12]</w:t>
+              <w:t>decoupled UCT, one node per turn [11]</w:t>
             </w:r>
           </w:p>
         </w:tc>
@@ -1002,7 +993,7 @@
         </w:trPr>
         <w:tc>
           <w:tcPr>
-            <w:tcW w:type="dxa" w:w="893"/>
+            <w:tcW w:type="dxa" w:w="720"/>
             <w:tcMar>
               <w:left w:w="50" w:type="dxa"/>
               <w:right w:w="50" w:type="dxa"/>
@@ -1021,7 +1012,7 @@
         </w:tc>
         <w:tc>
           <w:tcPr>
-            <w:tcW w:type="dxa" w:w="2880"/>
+            <w:tcW w:type="dxa" w:w="3053"/>
             <w:tcMar>
               <w:left w:w="50" w:type="dxa"/>
               <w:right w:w="50" w:type="dxa"/>
@@ -1034,7 +1025,7 @@
               <w:jc w:val="left"/>
             </w:pPr>
             <w:r>
-              <w:t>single-observer information-set search [11]</w:t>
+              <w:t>single-observer information-set search [3]</w:t>
             </w:r>
           </w:p>
         </w:tc>
@@ -1064,7 +1055,7 @@
         </w:trPr>
         <w:tc>
           <w:tcPr>
-            <w:tcW w:type="dxa" w:w="893"/>
+            <w:tcW w:type="dxa" w:w="720"/>
             <w:tcMar>
               <w:left w:w="50" w:type="dxa"/>
               <w:right w:w="50" w:type="dxa"/>
@@ -1083,7 +1074,7 @@
         </w:tc>
         <w:tc>
           <w:tcPr>
-            <w:tcW w:type="dxa" w:w="2880"/>
+            <w:tcW w:type="dxa" w:w="3053"/>
             <w:tcMar>
               <w:left w:w="50" w:type="dxa"/>
               <w:right w:w="50" w:type="dxa"/>
@@ -1096,7 +1087,13 @@
               <w:jc w:val="left"/>
             </w:pPr>
             <w:r>
-              <w:t>card-model constants tuned for 4 players</w:t>
+              <w:t xml:space="preserve">card-model constants tuned for 4 players </w:t>
+            </w:r>
+            <w:r>
+              <w:rPr>
+                <w:vertAlign w:val="superscript"/>
+              </w:rPr>
+              <w:t>a</w:t>
             </w:r>
           </w:p>
         </w:tc>
@@ -1126,7 +1123,7 @@
         </w:trPr>
         <w:tc>
           <w:tcPr>
-            <w:tcW w:type="dxa" w:w="893"/>
+            <w:tcW w:type="dxa" w:w="720"/>
             <w:tcMar>
               <w:left w:w="50" w:type="dxa"/>
               <w:right w:w="50" w:type="dxa"/>
@@ -1139,13 +1136,13 @@
               <w:jc w:val="left"/>
             </w:pPr>
             <w:r>
-              <w:t>W2, F, L</w:t>
-            </w:r>
-          </w:p>
-        </w:tc>
-        <w:tc>
-          <w:tcPr>
-            <w:tcW w:type="dxa" w:w="2880"/>
+              <w:t>W2</w:t>
+            </w:r>
+          </w:p>
+        </w:tc>
+        <w:tc>
+          <w:tcPr>
+            <w:tcW w:type="dxa" w:w="3053"/>
             <w:tcMar>
               <w:left w:w="50" w:type="dxa"/>
               <w:right w:w="50" w:type="dxa"/>
@@ -1158,7 +1155,7 @@
               <w:jc w:val="left"/>
             </w:pPr>
             <w:r>
-              <w:t>win-gap value, fast simulator, 8 rollouts per leaf</w:t>
+              <w:t>win-gap value for 4 players (Section III-D)</w:t>
             </w:r>
           </w:p>
         </w:tc>
@@ -1183,7 +1180,7 @@
               <w:rPr>
                 <w:vertAlign w:val="superscript"/>
               </w:rPr>
-              <w:t>a</w:t>
+              <w:t>b</w:t>
             </w:r>
           </w:p>
         </w:tc>
@@ -1194,7 +1191,7 @@
         </w:trPr>
         <w:tc>
           <w:tcPr>
-            <w:tcW w:type="dxa" w:w="893"/>
+            <w:tcW w:type="dxa" w:w="720"/>
             <w:tcMar>
               <w:left w:w="50" w:type="dxa"/>
               <w:right w:w="50" w:type="dxa"/>
@@ -1207,13 +1204,13 @@
               <w:jc w:val="left"/>
             </w:pPr>
             <w:r>
-              <w:t>A</w:t>
-            </w:r>
-          </w:p>
-        </w:tc>
-        <w:tc>
-          <w:tcPr>
-            <w:tcW w:type="dxa" w:w="2880"/>
+              <w:t>F, L</w:t>
+            </w:r>
+          </w:p>
+        </w:tc>
+        <w:tc>
+          <w:tcPr>
+            <w:tcW w:type="dxa" w:w="3053"/>
             <w:tcMar>
               <w:left w:w="50" w:type="dxa"/>
               <w:right w:w="50" w:type="dxa"/>
@@ -1226,7 +1223,7 @@
               <w:jc w:val="left"/>
             </w:pPr>
             <w:r>
-              <w:t>progressive bias [7]</w:t>
+              <w:t>fast simulator, 8 rollouts per leaf</w:t>
             </w:r>
           </w:p>
         </w:tc>
@@ -1245,7 +1242,13 @@
               <w:jc w:val="center"/>
             </w:pPr>
             <w:r>
-              <w:t>dropped in v3</w:t>
+              <w:t xml:space="preserve">– / ✓ </w:t>
+            </w:r>
+            <w:r>
+              <w:rPr>
+                <w:vertAlign w:val="superscript"/>
+              </w:rPr>
+              <w:t>b</w:t>
             </w:r>
           </w:p>
         </w:tc>
@@ -1256,7 +1259,7 @@
         </w:trPr>
         <w:tc>
           <w:tcPr>
-            <w:tcW w:type="dxa" w:w="893"/>
+            <w:tcW w:type="dxa" w:w="720"/>
             <w:tcMar>
               <w:left w:w="50" w:type="dxa"/>
               <w:right w:w="50" w:type="dxa"/>
@@ -1269,13 +1272,13 @@
               <w:jc w:val="left"/>
             </w:pPr>
             <w:r>
-              <w:t>D</w:t>
-            </w:r>
-          </w:p>
-        </w:tc>
-        <w:tc>
-          <w:tcPr>
-            <w:tcW w:type="dxa" w:w="2880"/>
+              <w:t>A</w:t>
+            </w:r>
+          </w:p>
+        </w:tc>
+        <w:tc>
+          <w:tcPr>
+            <w:tcW w:type="dxa" w:w="3053"/>
             <w:tcMar>
               <w:left w:w="50" w:type="dxa"/>
               <w:right w:w="50" w:type="dxa"/>
@@ -1288,7 +1291,7 @@
               <w:jc w:val="left"/>
             </w:pPr>
             <w:r>
-              <w:t>ensemble of up to 4 determinized trees [9]</w:t>
+              <w:t>progressive bias [6]</w:t>
             </w:r>
           </w:p>
         </w:tc>
@@ -1307,7 +1310,7 @@
               <w:jc w:val="center"/>
             </w:pPr>
             <w:r>
-              <w:t>replaced by I</w:t>
+              <w:t>dropped in v3</w:t>
             </w:r>
           </w:p>
         </w:tc>
@@ -1315,7 +1318,7 @@
       <w:tr>
         <w:tc>
           <w:tcPr>
-            <w:tcW w:type="dxa" w:w="893"/>
+            <w:tcW w:type="dxa" w:w="720"/>
             <w:tcMar>
               <w:left w:w="50" w:type="dxa"/>
               <w:right w:w="50" w:type="dxa"/>
@@ -1328,13 +1331,13 @@
               <w:jc w:val="left"/>
             </w:pPr>
             <w:r>
-              <w:t>N</w:t>
-            </w:r>
-          </w:p>
-        </w:tc>
-        <w:tc>
-          <w:tcPr>
-            <w:tcW w:type="dxa" w:w="2880"/>
+              <w:t>D</w:t>
+            </w:r>
+          </w:p>
+        </w:tc>
+        <w:tc>
+          <w:tcPr>
+            <w:tcW w:type="dxa" w:w="3053"/>
             <w:tcMar>
               <w:left w:w="50" w:type="dxa"/>
               <w:right w:w="50" w:type="dxa"/>
@@ -1347,7 +1350,7 @@
               <w:jc w:val="left"/>
             </w:pPr>
             <w:r>
-              <w:t>denial in the rollouts (Section IV-E)</w:t>
+              <w:t>ensemble of up to 4 determinised trees [8]</w:t>
             </w:r>
           </w:p>
         </w:tc>
@@ -1366,7 +1369,7 @@
               <w:jc w:val="center"/>
             </w:pPr>
             <w:r>
-              <w:t>not adopted</w:t>
+              <w:t>replaced by I</w:t>
             </w:r>
           </w:p>
         </w:tc>
@@ -1384,6 +1387,45 @@
           <w:vertAlign w:val="superscript"/>
         </w:rPr>
         <w:t>a</w:t>
+      </w:r>
+      <w:r>
+        <w:rPr>
+          <w:sz w:val="14"/>
+        </w:rPr>
+        <w:t xml:space="preserve"> σ 15, </w:t>
+      </w:r>
+      <w:r>
+        <w:rPr>
+          <w:i/>
+          <w:sz w:val="14"/>
+        </w:rPr>
+        <w:t>w</w:t>
+      </w:r>
+      <w:r>
+        <w:rPr>
+          <w:sz w:val="14"/>
+        </w:rPr>
+        <w:t xml:space="preserve"> 0.7, α 0.5, </w:t>
+      </w:r>
+      <w:r>
+        <w:rPr>
+          <w:i/>
+          <w:sz w:val="14"/>
+        </w:rPr>
+        <w:t>T</w:t>
+      </w:r>
+      <w:r>
+        <w:rPr>
+          <w:sz w:val="14"/>
+        </w:rPr>
+        <w:t xml:space="preserve"> 6; Sashimi discount 0.5; Maki horizon 3 with 0.25 per icon; next-Dumpling weight 1.5; Pudding factor 1.25; average Nigiri 3; 3 cards per missing card left in the hands. </w:t>
+      </w:r>
+      <w:r>
+        <w:rPr>
+          <w:sz w:val="14"/>
+          <w:vertAlign w:val="superscript"/>
+        </w:rPr>
+        <w:t>b</w:t>
       </w:r>
       <w:r>
         <w:rPr>
@@ -2173,7 +2215,7 @@
         <w:t>mv</w:t>
       </w:r>
       <w:r>
-        <w:t xml:space="preserve">, or a random card with probability ε = 0.2; the same policy is our model of the opponents. </w:t>
+        <w:t xml:space="preserve">, or a random card with probability ε = 0.2 (with Chopsticks, the second card is the best remaining one); the same policy models the opponents. </w:t>
       </w:r>
       <w:r>
         <w:rPr>
@@ -2182,7 +2224,7 @@
         <w:t>R:</w:t>
       </w:r>
       <w:r>
-        <w:t xml:space="preserve"> a rollout stops when the current round has been scored. After that only Pudding carries over, which (1) captures, whereas simulating the later rounds would add variance.</w:t>
+        <w:t xml:space="preserve"> a rollout stops when the current round has been scored; only Pudding carries over, which (1) captures, so the leaves are valued by banked points and the Pudding standing.</w:t>
       </w:r>
     </w:p>
     <w:p>
@@ -2213,7 +2255,7 @@
         <w:t>M:</w:t>
       </w:r>
       <w:r>
-        <w:t xml:space="preserve"> a node stores one value per player and every player maximises its own value [14]. </w:t>
+        <w:t xml:space="preserve"> a node stores one value per player and every player maximises its own value [13]. </w:t>
       </w:r>
       <w:r>
         <w:rPr>
@@ -2222,7 +2264,7 @@
         <w:t>S:</w:t>
       </w:r>
       <w:r>
-        <w:t xml:space="preserve"> one node represents a whole turn. At a node every player </w:t>
+        <w:t xml:space="preserve"> one node represents a whole turn; at a node every player </w:t>
       </w:r>
       <w:r>
         <w:rPr>
@@ -2231,7 +2273,7 @@
         <w:t>p</w:t>
       </w:r>
       <w:r>
-        <w:t xml:space="preserve"> chooses a card</w:t>
+        <w:t xml:space="preserve"> picks a card by</w:t>
       </w:r>
     </w:p>
     <w:p>
@@ -2341,8 +2383,29 @@
       <w:r>
         <w:rPr>
           <w:rFonts w:ascii="Times New Roman" w:hAnsi="Times New Roman" w:cs="Times New Roman" w:eastAsia="Times New Roman"/>
-        </w:rPr>
-        <w:t xml:space="preserve"> / </w:t>
+          <w:i/>
+          <w:vertAlign w:val="subscript"/>
+        </w:rPr>
+        <w:t>p</w:t>
+      </w:r>
+      <w:r>
+        <w:rPr>
+          <w:rFonts w:ascii="Times New Roman" w:hAnsi="Times New Roman" w:cs="Times New Roman" w:eastAsia="Times New Roman"/>
+        </w:rPr>
+        <w:t>(</w:t>
+      </w:r>
+      <w:r>
+        <w:rPr>
+          <w:rFonts w:ascii="Times New Roman" w:hAnsi="Times New Roman" w:cs="Times New Roman" w:eastAsia="Times New Roman"/>
+          <w:i/>
+        </w:rPr>
+        <w:t>a</w:t>
+      </w:r>
+      <w:r>
+        <w:rPr>
+          <w:rFonts w:ascii="Times New Roman" w:hAnsi="Times New Roman" w:cs="Times New Roman" w:eastAsia="Times New Roman"/>
+        </w:rPr>
+        <w:t xml:space="preserve">) / </w:t>
       </w:r>
       <w:r>
         <w:rPr>
@@ -2391,7 +2454,7 @@
         <w:pStyle w:val="BodyText"/>
       </w:pPr>
       <w:r>
-        <w:t xml:space="preserve">from its own statistics, trying untried cards first; the joint choice is played in the forward model and leads to the child of that joint action [12]. In our previous agent (v3) the players of a turn appeared one after another in the tree, so a later player “saw” the card an earlier player had just chosen, which is impossible in the real game. </w:t>
+        <w:t xml:space="preserve">from its own statistics, trying untried cards first; the joint choice is played in the forward model and leads to the child of that joint action [11]. In v3 the players of a turn appeared one after another in the tree, so a later player “saw” the card an earlier player had just chosen, which is impossible in the real game. </w:t>
       </w:r>
       <w:r>
         <w:rPr>
@@ -2400,7 +2463,7 @@
         <w:t>I:</w:t>
       </w:r>
       <w:r>
-        <w:t xml:space="preserve"> every iteration starts from a new sample of the cards we cannot see and walks one shared open-loop tree whose nodes store statistics but no states [11]. Statistics are keyed by card type, and </w:t>
+        <w:t xml:space="preserve"> every iteration starts from a new sample of the cards we cannot see and walks one shared open-loop tree, whose nodes store statistics but no states [3]. Statistics are keyed by card type; </w:t>
       </w:r>
       <w:r>
         <w:rPr>
@@ -2425,7 +2488,7 @@
         <w:t>a</w:t>
       </w:r>
       <w:r>
-        <w:t xml:space="preserve">) counts the iterations in which </w:t>
+        <w:t xml:space="preserve">) counts how often </w:t>
       </w:r>
       <w:r>
         <w:rPr>
@@ -2434,7 +2497,7 @@
         <w:t>p</w:t>
       </w:r>
       <w:r>
-        <w:t xml:space="preserve"> held card </w:t>
+        <w:t xml:space="preserve"> chose </w:t>
       </w:r>
       <w:r>
         <w:rPr>
@@ -2443,7 +2506,50 @@
         <w:t>a</w:t>
       </w:r>
       <w:r>
-        <w:t xml:space="preserve">. I replaces the determinization ensemble D of v2 and v3, which split the budget between up to four independent trees. With three players </w:t>
+        <w:t xml:space="preserve"> at the node and the availability count </w:t>
+      </w:r>
+      <w:r>
+        <w:rPr>
+          <w:i/>
+        </w:rPr>
+        <w:t>N</w:t>
+      </w:r>
+      <w:r>
+        <w:rPr>
+          <w:i/>
+          <w:vertAlign w:val="subscript"/>
+        </w:rPr>
+        <w:t>p</w:t>
+      </w:r>
+      <w:r>
+        <w:t>(</w:t>
+      </w:r>
+      <w:r>
+        <w:rPr>
+          <w:i/>
+        </w:rPr>
+        <w:t>a</w:t>
+      </w:r>
+      <w:r>
+        <w:t xml:space="preserve">) how many iterations reached the node with </w:t>
+      </w:r>
+      <w:r>
+        <w:rPr>
+          <w:i/>
+        </w:rPr>
+        <w:t>a</w:t>
+      </w:r>
+      <w:r>
+        <w:t xml:space="preserve"> in </w:t>
+      </w:r>
+      <w:r>
+        <w:rPr>
+          <w:i/>
+        </w:rPr>
+        <w:t>p</w:t>
+      </w:r>
+      <w:r>
+        <w:t xml:space="preserve">'s sampled hand. I replaces the determinisation ensemble D of v2 and v3, which split the budget between up to four independent trees. With three players </w:t>
       </w:r>
       <w:r>
         <w:rPr>
@@ -2452,7 +2558,7 @@
         <w:t>K</w:t>
       </w:r>
       <w:r>
-        <w:t xml:space="preserve"> = 0.5; after the budget the agent plays its most visited root card.</w:t>
+        <w:t xml:space="preserve"> = 0.5.</w:t>
       </w:r>
     </w:p>
     <w:p>
@@ -2468,94 +2574,125 @@
         <w:pStyle w:val="BodyText"/>
       </w:pPr>
       <w:r>
-        <w:t xml:space="preserve">With four players the best settings differ (Section IV-D), so the agent switches parameters by table size. </w:t>
+        <w:t xml:space="preserve">With four players the agent switches parameters (Section IV-D). It uses the card constants X0 (Table I), found by a search-free coordinate tuner that plays greedy card-value policies against each other. From 500 ms it also uses </w:t>
       </w:r>
       <w:r>
         <w:rPr>
           <w:b/>
         </w:rPr>
-        <w:t>X0:</w:t>
-      </w:r>
-      <w:r>
-        <w:t xml:space="preserve"> card-model constants (Sashimi discount, Maki standing weight, Dumpling, Pudding and Nigiri values, counting the cards still in the hands) found by a search-free coordinate tuner that plays greedy card-value policies against each other. At 500 ms or more the 4-player agent also uses </w:t>
+        <w:t>W2</w:t>
+      </w:r>
+      <w:r>
+        <w:t xml:space="preserve"> – </w:t>
+      </w:r>
+      <w:r>
+        <w:rPr>
+          <w:i/>
+        </w:rPr>
+        <w:t>w</w:t>
+      </w:r>
+      <w:r>
+        <w:t xml:space="preserve"> = 1; finished games valued by tanh((</w:t>
+      </w:r>
+      <w:r>
+        <w:rPr>
+          <w:i/>
+        </w:rPr>
+        <w:t>S</w:t>
+      </w:r>
+      <w:r>
+        <w:rPr>
+          <w:i/>
+          <w:vertAlign w:val="subscript"/>
+        </w:rPr>
+        <w:t>i</w:t>
+      </w:r>
+      <w:r>
+        <w:t xml:space="preserve"> − max</w:t>
+      </w:r>
+      <w:r>
+        <w:rPr>
+          <w:i/>
+          <w:vertAlign w:val="subscript"/>
+        </w:rPr>
+        <w:t>j</w:t>
+      </w:r>
+      <w:r>
+        <w:rPr>
+          <w:vertAlign w:val="subscript"/>
+        </w:rPr>
+        <w:t>≠</w:t>
+      </w:r>
+      <w:r>
+        <w:rPr>
+          <w:i/>
+          <w:vertAlign w:val="subscript"/>
+        </w:rPr>
+        <w:t>i</w:t>
+      </w:r>
+      <w:r>
+        <w:t xml:space="preserve"> </w:t>
+      </w:r>
+      <w:r>
+        <w:rPr>
+          <w:i/>
+        </w:rPr>
+        <w:t>S</w:t>
+      </w:r>
+      <w:r>
+        <w:rPr>
+          <w:i/>
+          <w:vertAlign w:val="subscript"/>
+        </w:rPr>
+        <w:t>j</w:t>
+      </w:r>
+      <w:r>
+        <w:t>)/2) with Pudding as tie-break; σ multiplied by (</w:t>
+      </w:r>
+      <w:r>
+        <w:rPr>
+          <w:i/>
+        </w:rPr>
+        <w:t>R</w:t>
+      </w:r>
+      <w:r>
+        <w:t>/2)</w:t>
+      </w:r>
+      <w:r>
+        <w:rPr>
+          <w:vertAlign w:val="superscript"/>
+        </w:rPr>
+        <w:t>0.5</w:t>
+      </w:r>
+      <w:r>
+        <w:t xml:space="preserve"> for </w:t>
+      </w:r>
+      <w:r>
+        <w:rPr>
+          <w:i/>
+        </w:rPr>
+        <w:t>R</w:t>
+      </w:r>
+      <w:r>
+        <w:t xml:space="preserve"> rounds left; opponents in the backup valuing their lead over the others' mean – and </w:t>
       </w:r>
       <w:r>
         <w:rPr>
           <w:b/>
         </w:rPr>
-        <w:t>W2:</w:t>
-      </w:r>
-      <w:r>
-        <w:t xml:space="preserve"> </w:t>
-      </w:r>
-      <w:r>
-        <w:rPr>
-          <w:i/>
-        </w:rPr>
-        <w:t>w</w:t>
-      </w:r>
-      <w:r>
-        <w:t xml:space="preserve"> = 1, finished games valued by tanh((</w:t>
-      </w:r>
-      <w:r>
-        <w:rPr>
-          <w:i/>
-        </w:rPr>
-        <w:t>S</w:t>
-      </w:r>
-      <w:r>
-        <w:rPr>
-          <w:i/>
-          <w:vertAlign w:val="subscript"/>
-        </w:rPr>
-        <w:t>i</w:t>
-      </w:r>
-      <w:r>
-        <w:t xml:space="preserve"> − max</w:t>
-      </w:r>
-      <w:r>
-        <w:rPr>
-          <w:i/>
-          <w:vertAlign w:val="subscript"/>
-        </w:rPr>
-        <w:t>j</w:t>
-      </w:r>
-      <w:r>
-        <w:t xml:space="preserve"> </w:t>
-      </w:r>
-      <w:r>
-        <w:rPr>
-          <w:i/>
-        </w:rPr>
-        <w:t>S</w:t>
-      </w:r>
-      <w:r>
-        <w:rPr>
-          <w:i/>
-          <w:vertAlign w:val="subscript"/>
-        </w:rPr>
-        <w:t>j</w:t>
-      </w:r>
-      <w:r>
-        <w:t xml:space="preserve">)/2) and σ shrinking with the rounds left; </w:t>
+        <w:t>F</w:t>
+      </w:r>
+      <w:r>
+        <w:t xml:space="preserve">, TAG's rules re-implemented on integer arrays and checked move by move against the forward model, whose speed is spent on </w:t>
       </w:r>
       <w:r>
         <w:rPr>
           <w:b/>
         </w:rPr>
-        <w:t>F:</w:t>
-      </w:r>
-      <w:r>
-        <w:t xml:space="preserve"> TAG's Sushi Go! rules re-implemented on integer arrays and checked move by move against the forward model, which runs 7–11 times more iterations, spent on </w:t>
-      </w:r>
-      <w:r>
-        <w:rPr>
-          <w:b/>
-        </w:rPr>
         <w:t>L</w:t>
       </w:r>
       <w:r>
-        <w:t xml:space="preserve"> = 8 rollouts per leaf; and </w:t>
+        <w:t xml:space="preserve"> = 8 rollouts per leaf, with </w:t>
       </w:r>
       <w:r>
         <w:rPr>
@@ -2564,7 +2701,7 @@
         <w:t>K</w:t>
       </w:r>
       <w:r>
-        <w:t xml:space="preserve"> = 1.</w:t>
+        <w:t xml:space="preserve"> = 1. At 500 ms this gives 36 806 iterations of 8 rollouts per decision against 10 170 single-rollout iterations without F and L.</w:t>
       </w:r>
     </w:p>
     <w:p>
@@ -2572,15 +2709,606 @@
         <w:pStyle w:val="Heading2"/>
       </w:pPr>
       <w:r>
-        <w:t>Experimental Protocol</w:t>
-      </w:r>
-    </w:p>
+        <w:t>Experimental Setup</w:t>
+      </w:r>
+    </w:p>
+    <w:p>
+      <w:pPr>
+        <w:pStyle w:val="tablehead"/>
+        <w:keepNext/>
+      </w:pPr>
+      <w:r>
+        <w:t>Experimental setup</w:t>
+      </w:r>
+    </w:p>
+    <w:tbl>
+      <w:tblPr>
+        <w:tblW w:type="dxa" w:w="4867"/>
+        <w:jc w:val="center"/>
+        <w:tblLayout w:type="fixed"/>
+        <w:tblLook w:firstColumn="1" w:firstRow="1" w:lastColumn="0" w:lastRow="0" w:noHBand="0" w:noVBand="1" w:val="04A0"/>
+        <w:tblBorders>
+          <w:top w:val="single" w:sz="8" w:space="0" w:color="000000"/>
+          <w:bottom w:val="single" w:sz="8" w:space="0" w:color="000000"/>
+        </w:tblBorders>
+        <w:tblLayout w:type="fixed"/>
+      </w:tblPr>
+      <w:tblGrid>
+        <w:gridCol w:w="1036"/>
+        <w:gridCol w:w="3830"/>
+      </w:tblGrid>
+      <w:tr>
+        <w:trPr>
+          <w:cantSplit/>
+        </w:trPr>
+        <w:tc>
+          <w:tcPr>
+            <w:tcW w:type="dxa" w:w="1037"/>
+            <w:tcMar>
+              <w:left w:w="50" w:type="dxa"/>
+              <w:right w:w="50" w:type="dxa"/>
+            </w:tcMar>
+            <w:tcBorders>
+              <w:bottom w:val="single" w:sz="6" w:space="0" w:color="000000"/>
+            </w:tcBorders>
+          </w:tcPr>
+          <w:p>
+            <w:pPr>
+              <w:pStyle w:val="tablecolhead"/>
+              <w:keepNext/>
+              <w:jc w:val="left"/>
+            </w:pPr>
+            <w:r>
+              <w:t>Item</w:t>
+            </w:r>
+          </w:p>
+        </w:tc>
+        <w:tc>
+          <w:tcPr>
+            <w:tcW w:type="dxa" w:w="3830"/>
+            <w:tcMar>
+              <w:left w:w="50" w:type="dxa"/>
+              <w:right w:w="50" w:type="dxa"/>
+            </w:tcMar>
+            <w:tcBorders>
+              <w:bottom w:val="single" w:sz="6" w:space="0" w:color="000000"/>
+            </w:tcBorders>
+          </w:tcPr>
+          <w:p>
+            <w:pPr>
+              <w:pStyle w:val="tablecolhead"/>
+              <w:keepNext/>
+              <w:jc w:val="left"/>
+            </w:pPr>
+            <w:r>
+              <w:t>Setting</w:t>
+            </w:r>
+          </w:p>
+        </w:tc>
+      </w:tr>
+      <w:tr>
+        <w:trPr>
+          <w:cantSplit/>
+        </w:trPr>
+        <w:tc>
+          <w:tcPr>
+            <w:tcW w:type="dxa" w:w="1037"/>
+            <w:tcMar>
+              <w:left w:w="50" w:type="dxa"/>
+              <w:right w:w="50" w:type="dxa"/>
+            </w:tcMar>
+          </w:tcPr>
+          <w:p>
+            <w:pPr>
+              <w:pStyle w:val="tablecopy"/>
+              <w:keepNext/>
+              <w:jc w:val="left"/>
+            </w:pPr>
+            <w:r>
+              <w:t>Framework</w:t>
+            </w:r>
+          </w:p>
+        </w:tc>
+        <w:tc>
+          <w:tcPr>
+            <w:tcW w:type="dxa" w:w="3830"/>
+            <w:tcMar>
+              <w:left w:w="50" w:type="dxa"/>
+              <w:right w:w="50" w:type="dxa"/>
+            </w:tcMar>
+          </w:tcPr>
+          <w:p>
+            <w:pPr>
+              <w:pStyle w:val="tablecopy"/>
+              <w:keepNext/>
+              <w:jc w:val="left"/>
+            </w:pPr>
+            <w:r>
+              <w:t>TAG as distributed with the module, Sushi Go! with its default rules; OpenJDK 21</w:t>
+            </w:r>
+          </w:p>
+        </w:tc>
+      </w:tr>
+      <w:tr>
+        <w:trPr>
+          <w:cantSplit/>
+        </w:trPr>
+        <w:tc>
+          <w:tcPr>
+            <w:tcW w:type="dxa" w:w="1037"/>
+            <w:tcMar>
+              <w:left w:w="50" w:type="dxa"/>
+              <w:right w:w="50" w:type="dxa"/>
+            </w:tcMar>
+          </w:tcPr>
+          <w:p>
+            <w:pPr>
+              <w:pStyle w:val="tablecopy"/>
+              <w:keepNext/>
+              <w:jc w:val="left"/>
+            </w:pPr>
+            <w:r>
+              <w:t>Opponents</w:t>
+            </w:r>
+          </w:p>
+        </w:tc>
+        <w:tc>
+          <w:tcPr>
+            <w:tcW w:type="dxa" w:w="3830"/>
+            <w:tcMar>
+              <w:left w:w="50" w:type="dxa"/>
+              <w:right w:w="50" w:type="dxa"/>
+            </w:tcMar>
+          </w:tcPr>
+          <w:p>
+            <w:pPr>
+              <w:pStyle w:val="tablecopy"/>
+              <w:keepNext/>
+              <w:jc w:val="left"/>
+            </w:pPr>
+            <w:r>
+              <w:t xml:space="preserve">v2 (frozen copy of our previous agent): H, progressive bias, B, D, </w:t>
+            </w:r>
+            <w:r>
+              <w:rPr>
+                <w:i/>
+              </w:rPr>
+              <w:t>K</w:t>
+            </w:r>
+            <w:r>
+              <w:t xml:space="preserve"> 1.41. TAG ISMCTS: TAG's SushiGo_3+P_HiBudget configuration (information sets, one tree per player [10], UCB-Tuned, </w:t>
+            </w:r>
+            <w:r>
+              <w:rPr>
+                <w:i/>
+              </w:rPr>
+              <w:t>K</w:t>
+            </w:r>
+            <w:r>
+              <w:t xml:space="preserve"> 1, random rollouts to the game end, score heuristic). TAG DUCT: TAG's SushiGoDUCT configuration (decoupled UCT, </w:t>
+            </w:r>
+            <w:r>
+              <w:rPr>
+                <w:i/>
+              </w:rPr>
+              <w:t>K</w:t>
+            </w:r>
+            <w:r>
+              <w:t xml:space="preserve"> 1, information sets, lead heuristic, 30-move rollouts). BasicMCTS (</w:t>
+            </w:r>
+            <w:r>
+              <w:rPr>
+                <w:i/>
+              </w:rPr>
+              <w:t>K</w:t>
+            </w:r>
+            <w:r>
+              <w:t xml:space="preserve"> 1.41, 10-move random rollouts), Rolling Horizon Evolutionary Algorithm (RHEA; horizon 10, population 10), One-Step Look-Ahead (OSLA, score heuristic)</w:t>
+            </w:r>
+          </w:p>
+        </w:tc>
+      </w:tr>
+      <w:tr>
+        <w:trPr>
+          <w:cantSplit/>
+        </w:trPr>
+        <w:tc>
+          <w:tcPr>
+            <w:tcW w:type="dxa" w:w="1037"/>
+            <w:tcMar>
+              <w:left w:w="50" w:type="dxa"/>
+              <w:right w:w="50" w:type="dxa"/>
+            </w:tcMar>
+          </w:tcPr>
+          <w:p>
+            <w:pPr>
+              <w:pStyle w:val="tablecopy"/>
+              <w:keepNext/>
+              <w:jc w:val="left"/>
+            </w:pPr>
+            <w:r>
+              <w:t>Budget</w:t>
+            </w:r>
+          </w:p>
+        </w:tc>
+        <w:tc>
+          <w:tcPr>
+            <w:tcW w:type="dxa" w:w="3830"/>
+            <w:tcMar>
+              <w:left w:w="50" w:type="dxa"/>
+              <w:right w:w="50" w:type="dxa"/>
+            </w:tcMar>
+          </w:tcPr>
+          <w:p>
+            <w:pPr>
+              <w:pStyle w:val="tablecopy"/>
+              <w:keepNext/>
+              <w:jc w:val="left"/>
+            </w:pPr>
+            <w:r>
+              <w:t>CPU time per decision, equal for all agents: 100 ms (most development), 500 and 900 ms</w:t>
+            </w:r>
+          </w:p>
+        </w:tc>
+      </w:tr>
+      <w:tr>
+        <w:trPr>
+          <w:cantSplit/>
+        </w:trPr>
+        <w:tc>
+          <w:tcPr>
+            <w:tcW w:type="dxa" w:w="1037"/>
+            <w:tcMar>
+              <w:left w:w="50" w:type="dxa"/>
+              <w:right w:w="50" w:type="dxa"/>
+            </w:tcMar>
+          </w:tcPr>
+          <w:p>
+            <w:pPr>
+              <w:pStyle w:val="tablecopy"/>
+              <w:keepNext/>
+              <w:jc w:val="left"/>
+            </w:pPr>
+            <w:r>
+              <w:t>Seating</w:t>
+            </w:r>
+          </w:p>
+        </w:tc>
+        <w:tc>
+          <w:tcPr>
+            <w:tcW w:type="dxa" w:w="3830"/>
+            <w:tcMar>
+              <w:left w:w="50" w:type="dxa"/>
+              <w:right w:w="50" w:type="dxa"/>
+            </w:tcMar>
+          </w:tcPr>
+          <w:p>
+            <w:pPr>
+              <w:pStyle w:val="tablecopy"/>
+              <w:keepNext/>
+              <w:jc w:val="left"/>
+            </w:pPr>
+            <w:r>
+              <w:t xml:space="preserve">our agent in seat </w:t>
+            </w:r>
+            <w:r>
+              <w:rPr>
+                <w:i/>
+              </w:rPr>
+              <w:t>g</w:t>
+            </w:r>
+            <w:r>
+              <w:t xml:space="preserve"> mod </w:t>
+            </w:r>
+            <w:r>
+              <w:rPr>
+                <w:i/>
+              </w:rPr>
+              <w:t>n</w:t>
+            </w:r>
+            <w:r>
+              <w:t xml:space="preserve"> in game </w:t>
+            </w:r>
+            <w:r>
+              <w:rPr>
+                <w:i/>
+              </w:rPr>
+              <w:t>g</w:t>
+            </w:r>
+            <w:r>
+              <w:t>; the other seats alternate between the two opponents (4 players: 2 + 1, swapped every 4 games)</w:t>
+            </w:r>
+          </w:p>
+        </w:tc>
+      </w:tr>
+      <w:tr>
+        <w:trPr>
+          <w:cantSplit/>
+        </w:trPr>
+        <w:tc>
+          <w:tcPr>
+            <w:tcW w:type="dxa" w:w="1037"/>
+            <w:tcMar>
+              <w:left w:w="50" w:type="dxa"/>
+              <w:right w:w="50" w:type="dxa"/>
+            </w:tcMar>
+          </w:tcPr>
+          <w:p>
+            <w:pPr>
+              <w:pStyle w:val="tablecopy"/>
+              <w:keepNext/>
+              <w:jc w:val="left"/>
+            </w:pPr>
+            <w:r>
+              <w:t>Deals</w:t>
+            </w:r>
+          </w:p>
+        </w:tc>
+        <w:tc>
+          <w:tcPr>
+            <w:tcW w:type="dxa" w:w="3830"/>
+            <w:tcMar>
+              <w:left w:w="50" w:type="dxa"/>
+              <w:right w:w="50" w:type="dxa"/>
+            </w:tcMar>
+          </w:tcPr>
+          <w:p>
+            <w:pPr>
+              <w:pStyle w:val="tablecopy"/>
+              <w:keepNext/>
+              <w:jc w:val="left"/>
+            </w:pPr>
+            <w:r>
+              <w:t xml:space="preserve">game </w:t>
+            </w:r>
+            <w:r>
+              <w:rPr>
+                <w:i/>
+              </w:rPr>
+              <w:t>g</w:t>
+            </w:r>
+            <w:r>
+              <w:t xml:space="preserve"> uses seed </w:t>
+            </w:r>
+            <w:r>
+              <w:rPr>
+                <w:i/>
+              </w:rPr>
+              <w:t>s</w:t>
+            </w:r>
+            <w:r>
+              <w:t xml:space="preserve"> + </w:t>
+            </w:r>
+            <w:r>
+              <w:rPr>
+                <w:i/>
+              </w:rPr>
+              <w:t>g</w:t>
+            </w:r>
+            <w:r>
+              <w:t xml:space="preserve">; since v4 a fixed deck order is shuffled with it, so equal </w:t>
+            </w:r>
+            <w:r>
+              <w:rPr>
+                <w:i/>
+              </w:rPr>
+              <w:t>s</w:t>
+            </w:r>
+            <w:r>
+              <w:t xml:space="preserve"> gives equal deals (paired runs); earlier runs used TAG's own deal, which differs between runs (independent samples)</w:t>
+            </w:r>
+          </w:p>
+        </w:tc>
+      </w:tr>
+      <w:tr>
+        <w:trPr>
+          <w:cantSplit/>
+        </w:trPr>
+        <w:tc>
+          <w:tcPr>
+            <w:tcW w:type="dxa" w:w="1037"/>
+            <w:tcMar>
+              <w:left w:w="50" w:type="dxa"/>
+              <w:right w:w="50" w:type="dxa"/>
+            </w:tcMar>
+          </w:tcPr>
+          <w:p>
+            <w:pPr>
+              <w:pStyle w:val="tablecopy"/>
+              <w:keepNext/>
+              <w:jc w:val="left"/>
+            </w:pPr>
+            <w:r>
+              <w:t>Seeds</w:t>
+            </w:r>
+          </w:p>
+        </w:tc>
+        <w:tc>
+          <w:tcPr>
+            <w:tcW w:type="dxa" w:w="3830"/>
+            <w:tcMar>
+              <w:left w:w="50" w:type="dxa"/>
+              <w:right w:w="50" w:type="dxa"/>
+            </w:tcMar>
+          </w:tcPr>
+          <w:p>
+            <w:pPr>
+              <w:pStyle w:val="tablecopy"/>
+              <w:keepNext/>
+              <w:jc w:val="left"/>
+            </w:pPr>
+            <w:r>
+              <w:t xml:space="preserve">development </w:t>
+            </w:r>
+            <w:r>
+              <w:rPr>
+                <w:i/>
+              </w:rPr>
+              <w:t>s</w:t>
+            </w:r>
+            <w:r>
+              <w:t xml:space="preserve"> = 1, 2 (v3 also 1001–3001); ablation and last study </w:t>
+            </w:r>
+            <w:r>
+              <w:rPr>
+                <w:i/>
+              </w:rPr>
+              <w:t>s</w:t>
+            </w:r>
+            <w:r>
+              <w:t xml:space="preserve"> = 7; held-out validation </w:t>
+            </w:r>
+            <w:r>
+              <w:rPr>
+                <w:i/>
+              </w:rPr>
+              <w:t>s</w:t>
+            </w:r>
+            <w:r>
+              <w:t xml:space="preserve"> = 100 000, disjoint from all other deals</w:t>
+            </w:r>
+          </w:p>
+        </w:tc>
+      </w:tr>
+      <w:tr>
+        <w:trPr>
+          <w:cantSplit/>
+        </w:trPr>
+        <w:tc>
+          <w:tcPr>
+            <w:tcW w:type="dxa" w:w="1037"/>
+            <w:tcMar>
+              <w:left w:w="50" w:type="dxa"/>
+              <w:right w:w="50" w:type="dxa"/>
+            </w:tcMar>
+          </w:tcPr>
+          <w:p>
+            <w:pPr>
+              <w:pStyle w:val="tablecopy"/>
+              <w:keepNext/>
+              <w:jc w:val="left"/>
+            </w:pPr>
+            <w:r>
+              <w:t>Games</w:t>
+            </w:r>
+          </w:p>
+        </w:tc>
+        <w:tc>
+          <w:tcPr>
+            <w:tcW w:type="dxa" w:w="3830"/>
+            <w:tcMar>
+              <w:left w:w="50" w:type="dxa"/>
+              <w:right w:w="50" w:type="dxa"/>
+            </w:tcMar>
+          </w:tcPr>
+          <w:p>
+            <w:pPr>
+              <w:pStyle w:val="tablecopy"/>
+              <w:keepNext/>
+              <w:jc w:val="left"/>
+            </w:pPr>
+            <w:r>
+              <w:t>500 per condition; 250 at 900 ms, in 4-player 500 ms development and in the 500/900 ms validation (48–73 s of CPU time per game); 300 in one run</w:t>
+            </w:r>
+          </w:p>
+        </w:tc>
+      </w:tr>
+      <w:tr>
+        <w:tc>
+          <w:tcPr>
+            <w:tcW w:type="dxa" w:w="1037"/>
+            <w:tcMar>
+              <w:left w:w="50" w:type="dxa"/>
+              <w:right w:w="50" w:type="dxa"/>
+            </w:tcMar>
+          </w:tcPr>
+          <w:p>
+            <w:pPr>
+              <w:pStyle w:val="tablecopy"/>
+              <w:jc w:val="left"/>
+            </w:pPr>
+            <w:r>
+              <w:t>Hardware</w:t>
+            </w:r>
+          </w:p>
+        </w:tc>
+        <w:tc>
+          <w:tcPr>
+            <w:tcW w:type="dxa" w:w="3830"/>
+            <w:tcMar>
+              <w:left w:w="50" w:type="dxa"/>
+              <w:right w:w="50" w:type="dxa"/>
+            </w:tcMar>
+          </w:tcPr>
+          <w:p>
+            <w:pPr>
+              <w:pStyle w:val="tablecopy"/>
+              <w:jc w:val="left"/>
+            </w:pPr>
+            <w:r>
+              <w:t>18-core laptop (6–16 games in parallel); last study and validation on a 4-core machine (4 in parallel)</w:t>
+            </w:r>
+          </w:p>
+        </w:tc>
+      </w:tr>
+    </w:tbl>
     <w:p>
       <w:pPr>
         <w:pStyle w:val="BodyText"/>
       </w:pPr>
       <w:r>
-        <w:t xml:space="preserve">The opponents are our previous agent v2 (H with progressive bias, B and D; </w:t>
+        <w:t>Each game is an independent trial whose outcome for our agent is 1 for a win, 1/</w:t>
+      </w:r>
+      <w:r>
+        <w:rPr>
+          <w:i/>
+        </w:rPr>
+        <w:t>k</w:t>
+      </w:r>
+      <w:r>
+        <w:t xml:space="preserve"> for a </w:t>
+      </w:r>
+      <w:r>
+        <w:rPr>
+          <w:i/>
+        </w:rPr>
+        <w:t>k</w:t>
+      </w:r>
+      <w:r>
+        <w:t xml:space="preserve">-way shared first place and 0 otherwise. Win rates are reported with Wilson 95% intervals [14]; the score margin (our score minus the best opponent's) as mean ± 1.96 standard errors (SE); differences between runs as the mean of the per-game differences on the same deals ± 1.96 SE (for independent samples, the difference of the means with the two-sample SE) and </w:t>
+      </w:r>
+      <w:r>
+        <w:rPr>
+          <w:i/>
+        </w:rPr>
+        <w:t>z</w:t>
+      </w:r>
+      <w:r>
+        <w:t xml:space="preserve"> = difference/SE, in percentage points (pp) for win rates. With 500 games a win rate near 50% has a 95% interval of ±4.4 pp, and a difference between two runs about ±5.7 pp even when paired, because the outcomes of two agents on the same deal correlate only weakly (0.0–0.15); the score margin is about twice as sensitive and served to screen ideas. We report unadjusted intervals and state where a conclusion survives a Holm correction. We expected (H1) every component to improve both measures, (H2) the decoupled information-set tree to matter more at longer budgets and (H3) the best settings to depend on the number of players.</w:t>
+      </w:r>
+    </w:p>
+    <w:p>
+      <w:pPr>
+        <w:pStyle w:val="Heading1"/>
+      </w:pPr>
+      <w:r>
+        <w:t>Results</w:t>
+      </w:r>
+    </w:p>
+    <w:p>
+      <w:pPr>
+        <w:pStyle w:val="Heading2"/>
+      </w:pPr>
+      <w:r>
+        <w:t>Development from v2 to v4 (RQ1, RQ2)</w:t>
+      </w:r>
+    </w:p>
+    <w:p>
+      <w:pPr>
+        <w:pStyle w:val="BodyText"/>
+      </w:pPr>
+      <w:r>
+        <w:t xml:space="preserve">Fig. 2 traces the development with three players (independent samples). Removing progressive bias from v2 and adding P, R, M and </w:t>
       </w:r>
       <w:r>
         <w:rPr>
@@ -2589,16 +3317,25 @@
         <w:t>K</w:t>
       </w:r>
       <w:r>
-        <w:t xml:space="preserve"> = 1.41) and TAG's tuned ISMCTS (</w:t>
-      </w:r>
-      <w:r>
-        <w:rPr>
-          <w:i/>
-        </w:rPr>
-        <w:t>players.mcts</w:t>
-      </w:r>
-      <w:r>
-        <w:t xml:space="preserve"> with information sets, one tree per player, UCB-Tuned, </w:t>
+        <w:t xml:space="preserve"> = 0.5 doubled the win rate at 100 ms (24.8% → 50.1%, +25.3 ± 5.8 pp). In a 2</w:t>
+      </w:r>
+      <w:r>
+        <w:rPr>
+          <w:vertAlign w:val="superscript"/>
+        </w:rPr>
+        <w:t>4</w:t>
+      </w:r>
+      <w:r>
+        <w:t xml:space="preserve"> factorial design on top of H + B + D + P (16 cells × 500 games) the main effects were +8.7 ± 2.1 pp for R (</w:t>
+      </w:r>
+      <w:r>
+        <w:rPr>
+          <w:i/>
+        </w:rPr>
+        <w:t>z</w:t>
+      </w:r>
+      <w:r>
+        <w:t xml:space="preserve"> = 8.1), +5.2 ± 2.2 for </w:t>
       </w:r>
       <w:r>
         <w:rPr>
@@ -2607,7 +3344,16 @@
         <w:t>K</w:t>
       </w:r>
       <w:r>
-        <w:t xml:space="preserve"> = 1, MAST and random rollouts), used only as an opponent; further runs use BasicMCTS (</w:t>
+        <w:t xml:space="preserve"> = 0.5 instead of 1.41, +4.1 ± 2.0 for M and +3.6 ± 2.0 for a completion horizon </w:t>
+      </w:r>
+      <w:r>
+        <w:rPr>
+          <w:i/>
+        </w:rPr>
+        <w:t>T</w:t>
+      </w:r>
+      <w:r>
+        <w:t xml:space="preserve"> = 8; max-n backups needed less exploration (M × </w:t>
       </w:r>
       <w:r>
         <w:rPr>
@@ -2616,147 +3362,7 @@
         <w:t>K</w:t>
       </w:r>
       <w:r>
-        <w:t xml:space="preserve"> = 1.41, 10-move random rollouts), RHEA (horizon 10, population 10) and OSLA with TAG's score heuristic. All agents get the same CPU-time budget per decision: 100 ms for development and 500 and 900 ms for validation (the competition allows 1 s). In game </w:t>
-      </w:r>
-      <w:r>
-        <w:rPr>
-          <w:i/>
-        </w:rPr>
-        <w:t>g</w:t>
-      </w:r>
-      <w:r>
-        <w:t xml:space="preserve"> of a run our agent sits in seat </w:t>
-      </w:r>
-      <w:r>
-        <w:rPr>
-          <w:i/>
-        </w:rPr>
-        <w:t>g</w:t>
-      </w:r>
-      <w:r>
-        <w:t xml:space="preserve"> mod </w:t>
-      </w:r>
-      <w:r>
-        <w:rPr>
-          <w:i/>
-        </w:rPr>
-        <w:t>n</w:t>
-      </w:r>
-      <w:r>
-        <w:t xml:space="preserve">, the other seats alternate between the opponents, and the game uses seed </w:t>
-      </w:r>
-      <w:r>
-        <w:rPr>
-          <w:i/>
-        </w:rPr>
-        <w:t>s</w:t>
-      </w:r>
-      <w:r>
-        <w:t xml:space="preserve"> + </w:t>
-      </w:r>
-      <w:r>
-        <w:rPr>
-          <w:i/>
-        </w:rPr>
-        <w:t>g</w:t>
-      </w:r>
-      <w:r>
-        <w:t>. Since the v4 study the cards are dealt from a fixed deck order shuffled with this seed, so runs with the same seed play identical deals and seats and are compared game by game; earlier runs (all v3 results and Fig. 2) used TAG's own deal, which differs between runs, and are compared as independent samples. Development used seeds 1 and 2 (and 1001–3001 in v3); the final agent was validated on seed 7, which no decision used. Each condition has 500 games, except 250 at 900 ms and in some 4-player 500 ms runs, where one game costs 48–73 s of CPU time (about 100 runs on an 18-core laptop, 8 games in parallel).</w:t>
-      </w:r>
-    </w:p>
-    <w:p>
-      <w:pPr>
-        <w:pStyle w:val="BodyText"/>
-      </w:pPr>
-      <w:r>
-        <w:t>Each game is an independent trial whose outcome for our agent is 1 for a win, 1/</w:t>
-      </w:r>
-      <w:r>
-        <w:rPr>
-          <w:i/>
-        </w:rPr>
-        <w:t>k</w:t>
-      </w:r>
-      <w:r>
-        <w:t xml:space="preserve"> for a </w:t>
-      </w:r>
-      <w:r>
-        <w:rPr>
-          <w:i/>
-        </w:rPr>
-        <w:t>k</w:t>
-      </w:r>
-      <w:r>
-        <w:t xml:space="preserve">-way shared first place and 0 otherwise. Win rates are reported with Wilson 95% intervals [15], the score margin (our score minus the best opponent's) as mean ± 1.96 standard errors (SE), and differences between runs on the same deals as the mean of the per-game differences ± 1.96 SE, with </w:t>
-      </w:r>
-      <w:r>
-        <w:rPr>
-          <w:i/>
-        </w:rPr>
-        <w:t>z</w:t>
-      </w:r>
-      <w:r>
-        <w:t xml:space="preserve"> = mean/SE. With 500 games a win rate near 50% is known to ±4.4 points; as the outcomes of two agents on the same deal correlate by only 0.1–0.2, a paired difference has a confidence interval of about ±5.7 points. The score margin is about twice as sensitive and served for screening. We expected (H1) every component to improve both measures, (H2) the game-matched tree to matter more at longer budgets and (H3) the best settings to depend on the number of players.</w:t>
-      </w:r>
-    </w:p>
-    <w:p>
-      <w:pPr>
-        <w:pStyle w:val="Heading1"/>
-      </w:pPr>
-      <w:r>
-        <w:t>Results</w:t>
-      </w:r>
-    </w:p>
-    <w:p>
-      <w:pPr>
-        <w:pStyle w:val="Heading2"/>
-      </w:pPr>
-      <w:r>
-        <w:t>From v2 to v4</w:t>
-      </w:r>
-    </w:p>
-    <w:p>
-      <w:pPr>
-        <w:pStyle w:val="BodyText"/>
-      </w:pPr>
-      <w:r>
-        <w:t xml:space="preserve">Fig. 2 traces the development with three players. Removing progressive bias from v2 and adding P, R, M and </w:t>
-      </w:r>
-      <w:r>
-        <w:rPr>
-          <w:i/>
-        </w:rPr>
-        <w:t>K</w:t>
-      </w:r>
-      <w:r>
-        <w:t xml:space="preserve"> = 0.5 doubled the win rate at 100 ms (24.8% → 50.1%). In a 2</w:t>
-      </w:r>
-      <w:r>
-        <w:rPr>
-          <w:vertAlign w:val="superscript"/>
-        </w:rPr>
-        <w:t>4</w:t>
-      </w:r>
-      <w:r>
-        <w:t xml:space="preserve"> factorial design on top of H + B + D + P (16 cells × 500 games at 100 ms) the main effects were +8.7 ± 2.1 points for R (</w:t>
-      </w:r>
-      <w:r>
-        <w:rPr>
-          <w:i/>
-        </w:rPr>
-        <w:t>z</w:t>
-      </w:r>
-      <w:r>
-        <w:t xml:space="preserve"> = 8.1), +5.2 ± 2.2 for </w:t>
-      </w:r>
-      <w:r>
-        <w:rPr>
-          <w:i/>
-        </w:rPr>
-        <w:t>K</w:t>
-      </w:r>
-      <w:r>
-        <w:t xml:space="preserve"> = 0.5 instead of 1.41, +4.1 ± 2.0 for M and +3.6 ± 2.0 for a completion horizon </w:t>
+        <w:t xml:space="preserve"> +3.2 ± 2.2), and </w:t>
       </w:r>
       <w:r>
         <w:rPr>
@@ -2765,16 +3371,16 @@
         <w:t>T</w:t>
       </w:r>
       <w:r>
-        <w:t xml:space="preserve"> = 8, with a positive M × </w:t>
-      </w:r>
-      <w:r>
-        <w:rPr>
-          <w:i/>
-        </w:rPr>
-        <w:t>K</w:t>
-      </w:r>
-      <w:r>
-        <w:t xml:space="preserve"> interaction (+3.2 ± 2.2): max-n backups need less exploration. Progressive bias did not help once B was present (−1.2 ± 4.3 points over 2 × 500 games), and letting the opponents in the tree follow the greedy card-value policy cost 16.9 ± 5.8 points.</w:t>
+        <w:t xml:space="preserve"> = 8 was dropped because it overlaps with R (R × </w:t>
+      </w:r>
+      <w:r>
+        <w:rPr>
+          <w:i/>
+        </w:rPr>
+        <w:t>T</w:t>
+      </w:r>
+      <w:r>
+        <w:t xml:space="preserve"> −4.2 ± 2.1). Progressive bias no longer helped once informed rollouts were present (−1.2 ± 4.3 pp), and making the opponents in the tree follow the greedy card-value policy cost 16.9 ± 5.8 pp.</w:t>
       </w:r>
     </w:p>
     <w:p>
@@ -2786,7 +3392,7 @@
       <w:r>
         <w:drawing>
           <wp:inline xmlns:a="http://schemas.openxmlformats.org/drawingml/2006/main" xmlns:pic="http://schemas.openxmlformats.org/drawingml/2006/picture">
-            <wp:extent cx="3099816" cy="1737360"/>
+            <wp:extent cx="3099816" cy="1691640"/>
             <wp:docPr id="2" name="Picture 2"/>
             <wp:cNvGraphicFramePr>
               <a:graphicFrameLocks noChangeAspect="1"/>
@@ -2807,7 +3413,7 @@
                   <pic:spPr>
                     <a:xfrm>
                       <a:off x="0" y="0"/>
-                      <a:ext cx="3099816" cy="1737360"/>
+                      <a:ext cx="3099816" cy="1691640"/>
                     </a:xfrm>
                     <a:prstGeom prst="rect"/>
                   </pic:spPr>
@@ -2823,7 +3429,7 @@
         <w:pStyle w:val="figurecaption"/>
       </w:pPr>
       <w:r>
-        <w:t>Win rate with three players against v2 and TAG's ISMCTS by time budget (development runs, seed 1, independent deals). v2 = H + A + B + D, v3 = H + B + D + P + R + M, v4 = v3 + S + I − D. Bars: Wilson 95% intervals.</w:t>
+        <w:t>Win rate with three players against v2 and TAG's ISMCTS by CPU time per decision. Lines: development runs (seed 1, independent samples; v2 = H + A + B + D, v3 = H + B + D + P + R + M, v4 = v3 + S + I − D). Open circles: the final agent on held-out deals. Bars: Wilson 95% intervals.</w:t>
       </w:r>
     </w:p>
     <w:p>
@@ -2831,7 +3437,16 @@
         <w:pStyle w:val="BodyText"/>
       </w:pPr>
       <w:r>
-        <w:t>v3, however, got worse as the budget grew (50.1% → 40.7% → 32.8% at 100, 500 and 900 ms), whereas v4 kept its strength (55.7%, 49.7%, 47.6%), so the gain from S and I grows with the budget (+5.6, +9.0 and +14.8 points), as H2 predicts. Our explanation is that v3's sequential tree let later players react to the cards earlier players had chosen in the same turn; the more iterations, the more its decisions relied on this wrong model, which decoupled UCT removes.</w:t>
+        <w:t xml:space="preserve">With longer budgets v3 lost 17.3 ± 7.3 pp from 100 to 900 ms but v4 only 8.1 ± 7.6 pp, so the gain from S and I rose from +5.6 ± 6.2 to +14.8 ± 8.5 pp; the rise (+9.2 ± 10.5 pp, </w:t>
+      </w:r>
+      <w:r>
+        <w:rPr>
+          <w:i/>
+        </w:rPr>
+        <w:t>z</w:t>
+      </w:r>
+      <w:r>
+        <w:t xml:space="preserve"> = 1.7) agrees with H2 but is not significant. S alone added +1.3 pp to v3 at 100 ms and +6.2 pp at 500 ms, so the decoupled tree carries most of the budget dependence. We attribute this to v3's sequential tree, in which later players react to cards chosen earlier in the same turn: a wrong model that more iterations exploit more. It is not a lack of search: at 900 ms v3 ran 19 696 iterations per decision, v4 21 246. Part of every agent's decline comes from the opponents: the TAG ISMCTS seats won 27.7% of v4's validation games at 100 ms but 35.1% at 500 ms.</w:t>
       </w:r>
     </w:p>
     <w:p>
@@ -2839,7 +3454,7 @@
         <w:pStyle w:val="Heading2"/>
       </w:pPr>
       <w:r>
-        <w:t>Final Agent</w:t>
+        <w:t>Final Agent on Held-Out Deals (RQ1)</w:t>
       </w:r>
     </w:p>
     <w:p>
@@ -2848,12 +3463,12 @@
         <w:keepNext/>
       </w:pPr>
       <w:r>
-        <w:t>Final agent on unseen deals (seed 7)</w:t>
+        <w:t>Final agent on held-out deals</w:t>
       </w:r>
     </w:p>
     <w:tbl>
       <w:tblPr>
-        <w:tblW w:type="dxa" w:w="4924"/>
+        <w:tblW w:type="dxa" w:w="4881"/>
         <w:jc w:val="center"/>
         <w:tblLayout w:type="fixed"/>
         <w:tblLook w:firstColumn="1" w:firstRow="1" w:lastColumn="0" w:lastRow="0" w:noHBand="0" w:noVBand="1" w:val="04A0"/>
@@ -2864,11 +3479,11 @@
         <w:tblLayout w:type="fixed"/>
       </w:tblPr>
       <w:tblGrid>
-        <w:gridCol w:w="835"/>
+        <w:gridCol w:w="604"/>
         <w:gridCol w:w="1526"/>
         <w:gridCol w:w="403"/>
-        <w:gridCol w:w="1296"/>
-        <w:gridCol w:w="864"/>
+        <w:gridCol w:w="1353"/>
+        <w:gridCol w:w="993"/>
       </w:tblGrid>
       <w:tr>
         <w:trPr>
@@ -2876,7 +3491,7 @@
         </w:trPr>
         <w:tc>
           <w:tcPr>
-            <w:tcW w:type="dxa" w:w="835"/>
+            <w:tcW w:type="dxa" w:w="605"/>
             <w:tcMar>
               <w:left w:w="50" w:type="dxa"/>
               <w:right w:w="50" w:type="dxa"/>
@@ -2945,7 +3560,7 @@
         </w:tc>
         <w:tc>
           <w:tcPr>
-            <w:tcW w:type="dxa" w:w="1296"/>
+            <w:tcW w:type="dxa" w:w="1354"/>
             <w:tcMar>
               <w:left w:w="50" w:type="dxa"/>
               <w:right w:w="50" w:type="dxa"/>
@@ -2967,7 +3582,7 @@
         </w:tc>
         <w:tc>
           <w:tcPr>
-            <w:tcW w:type="dxa" w:w="864"/>
+            <w:tcW w:type="dxa" w:w="994"/>
             <w:tcMar>
               <w:left w:w="50" w:type="dxa"/>
               <w:right w:w="50" w:type="dxa"/>
@@ -2994,7 +3609,7 @@
         </w:trPr>
         <w:tc>
           <w:tcPr>
-            <w:tcW w:type="dxa" w:w="835"/>
+            <w:tcW w:type="dxa" w:w="605"/>
             <w:tcMar>
               <w:left w:w="50" w:type="dxa"/>
               <w:right w:w="50" w:type="dxa"/>
@@ -3007,7 +3622,7 @@
               <w:jc w:val="left"/>
             </w:pPr>
             <w:r>
-              <w:t>3 p, 100 ms</w:t>
+              <w:t>3p/100</w:t>
             </w:r>
           </w:p>
         </w:tc>
@@ -3051,7 +3666,7 @@
         </w:tc>
         <w:tc>
           <w:tcPr>
-            <w:tcW w:type="dxa" w:w="1296"/>
+            <w:tcW w:type="dxa" w:w="1354"/>
             <w:tcMar>
               <w:left w:w="50" w:type="dxa"/>
               <w:right w:w="50" w:type="dxa"/>
@@ -3064,13 +3679,13 @@
               <w:jc w:val="center"/>
             </w:pPr>
             <w:r>
-              <w:t>55.0 [50.6, 59.3]</w:t>
-            </w:r>
-          </w:p>
-        </w:tc>
-        <w:tc>
-          <w:tcPr>
-            <w:tcW w:type="dxa" w:w="864"/>
+              <w:t>52.6 [48.2, 56.9]</w:t>
+            </w:r>
+          </w:p>
+        </w:tc>
+        <w:tc>
+          <w:tcPr>
+            <w:tcW w:type="dxa" w:w="994"/>
             <w:tcMar>
               <w:left w:w="50" w:type="dxa"/>
               <w:right w:w="50" w:type="dxa"/>
@@ -3083,7 +3698,7 @@
               <w:jc w:val="center"/>
             </w:pPr>
             <w:r>
-              <w:t>+1.00 ± 0.44</w:t>
+              <w:t>+0.73 ± 0.46</w:t>
             </w:r>
           </w:p>
         </w:tc>
@@ -3094,7 +3709,7 @@
         </w:trPr>
         <w:tc>
           <w:tcPr>
-            <w:tcW w:type="dxa" w:w="835"/>
+            <w:tcW w:type="dxa" w:w="605"/>
             <w:tcMar>
               <w:left w:w="50" w:type="dxa"/>
               <w:right w:w="50" w:type="dxa"/>
@@ -3107,7 +3722,7 @@
               <w:jc w:val="left"/>
             </w:pPr>
             <w:r>
-              <w:t>3 p, 500 ms</w:t>
+              <w:t>3p/500</w:t>
             </w:r>
           </w:p>
         </w:tc>
@@ -3145,13 +3760,13 @@
               <w:jc w:val="center"/>
             </w:pPr>
             <w:r>
-              <w:t>500</w:t>
-            </w:r>
-          </w:p>
-        </w:tc>
-        <w:tc>
-          <w:tcPr>
-            <w:tcW w:type="dxa" w:w="1296"/>
+              <w:t>250</w:t>
+            </w:r>
+          </w:p>
+        </w:tc>
+        <w:tc>
+          <w:tcPr>
+            <w:tcW w:type="dxa" w:w="1354"/>
             <w:tcMar>
               <w:left w:w="50" w:type="dxa"/>
               <w:right w:w="50" w:type="dxa"/>
@@ -3164,13 +3779,13 @@
               <w:jc w:val="center"/>
             </w:pPr>
             <w:r>
-              <w:t>49.4 [45.0, 53.8]</w:t>
-            </w:r>
-          </w:p>
-        </w:tc>
-        <w:tc>
-          <w:tcPr>
-            <w:tcW w:type="dxa" w:w="864"/>
+              <w:t>pending</w:t>
+            </w:r>
+          </w:p>
+        </w:tc>
+        <w:tc>
+          <w:tcPr>
+            <w:tcW w:type="dxa" w:w="994"/>
             <w:tcMar>
               <w:left w:w="50" w:type="dxa"/>
               <w:right w:w="50" w:type="dxa"/>
@@ -3183,7 +3798,7 @@
               <w:jc w:val="center"/>
             </w:pPr>
             <w:r>
-              <w:t>+0.40 ± 0.39</w:t>
+              <w:t>pending</w:t>
             </w:r>
           </w:p>
         </w:tc>
@@ -3194,7 +3809,7 @@
         </w:trPr>
         <w:tc>
           <w:tcPr>
-            <w:tcW w:type="dxa" w:w="835"/>
+            <w:tcW w:type="dxa" w:w="605"/>
             <w:tcMar>
               <w:left w:w="50" w:type="dxa"/>
               <w:right w:w="50" w:type="dxa"/>
@@ -3207,7 +3822,7 @@
               <w:jc w:val="left"/>
             </w:pPr>
             <w:r>
-              <w:t>3 p, 900 ms</w:t>
+              <w:t>3p/900</w:t>
             </w:r>
           </w:p>
         </w:tc>
@@ -3251,7 +3866,7 @@
         </w:tc>
         <w:tc>
           <w:tcPr>
-            <w:tcW w:type="dxa" w:w="1296"/>
+            <w:tcW w:type="dxa" w:w="1354"/>
             <w:tcMar>
               <w:left w:w="50" w:type="dxa"/>
               <w:right w:w="50" w:type="dxa"/>
@@ -3264,13 +3879,13 @@
               <w:jc w:val="center"/>
             </w:pPr>
             <w:r>
-              <w:t>56.0 [49.8, 62.0]</w:t>
-            </w:r>
-          </w:p>
-        </w:tc>
-        <w:tc>
-          <w:tcPr>
-            <w:tcW w:type="dxa" w:w="864"/>
+              <w:t>pending</w:t>
+            </w:r>
+          </w:p>
+        </w:tc>
+        <w:tc>
+          <w:tcPr>
+            <w:tcW w:type="dxa" w:w="994"/>
             <w:tcMar>
               <w:left w:w="50" w:type="dxa"/>
               <w:right w:w="50" w:type="dxa"/>
@@ -3283,7 +3898,7 @@
               <w:jc w:val="center"/>
             </w:pPr>
             <w:r>
-              <w:t>+1.06 ± 0.62</w:t>
+              <w:t>pending</w:t>
             </w:r>
           </w:p>
         </w:tc>
@@ -3294,7 +3909,7 @@
         </w:trPr>
         <w:tc>
           <w:tcPr>
-            <w:tcW w:type="dxa" w:w="835"/>
+            <w:tcW w:type="dxa" w:w="605"/>
             <w:tcMar>
               <w:left w:w="50" w:type="dxa"/>
               <w:right w:w="50" w:type="dxa"/>
@@ -3307,7 +3922,7 @@
               <w:jc w:val="left"/>
             </w:pPr>
             <w:r>
-              <w:t>4 p, 100 ms</w:t>
+              <w:t>4p/100</w:t>
             </w:r>
           </w:p>
         </w:tc>
@@ -3351,7 +3966,7 @@
         </w:tc>
         <w:tc>
           <w:tcPr>
-            <w:tcW w:type="dxa" w:w="1296"/>
+            <w:tcW w:type="dxa" w:w="1354"/>
             <w:tcMar>
               <w:left w:w="50" w:type="dxa"/>
               <w:right w:w="50" w:type="dxa"/>
@@ -3364,13 +3979,13 @@
               <w:jc w:val="center"/>
             </w:pPr>
             <w:r>
-              <w:t>46.8 [42.5, 51.2]</w:t>
-            </w:r>
-          </w:p>
-        </w:tc>
-        <w:tc>
-          <w:tcPr>
-            <w:tcW w:type="dxa" w:w="864"/>
+              <w:t>pending</w:t>
+            </w:r>
+          </w:p>
+        </w:tc>
+        <w:tc>
+          <w:tcPr>
+            <w:tcW w:type="dxa" w:w="994"/>
             <w:tcMar>
               <w:left w:w="50" w:type="dxa"/>
               <w:right w:w="50" w:type="dxa"/>
@@ -3383,7 +3998,7 @@
               <w:jc w:val="center"/>
             </w:pPr>
             <w:r>
-              <w:t>−0.28 ± 0.46</w:t>
+              <w:t>pending</w:t>
             </w:r>
           </w:p>
         </w:tc>
@@ -3394,7 +4009,7 @@
         </w:trPr>
         <w:tc>
           <w:tcPr>
-            <w:tcW w:type="dxa" w:w="835"/>
+            <w:tcW w:type="dxa" w:w="605"/>
             <w:tcMar>
               <w:left w:w="50" w:type="dxa"/>
               <w:right w:w="50" w:type="dxa"/>
@@ -3407,7 +4022,7 @@
               <w:jc w:val="left"/>
             </w:pPr>
             <w:r>
-              <w:t>4 p, 500 ms</w:t>
+              <w:t>4p/500</w:t>
             </w:r>
           </w:p>
         </w:tc>
@@ -3445,13 +4060,13 @@
               <w:jc w:val="center"/>
             </w:pPr>
             <w:r>
-              <w:t>500</w:t>
-            </w:r>
-          </w:p>
-        </w:tc>
-        <w:tc>
-          <w:tcPr>
-            <w:tcW w:type="dxa" w:w="1296"/>
+              <w:t>250</w:t>
+            </w:r>
+          </w:p>
+        </w:tc>
+        <w:tc>
+          <w:tcPr>
+            <w:tcW w:type="dxa" w:w="1354"/>
             <w:tcMar>
               <w:left w:w="50" w:type="dxa"/>
               <w:right w:w="50" w:type="dxa"/>
@@ -3464,13 +4079,13 @@
               <w:jc w:val="center"/>
             </w:pPr>
             <w:r>
-              <w:t>41.4 [37.2, 45.8]</w:t>
-            </w:r>
-          </w:p>
-        </w:tc>
-        <w:tc>
-          <w:tcPr>
-            <w:tcW w:type="dxa" w:w="864"/>
+              <w:t>pending</w:t>
+            </w:r>
+          </w:p>
+        </w:tc>
+        <w:tc>
+          <w:tcPr>
+            <w:tcW w:type="dxa" w:w="994"/>
             <w:tcMar>
               <w:left w:w="50" w:type="dxa"/>
               <w:right w:w="50" w:type="dxa"/>
@@ -3483,7 +4098,7 @@
               <w:jc w:val="center"/>
             </w:pPr>
             <w:r>
-              <w:t>−1.53 ± 0.46</w:t>
+              <w:t>pending</w:t>
             </w:r>
           </w:p>
         </w:tc>
@@ -3494,7 +4109,7 @@
         </w:trPr>
         <w:tc>
           <w:tcPr>
-            <w:tcW w:type="dxa" w:w="835"/>
+            <w:tcW w:type="dxa" w:w="605"/>
             <w:tcMar>
               <w:left w:w="50" w:type="dxa"/>
               <w:right w:w="50" w:type="dxa"/>
@@ -3507,7 +4122,7 @@
               <w:jc w:val="left"/>
             </w:pPr>
             <w:r>
-              <w:t>3 p, 100 ms</w:t>
+              <w:t>3p/100</w:t>
             </w:r>
           </w:p>
         </w:tc>
@@ -3526,13 +4141,7 @@
               <w:jc w:val="left"/>
             </w:pPr>
             <w:r>
-              <w:t xml:space="preserve">ISMCTS × 2 </w:t>
-            </w:r>
-            <w:r>
-              <w:rPr>
-                <w:vertAlign w:val="superscript"/>
-              </w:rPr>
-              <w:t>a</w:t>
+              <w:t>DUCT, ISMCTS</w:t>
             </w:r>
           </w:p>
         </w:tc>
@@ -3551,13 +4160,13 @@
               <w:jc w:val="center"/>
             </w:pPr>
             <w:r>
-              <w:t>300</w:t>
-            </w:r>
-          </w:p>
-        </w:tc>
-        <w:tc>
-          <w:tcPr>
-            <w:tcW w:type="dxa" w:w="1296"/>
+              <w:t>500</w:t>
+            </w:r>
+          </w:p>
+        </w:tc>
+        <w:tc>
+          <w:tcPr>
+            <w:tcW w:type="dxa" w:w="1354"/>
             <w:tcMar>
               <w:left w:w="50" w:type="dxa"/>
               <w:right w:w="50" w:type="dxa"/>
@@ -3570,13 +4179,13 @@
               <w:jc w:val="center"/>
             </w:pPr>
             <w:r>
-              <w:t>54.2 [48.5, 59.7]</w:t>
-            </w:r>
-          </w:p>
-        </w:tc>
-        <w:tc>
-          <w:tcPr>
-            <w:tcW w:type="dxa" w:w="864"/>
+              <w:t>pending</w:t>
+            </w:r>
+          </w:p>
+        </w:tc>
+        <w:tc>
+          <w:tcPr>
+            <w:tcW w:type="dxa" w:w="994"/>
             <w:tcMar>
               <w:left w:w="50" w:type="dxa"/>
               <w:right w:w="50" w:type="dxa"/>
@@ -3589,7 +4198,7 @@
               <w:jc w:val="center"/>
             </w:pPr>
             <w:r>
-              <w:t>+1.66 ± 0.69</w:t>
+              <w:t>pending</w:t>
             </w:r>
           </w:p>
         </w:tc>
@@ -3600,7 +4209,7 @@
         </w:trPr>
         <w:tc>
           <w:tcPr>
-            <w:tcW w:type="dxa" w:w="835"/>
+            <w:tcW w:type="dxa" w:w="605"/>
             <w:tcMar>
               <w:left w:w="50" w:type="dxa"/>
               <w:right w:w="50" w:type="dxa"/>
@@ -3613,7 +4222,7 @@
               <w:jc w:val="left"/>
             </w:pPr>
             <w:r>
-              <w:t>3 p, 100 ms</w:t>
+              <w:t>3p/100</w:t>
             </w:r>
           </w:p>
         </w:tc>
@@ -3632,7 +4241,13 @@
               <w:jc w:val="left"/>
             </w:pPr>
             <w:r>
-              <w:t>BasicMCTS, RHEA</w:t>
+              <w:t xml:space="preserve">ISMCTS × 2 </w:t>
+            </w:r>
+            <w:r>
+              <w:rPr>
+                <w:vertAlign w:val="superscript"/>
+              </w:rPr>
+              <w:t>a</w:t>
             </w:r>
           </w:p>
         </w:tc>
@@ -3651,13 +4266,13 @@
               <w:jc w:val="center"/>
             </w:pPr>
             <w:r>
-              <w:t>500</w:t>
-            </w:r>
-          </w:p>
-        </w:tc>
-        <w:tc>
-          <w:tcPr>
-            <w:tcW w:type="dxa" w:w="1296"/>
+              <w:t>300</w:t>
+            </w:r>
+          </w:p>
+        </w:tc>
+        <w:tc>
+          <w:tcPr>
+            <w:tcW w:type="dxa" w:w="1354"/>
             <w:tcMar>
               <w:left w:w="50" w:type="dxa"/>
               <w:right w:w="50" w:type="dxa"/>
@@ -3670,13 +4285,13 @@
               <w:jc w:val="center"/>
             </w:pPr>
             <w:r>
-              <w:t>84.2 [80.7, 87.1]</w:t>
-            </w:r>
-          </w:p>
-        </w:tc>
-        <w:tc>
-          <w:tcPr>
-            <w:tcW w:type="dxa" w:w="864"/>
+              <w:t>54.2 [48.5, 59.7]</w:t>
+            </w:r>
+          </w:p>
+        </w:tc>
+        <w:tc>
+          <w:tcPr>
+            <w:tcW w:type="dxa" w:w="994"/>
             <w:tcMar>
               <w:left w:w="50" w:type="dxa"/>
               <w:right w:w="50" w:type="dxa"/>
@@ -3689,15 +4304,18 @@
               <w:jc w:val="center"/>
             </w:pPr>
             <w:r>
-              <w:t>+6.68 ± 0.60</w:t>
+              <w:t>+1.66 ± 0.69</w:t>
             </w:r>
           </w:p>
         </w:tc>
       </w:tr>
       <w:tr>
-        <w:tc>
-          <w:tcPr>
-            <w:tcW w:type="dxa" w:w="835"/>
+        <w:trPr>
+          <w:cantSplit/>
+        </w:trPr>
+        <w:tc>
+          <w:tcPr>
+            <w:tcW w:type="dxa" w:w="605"/>
             <w:tcMar>
               <w:left w:w="50" w:type="dxa"/>
               <w:right w:w="50" w:type="dxa"/>
@@ -3710,7 +4328,7 @@
               <w:jc w:val="left"/>
             </w:pPr>
             <w:r>
-              <w:t>3 p, 100 ms</w:t>
+              <w:t>3p/100</w:t>
             </w:r>
           </w:p>
         </w:tc>
@@ -3729,7 +4347,13 @@
               <w:jc w:val="left"/>
             </w:pPr>
             <w:r>
-              <w:t>OSLA, BasicMCTS</w:t>
+              <w:t xml:space="preserve">BasicMCTS, RHEA </w:t>
+            </w:r>
+            <w:r>
+              <w:rPr>
+                <w:vertAlign w:val="superscript"/>
+              </w:rPr>
+              <w:t>a</w:t>
             </w:r>
           </w:p>
         </w:tc>
@@ -3754,7 +4378,7 @@
         </w:tc>
         <w:tc>
           <w:tcPr>
-            <w:tcW w:type="dxa" w:w="1296"/>
+            <w:tcW w:type="dxa" w:w="1354"/>
             <w:tcMar>
               <w:left w:w="50" w:type="dxa"/>
               <w:right w:w="50" w:type="dxa"/>
@@ -3767,13 +4391,116 @@
               <w:jc w:val="center"/>
             </w:pPr>
             <w:r>
+              <w:t>84.2 [80.7, 87.1]</w:t>
+            </w:r>
+          </w:p>
+        </w:tc>
+        <w:tc>
+          <w:tcPr>
+            <w:tcW w:type="dxa" w:w="994"/>
+            <w:tcMar>
+              <w:left w:w="50" w:type="dxa"/>
+              <w:right w:w="50" w:type="dxa"/>
+            </w:tcMar>
+          </w:tcPr>
+          <w:p>
+            <w:pPr>
+              <w:pStyle w:val="tablecopy"/>
+              <w:keepNext/>
+              <w:jc w:val="center"/>
+            </w:pPr>
+            <w:r>
+              <w:t>+6.68 ± 0.60</w:t>
+            </w:r>
+          </w:p>
+        </w:tc>
+      </w:tr>
+      <w:tr>
+        <w:tc>
+          <w:tcPr>
+            <w:tcW w:type="dxa" w:w="605"/>
+            <w:tcMar>
+              <w:left w:w="50" w:type="dxa"/>
+              <w:right w:w="50" w:type="dxa"/>
+            </w:tcMar>
+          </w:tcPr>
+          <w:p>
+            <w:pPr>
+              <w:pStyle w:val="tablecopy"/>
+              <w:keepNext/>
+              <w:jc w:val="left"/>
+            </w:pPr>
+            <w:r>
+              <w:t>3p/100</w:t>
+            </w:r>
+          </w:p>
+        </w:tc>
+        <w:tc>
+          <w:tcPr>
+            <w:tcW w:type="dxa" w:w="1526"/>
+            <w:tcMar>
+              <w:left w:w="50" w:type="dxa"/>
+              <w:right w:w="50" w:type="dxa"/>
+            </w:tcMar>
+          </w:tcPr>
+          <w:p>
+            <w:pPr>
+              <w:pStyle w:val="tablecopy"/>
+              <w:keepNext/>
+              <w:jc w:val="left"/>
+            </w:pPr>
+            <w:r>
+              <w:t xml:space="preserve">OSLA, BasicMCTS </w:t>
+            </w:r>
+            <w:r>
+              <w:rPr>
+                <w:vertAlign w:val="superscript"/>
+              </w:rPr>
+              <w:t>a</w:t>
+            </w:r>
+          </w:p>
+        </w:tc>
+        <w:tc>
+          <w:tcPr>
+            <w:tcW w:type="dxa" w:w="403"/>
+            <w:tcMar>
+              <w:left w:w="50" w:type="dxa"/>
+              <w:right w:w="50" w:type="dxa"/>
+            </w:tcMar>
+          </w:tcPr>
+          <w:p>
+            <w:pPr>
+              <w:pStyle w:val="tablecopy"/>
+              <w:keepNext/>
+              <w:jc w:val="center"/>
+            </w:pPr>
+            <w:r>
+              <w:t>500</w:t>
+            </w:r>
+          </w:p>
+        </w:tc>
+        <w:tc>
+          <w:tcPr>
+            <w:tcW w:type="dxa" w:w="1354"/>
+            <w:tcMar>
+              <w:left w:w="50" w:type="dxa"/>
+              <w:right w:w="50" w:type="dxa"/>
+            </w:tcMar>
+          </w:tcPr>
+          <w:p>
+            <w:pPr>
+              <w:pStyle w:val="tablecopy"/>
+              <w:keepNext/>
+              <w:jc w:val="center"/>
+            </w:pPr>
+            <w:r>
               <w:t>87.2 [84.0, 89.8]</w:t>
             </w:r>
           </w:p>
         </w:tc>
         <w:tc>
           <w:tcPr>
-            <w:tcW w:type="dxa" w:w="864"/>
+            <w:tcW w:type="dxa" w:w="994"/>
             <w:tcMar>
               <w:left w:w="50" w:type="dxa"/>
               <w:right w:w="50" w:type="dxa"/>
@@ -3802,7 +4529,7 @@
         <w:rPr>
           <w:sz w:val="14"/>
         </w:rPr>
-        <w:t xml:space="preserve">Chance: 33.3% (3 players), 25% (4 players). Margin: our score minus the best opponent's, ± 95% CI. </w:t>
+        <w:t xml:space="preserve">Setting: players / ms per decision. Seed block 100 000 except </w:t>
       </w:r>
       <w:r>
         <w:rPr>
@@ -3815,7 +4542,7 @@
         <w:rPr>
           <w:sz w:val="14"/>
         </w:rPr>
-        <w:t xml:space="preserve"> run on a 4-core machine (Section IV-E).</w:t>
+        <w:t xml:space="preserve"> seed block 7 (used for no decision about these opponents). Margin: our score minus the best opponent's, ± 95% CI. Chance: 33.3% (3 players), 25% (4 players).</w:t>
       </w:r>
     </w:p>
     <w:p>
@@ -3823,7 +4550,7 @@
         <w:pStyle w:val="BodyText"/>
       </w:pPr>
       <w:r>
-        <w:t>Table II reports the final agent on deals not used during development. Against v2 and TAG's ISMCTS it wins 49–56% of the games with three players (chance 33.3%) and 41–47% with four (chance 25%); against two TAG ISMCTS agents it still wins 54.2%, and against BasicMCTS, RHEA and OSLA 84–87%. With four players its mean margin to the best opponent is slightly negative although it wins far more often than chance: it trades margin for first places.</w:t>
+        <w:t>Table III reports the final agent on held-out deals. Against v2 and TAG's ISMCTS it wins 52.6% at 100 ms with three players. On seed block 7, which overlaps the development deals, it had won 55.0% at 100 ms (−2.4 ± 6.2 pp), so we see no sign that the development overfitted its deals. BasicMCTS, RHEA and OSLA win at most 12.8% of their seats; OSLA wins none, as cards are revealed only when all players have chosen, so its look-ahead rarely sees a change of score.</w:t>
       </w:r>
     </w:p>
     <w:p>
@@ -3831,7 +4558,7 @@
         <w:pStyle w:val="Heading2"/>
       </w:pPr>
       <w:r>
-        <w:t>Ablation</w:t>
+        <w:t>Ablation (RQ1)</w:t>
       </w:r>
     </w:p>
     <w:p>
@@ -3880,7 +4607,7 @@
         <w:pStyle w:val="figurecaption"/>
       </w:pPr>
       <w:r>
-        <w:t>Paired effects on the final agent with three players at 100 ms (seed 7, 500 games each), ± 95% CI. Top: one component removed. Bottom: additions tested in our last study (Section IV-E).</w:t>
+        <w:t>Paired effects with three players at 100 ms (seed 7, 500 games each), ± 95% CI. Top: one component removed from the final agent (base: final agent, 55.0%). Bottom: changes tested in our last study, against a re-run of the final agent on the 4-core machine (58.1%).</w:t>
       </w:r>
     </w:p>
     <w:p>
@@ -3888,7 +4615,7 @@
         <w:pStyle w:val="BodyText"/>
       </w:pPr>
       <w:r>
-        <w:t>Fig. 3 (top) removes one component at a time from the final agent. Every removal lowers both measures, and on the score margin every difference is significant (|</w:t>
+        <w:t xml:space="preserve">Fig. 3 (top) removes one component at a time. Every removal lowers both measures; on the score margin all five differences survive a Holm correction, on the win rate only those of H and of S + I (−R: </w:t>
       </w:r>
       <w:r>
         <w:rPr>
@@ -3897,7 +4624,16 @@
         <w:t>z</w:t>
       </w:r>
       <w:r>
-        <w:t>| ≥ 2.2), supporting H1. The heuristic matters most (−28.3 ± 5.8 points without it): TAG's score heuristic ignores unfinished sets and the Maki and Pudding majorities that (1) values. S and I together are worth 10.2 ± 5.7 points (</w:t>
+        <w:t xml:space="preserve"> = 2.0, −B: 1.4, −I: 1.3), so H1 holds for the margin and only partly for wins. Without H the leaves are valued by TAG's default heuristic, the own score divided by 50, which ignores the opponents' scores – although only first place wins – and the Pudding standing, and does not match the scale of </w:t>
+      </w:r>
+      <w:r>
+        <w:rPr>
+          <w:i/>
+        </w:rPr>
+        <w:t>K</w:t>
+      </w:r>
+      <w:r>
+        <w:t>: this costs 28.3 ± 5.8 pp. S and I together are worth 10.2 ± 5.7 pp (</w:t>
       </w:r>
       <w:r>
         <w:rPr>
@@ -3906,7 +4642,16 @@
         <w:t>z</w:t>
       </w:r>
       <w:r>
-        <w:t xml:space="preserve"> = 3.5) and R 6.2 ± 5.9. The components also change the style of play: at 500 ms (500 games each) v3 scored fewer points per game than v2 from Sashimi (−2.7) and Maki (−1.9) but more from Dumplings (+1.9) and Pudding (+1.3), sets that cannot fail or are decided over the whole game.</w:t>
+        <w:t xml:space="preserve"> = 3.5) but I alone only 3.8 ± 5.7 pp, as Long et al.'s analysis [8] suggests for a game that reveals its hidden information within </w:t>
+      </w:r>
+      <w:r>
+        <w:rPr>
+          <w:i/>
+        </w:rPr>
+        <w:t>n</w:t>
+      </w:r>
+      <w:r>
+        <w:t xml:space="preserve"> − 1 turns. P and M cannot be removed from the final agent, since decoupled selection needs one value per player and the card-type statistics of I merge identical cards. The components also change the style of play: at 500 ms v3 scored fewer points than v2 from Sashimi (−2.7 per game) and Maki (−1.9) but more from Dumplings (+1.9) and Pudding (+1.3), sets that cannot fail or are decided over the whole game.</w:t>
       </w:r>
     </w:p>
     <w:p>
@@ -3914,7 +4659,7 @@
         <w:pStyle w:val="Heading2"/>
       </w:pPr>
       <w:r>
-        <w:t>Four Players and the Limits of Search</w:t>
+        <w:t>Four Players and the Limits of Search (RQ3)</w:t>
       </w:r>
     </w:p>
     <w:p>
@@ -3922,7 +4667,16 @@
         <w:pStyle w:val="BodyText"/>
       </w:pPr>
       <w:r>
-        <w:t>With four players the 3-player agent is weaker (46.4% at 100 ms, 38.4% at 500 ms; chance 25%); X0 raises it to 49.6% at 100 ms and X0 + W2 to 45.6% at 500 ms (250 games), and F + L gives 43.8% on other deals. These settings do not transfer back: with three players at 500 ms, adding X0 + W2 to F + L costs 7.7 ± 5.4 points (</w:t>
+        <w:t xml:space="preserve">With four players the 3-player configuration won 46.4% at 100 ms and 38.4% at 500 ms (development; chance 25%). None of the 4-player changes is individually significant: X0 added +3.2 ± 6.2 pp at 100 ms; at 500 ms X0 with W2 and </w:t>
+      </w:r>
+      <w:r>
+        <w:rPr>
+          <w:i/>
+        </w:rPr>
+        <w:t>K</w:t>
+      </w:r>
+      <w:r>
+        <w:t xml:space="preserve"> = 1 added +7.2 ± 8.6 pp and F + L a further +1.0 ± 7.9 pp, whereas F + L cost 6.6 ± 6.0 pp at 100 ms (</w:t>
       </w:r>
       <w:r>
         <w:rPr>
@@ -3931,7 +4685,7 @@
         <w:t>z</w:t>
       </w:r>
       <w:r>
-        <w:t xml:space="preserve"> = 2.8), supporting H3. More search helps little. At four players and 500 ms the tree has about 12 000 iterations but 700 joint actions at the root, 45% of the depth-1 nodes are visited once and the mean depth is 1.6; two searches with different seeds choose the same card in 93–96% of 74 test positions, doubling the time or the rollouts per leaf changes as few decisions, and giving only our agent 1000 ms did not raise its win rate (−4.8 ± 8.1). Yet cutting the tree to depth 1 costs 17.4 ± 8.2 points (</w:t>
+        <w:t xml:space="preserve"> = 2.2). Together they support H3: X0 and W2 cost the 3-player agent 7.7 ± 5.4 pp (</w:t>
       </w:r>
       <w:r>
         <w:rPr>
@@ -3940,7 +4694,34 @@
         <w:t>z</w:t>
       </w:r>
       <w:r>
-        <w:t xml:space="preserve"> = 4.2): the opponents' answer in the next turn matters, but beyond it the evaluation, not the search, limits the agent.</w:t>
+        <w:t xml:space="preserve"> = 2.8) at 500 ms, so their effect differs by 14.9 ± 10.2 pp (</w:t>
+      </w:r>
+      <w:r>
+        <w:rPr>
+          <w:i/>
+        </w:rPr>
+        <w:t>z</w:t>
+      </w:r>
+      <w:r>
+        <w:t xml:space="preserve"> = 2.9) between the table sizes. At 500 ms a 4-player tree cut to depth 1 lost 17.4 ± 8.2 pp (</w:t>
+      </w:r>
+      <w:r>
+        <w:rPr>
+          <w:i/>
+        </w:rPr>
+        <w:t>z</w:t>
+      </w:r>
+      <w:r>
+        <w:t xml:space="preserve"> = 4.2) and our agent limited to 100 ms 9.0 ± 7.7 pp (</w:t>
+      </w:r>
+      <w:r>
+        <w:rPr>
+          <w:i/>
+        </w:rPr>
+        <w:t>z</w:t>
+      </w:r>
+      <w:r>
+        <w:t xml:space="preserve"> = 2.3), yet 1 000 ms did not help (−4.8 ± 8.1 pp). On 73 positions from random four-player games the 500 ms tree has on average 704 joint-move children at the root, 53% of them visited once, and a mean depth of 1.5; doubling the time or the rollouts per leaf changed the chosen card in 2.7% and 5.5% of the positions, no more often than re-running the search (5.5%).</w:t>
       </w:r>
     </w:p>
     <w:p>
@@ -3956,7 +4737,7 @@
         <w:pStyle w:val="BodyText"/>
       </w:pPr>
       <w:r>
-        <w:t>Our last study (Fig. 3, bottom; seed 7, 500 paired games each on a 4-core machine, where the final agent won 58.1%) tested five additions. Card-model constants tuned for three players with the same greedy tuner (X3) make a far stronger greedy policy – 45.0% against two X0 players, chance 33.3% – but did not strengthen the search (−1.3 ± 5.8 points). Denial (“hate drafting”), in which simulated players also value taking the next player's best card, gained one point in greedy play but nothing in the search (−1.8 ± 5.8). A value aimed at the win gap (V2D) or only at the leader (W1) left the win rate unchanged, and rollouts to the end of the game valued by the win gap cost 23.7 ± 5.8 points (</w:t>
+        <w:t>The last study (Fig. 3, bottom) changed the model and the value. Card constants tuned for three players (X3) make a far stronger greedy policy – it wins 45.0% of greedy games against two X0 players – yet did not strengthen the search (−1.3 ± 5.8 pp), consistent with simulation balancing [7]. Denial (“hate drafting”: simulated players also value taking the next player's best card) gained about 1 pp in greedy play and nothing in the search (−1.8 ± 5.8 pp); a win-gap or leader-only value did not change the win rate (−0.6, +0.7 pp), and rollouts to the game end with a win-gap value cost 23.7 ± 5.8 pp (</w:t>
       </w:r>
       <w:r>
         <w:rPr>
@@ -3965,7 +4746,7 @@
         <w:t>z</w:t>
       </w:r>
       <w:r>
-        <w:t xml:space="preserve"> = 8.0). The rollout policy thus has to give unbiased leaf values, not to play well [8], and rollouts must end with the round. In all timing measurements the CPU time per decision stayed below 0.91 s with the 1 s competition file (budget 900 ms, search also stopped after 925 ms of real time).</w:t>
+        <w:t xml:space="preserve"> = 8.0).</w:t>
       </w:r>
     </w:p>
     <w:p>
@@ -3981,7 +4762,16 @@
         <w:pStyle w:val="BodyText"/>
       </w:pPr>
       <w:r>
-        <w:t>We adapted TAG's BasicMCTS to the structure of Sushi Go!: a card-value model for evaluation and simulation, rollouts that end with the round, max-n backups, decoupled UCT for simultaneous moves and information-set search over hidden hands. In paired ablations every component contributes and the heuristic most; matching the tree to simultaneous moves is what lets the agent use longer budgets, and four players need different settings. The final agent wins 55% of three-player games against TAG's tuned ISMCTS and our previous agent, and over 84% against BasicMCTS, RHEA and OSLA.</w:t>
+        <w:t>We adapted TAG's BasicMCTS to Sushi Go! with a card-value model for evaluation and simulation, round-end rollouts, max-n backups, decoupled UCT and information-set search. For RQ1, the heuristic (28.3 pp when removed) and the decoupled information-set tree (10.2 pp) contribute most, and round-end rollouts led v3's factorial (+8.7 pp). On held-out deals the final agent wins 52.6% of three-player games at 100 ms against TAG's ISMCTS and our previous agent. For RQ2, the decoupled tree loses less strength than the sequential one at longer budgets (−8.1 against −17.3 pp from 100 to 900 ms), though not significantly. For RQ3, the best settings differ between three and four players (</w:t>
+      </w:r>
+      <w:r>
+        <w:rPr>
+          <w:i/>
+        </w:rPr>
+        <w:t>z</w:t>
+      </w:r>
+      <w:r>
+        <w:t xml:space="preserve"> = 2.9), and with four players the wide joint-move tree, not the time, limits the search.</w:t>
       </w:r>
     </w:p>
     <w:p>
@@ -3989,12 +4779,13 @@
         <w:pStyle w:val="BodyText"/>
       </w:pPr>
       <w:r>
-        <w:t>The study has limits. All opponents are framework agents or our own, so the agent's strength against other designs is unknown; runs at 900 ms and some 4-player runs have 250 games (about ±6 points); and our last study reused the validation deals. The negative results show where progress must come from: the search is close to converged, and a stronger rollout policy, denial or a win-focused value do not help, so the model of the game is now the bottleneck. Future work should learn the evaluation from game outcomes, for example by regressing final ranks on features of round-end states; tune the model's constants by the results of the search rather than by greedy strength; and test regret-matching selection, which suits simultaneous moves better than UCB [12].</w:t>
+        <w:t>The study has limits: our opponents are framework agents and our own previous version; the long-budget validation and the 4-player 500 ms development rest on 250 games (about ±6 pp); the factorial and budget studies used independent rather than paired deals; and CPU-time budgets hide wall-clock effects such as garbage collection. As hand-tuned changes to the model no longer move the agent, future work should learn the evaluation from game outcomes, e.g. by regressing final ranks on features of round-end states. Regret matching or EXP3 could replace UCB in the decoupled selection [11], as the best variant depends on the game [12], and opponent models fitted to the observed picks of real opponents could replace the shared greedy policy, which models all players alike.</w:t>
       </w:r>
     </w:p>
     <w:p>
       <w:pPr>
         <w:pStyle w:val="Heading5"/>
+        <w:keepNext/>
       </w:pPr>
       <w:r>
         <w:t>Use of Generative AI</w:t>
@@ -4003,31 +4794,24 @@
     <w:p>
       <w:pPr>
         <w:pStyle w:val="BodyText"/>
-        <w:ind w:firstLine="0"/>
-      </w:pPr>
-      <w:r>
-        <w:rPr>
-          <w:sz w:val="16"/>
-        </w:rPr>
-        <w:t xml:space="preserve">Claude (Anthropic), used through the Claude Code tool, was used throughout this project: to write and modify the Java code of our agent on top of BasicMCTS, to write and run the experiment and statistics scripts, and to draft the text, tables and figures of this report from the logs of our runs (repository folders experiments_v3 to experiments_v5, from which every number is taken). The group reviewed the code and the report and takes full responsibility for both. Prompt used to generate this report (original Turkish, then English translation): </w:t>
-      </w:r>
-      <w:r>
-        <w:rPr>
-          <w:i/>
-          <w:sz w:val="16"/>
+      </w:pPr>
+      <w:r>
+        <w:t xml:space="preserve">We used Claude [15] (Anthropic), through the Claude Code tool, throughout the project: to write and modify the Java code of our agent on top of BasicMCTS, to write and run the experiment and statistics scripts, and to draft all sections, tables and figures of this paper from the logs of our runs; every number comes from the result files in our repository (folders experiments_v3 to experiments_v5). The authors take full responsibility for the code and the paper, including any errors. The paper was generated with the prompt (original Turkish, then English translation): </w:t>
+      </w:r>
+      <w:r>
+        <w:rPr>
+          <w:i/>
         </w:rPr>
         <w:t>“simdi reponun icindeki butun herseyi incele ve hocaya direk yuklyecegimiz raporuda olusutr repoda ornekler tipler brief hersey var 100 alcagimiz bir rapor olsun her raporu tamaladiginda baska bir agent spawn edip bagimsiz durusstce kontrol taki yuzde yuz alacagana emin olankadar looptan cikma”</w:t>
       </w:r>
       <w:r>
-        <w:rPr>
-          <w:sz w:val="16"/>
-        </w:rPr>
-        <w:t xml:space="preserve"> – “Now examine everything in the repository and also create the report we will upload directly to the lecturer; the repository has examples, templates, the brief, everything. It should be a report that gets 100. Every time you finish the report, spawn another agent to check it independently and impartially, and do not leave the loop until you are sure it will get 100%.” The experiments of Section IV-E were run with the prompt “The lecturer will hold a tournament of our agents in class; as before, improve the agents' performance quickly while following the lecturer's restrictions and recording what we did in the README; you have 4.5 hours, test everything in parallel.”</w:t>
+        <w:t xml:space="preserve"> – “Now examine everything in the repository and also create the report we will upload directly to the lecturer; the repository has examples, tips, the brief, everything. It should be a report that gets 100. Every time you finish the report, spawn another agent to check it independently and impartially, and do not leave the loop until you are sure it will get 100%.” Following that prompt, each draft was marked by a second, independent Claude instance against the module's rubric, and its findings were used to revise the text and to run the held-out validation, the comparison with TAG's DUCT agent, the lead-heuristic ablation and the four-player diagnostics. The experiments of the last study were run with the prompt “The lecturer will hold a tournament of our agents in class; as before, improve the agents' performance quickly while following the lecturer's restrictions and recording what we did in the README; you have 4.5 hours, test everything in parallel.” The prompts of earlier development sessions are not reproduced here; they asked Claude to implement and test the modifications of Table I and to run the experiments of Section IV.</w:t>
       </w:r>
     </w:p>
     <w:p>
       <w:pPr>
         <w:pStyle w:val="Heading5"/>
+        <w:keepNext/>
       </w:pPr>
       <w:r>
         <w:t>References</w:t>
@@ -4055,6 +4839,49 @@
         <w:pStyle w:val="references"/>
       </w:pPr>
       <w:r>
+        <w:t xml:space="preserve">C. B. Browne </w:t>
+      </w:r>
+      <w:r>
+        <w:rPr>
+          <w:i/>
+        </w:rPr>
+        <w:t>et al.</w:t>
+      </w:r>
+      <w:r>
+        <w:t xml:space="preserve">, “A survey of Monte Carlo tree search methods,” </w:t>
+      </w:r>
+      <w:r>
+        <w:rPr>
+          <w:i/>
+        </w:rPr>
+        <w:t>IEEE Trans. Comput. Intell. AI Games</w:t>
+      </w:r>
+      <w:r>
+        <w:t>, vol. 4, no. 1, pp. 1–43, 2012.</w:t>
+      </w:r>
+    </w:p>
+    <w:p>
+      <w:pPr>
+        <w:pStyle w:val="references"/>
+      </w:pPr>
+      <w:r>
+        <w:t xml:space="preserve">P. I. Cowling, E. J. Powley, and D. Whitehouse, “Information set Monte Carlo tree search,” </w:t>
+      </w:r>
+      <w:r>
+        <w:rPr>
+          <w:i/>
+        </w:rPr>
+        <w:t>IEEE Trans. Comput. Intell. AI Games</w:t>
+      </w:r>
+      <w:r>
+        <w:t>, vol. 4, no. 2, pp. 120–143, 2012.</w:t>
+      </w:r>
+    </w:p>
+    <w:p>
+      <w:pPr>
+        <w:pStyle w:val="references"/>
+      </w:pPr>
+      <w:r>
         <w:t xml:space="preserve">C.-M. E. Klang, V. Enhörning, A. Alvarez, and J. Font, “Assessing simultaneous action selection and complete information in TAG with Sushi Go!,” in </w:t>
       </w:r>
       <w:r>
@@ -4072,25 +4899,16 @@
         <w:pStyle w:val="references"/>
       </w:pPr>
       <w:r>
-        <w:t xml:space="preserve">C. B. Browne </w:t>
-      </w:r>
-      <w:r>
-        <w:rPr>
-          <w:i/>
-        </w:rPr>
-        <w:t>et al.</w:t>
-      </w:r>
-      <w:r>
-        <w:t xml:space="preserve">, “A survey of Monte Carlo tree search methods,” </w:t>
-      </w:r>
-      <w:r>
-        <w:rPr>
-          <w:i/>
-        </w:rPr>
-        <w:t>IEEE Trans. Comput. Intell. AI Games</w:t>
-      </w:r>
-      <w:r>
-        <w:t>, vol. 4, no. 1, pp. 1–43, 2012.</w:t>
+        <w:t xml:space="preserve">L. Kocsis and C. Szepesvári, “Bandit based Monte-Carlo planning,” in </w:t>
+      </w:r>
+      <w:r>
+        <w:rPr>
+          <w:i/>
+        </w:rPr>
+        <w:t>Proc. 17th Eur. Conf. Mach. Learn. (ECML)</w:t>
+      </w:r>
+      <w:r>
+        <w:t>, 2006, pp. 282–293.</w:t>
       </w:r>
     </w:p>
     <w:p>
@@ -4098,16 +4916,16 @@
         <w:pStyle w:val="references"/>
       </w:pPr>
       <w:r>
-        <w:t xml:space="preserve">L. Kocsis and C. Szepesvári, “Bandit based Monte-Carlo planning,” in </w:t>
-      </w:r>
-      <w:r>
-        <w:rPr>
-          <w:i/>
-        </w:rPr>
-        <w:t>Proc. 17th Eur. Conf. Mach. Learn. (ECML)</w:t>
-      </w:r>
-      <w:r>
-        <w:t>, 2006, pp. 282–293.</w:t>
+        <w:t xml:space="preserve">G. M. J.-B. Chaslot, M. H. M. Winands, H. J. van den Herik, J. W. H. M. Uiterwijk, and B. Bouzy, “Progressive strategies for Monte-Carlo tree search,” </w:t>
+      </w:r>
+      <w:r>
+        <w:rPr>
+          <w:i/>
+        </w:rPr>
+        <w:t>New Math. Natural Comput.</w:t>
+      </w:r>
+      <w:r>
+        <w:t>, vol. 4, no. 3, pp. 343–357, 2008.</w:t>
       </w:r>
     </w:p>
     <w:p>
@@ -4115,16 +4933,16 @@
         <w:pStyle w:val="references"/>
       </w:pPr>
       <w:r>
-        <w:t xml:space="preserve">P. Auer, N. Cesa-Bianchi, and P. Fischer, “Finite-time analysis of the multiarmed bandit problem,” </w:t>
-      </w:r>
-      <w:r>
-        <w:rPr>
-          <w:i/>
-        </w:rPr>
-        <w:t>Mach. Learn.</w:t>
-      </w:r>
-      <w:r>
-        <w:t>, vol. 47, no. 2–3, pp. 235–256, 2002.</w:t>
+        <w:t xml:space="preserve">D. Silver and G. Tesauro, “Monte-Carlo simulation balancing,” in </w:t>
+      </w:r>
+      <w:r>
+        <w:rPr>
+          <w:i/>
+        </w:rPr>
+        <w:t>Proc. 26th Int. Conf. Mach. Learn. (ICML)</w:t>
+      </w:r>
+      <w:r>
+        <w:t>, 2009, pp. 945–952.</w:t>
       </w:r>
     </w:p>
     <w:p>
@@ -4132,16 +4950,16 @@
         <w:pStyle w:val="references"/>
       </w:pPr>
       <w:r>
-        <w:t xml:space="preserve">S. Gelly and D. Silver, “Combining online and offline knowledge in UCT,” in </w:t>
-      </w:r>
-      <w:r>
-        <w:rPr>
-          <w:i/>
-        </w:rPr>
-        <w:t>Proc. 24th Int. Conf. Mach. Learn. (ICML)</w:t>
-      </w:r>
-      <w:r>
-        <w:t>, 2007, pp. 273–280.</w:t>
+        <w:t xml:space="preserve">J. Long, N. R. Sturtevant, M. Buro, and T. Furtak, “Understanding the success of perfect information Monte Carlo sampling in game tree search,” in </w:t>
+      </w:r>
+      <w:r>
+        <w:rPr>
+          <w:i/>
+        </w:rPr>
+        <w:t>Proc. 24th AAAI Conf. Artif. Intell.</w:t>
+      </w:r>
+      <w:r>
+        <w:t>, 2010, pp. 134–140.</w:t>
       </w:r>
     </w:p>
     <w:p>
@@ -4149,16 +4967,16 @@
         <w:pStyle w:val="references"/>
       </w:pPr>
       <w:r>
-        <w:t xml:space="preserve">G. M. J.-B. Chaslot, M. H. M. Winands, H. J. van den Herik, J. W. H. M. Uiterwijk, and B. Bouzy, “Progressive strategies for Monte-Carlo tree search,” </w:t>
-      </w:r>
-      <w:r>
-        <w:rPr>
-          <w:i/>
-        </w:rPr>
-        <w:t>New Math. Natural Comput.</w:t>
-      </w:r>
-      <w:r>
-        <w:t>, vol. 4, no. 3, pp. 343–357, 2008.</w:t>
+        <w:t xml:space="preserve">I. Frank and D. Basin, “Search in games with incomplete information: A case study using Bridge card play,” </w:t>
+      </w:r>
+      <w:r>
+        <w:rPr>
+          <w:i/>
+        </w:rPr>
+        <w:t>Artif. Intell.</w:t>
+      </w:r>
+      <w:r>
+        <w:t>, vol. 100, no. 1–2, pp. 87–123, 1998.</w:t>
       </w:r>
     </w:p>
     <w:p>
@@ -4166,16 +4984,16 @@
         <w:pStyle w:val="references"/>
       </w:pPr>
       <w:r>
-        <w:t xml:space="preserve">D. Silver and G. Tesauro, “Monte-Carlo simulation balancing,” in </w:t>
-      </w:r>
-      <w:r>
-        <w:rPr>
-          <w:i/>
-        </w:rPr>
-        <w:t>Proc. 26th Int. Conf. Mach. Learn. (ICML)</w:t>
-      </w:r>
-      <w:r>
-        <w:t>, 2009, pp. 945–952.</w:t>
+        <w:t xml:space="preserve">J. Goodman, D. Perez-Liebana, and S. Lucas, “MultiTree MCTS in tabletop games,” in </w:t>
+      </w:r>
+      <w:r>
+        <w:rPr>
+          <w:i/>
+        </w:rPr>
+        <w:t>Proc. IEEE Conf. Games (CoG)</w:t>
+      </w:r>
+      <w:r>
+        <w:t>, 2022, pp. 292–299.</w:t>
       </w:r>
     </w:p>
     <w:p>
@@ -4183,16 +5001,16 @@
         <w:pStyle w:val="references"/>
       </w:pPr>
       <w:r>
-        <w:t xml:space="preserve">J. Long, N. R. Sturtevant, M. Buro, and T. Furtak, “Understanding the success of perfect information Monte Carlo sampling in game tree search,” in </w:t>
-      </w:r>
-      <w:r>
-        <w:rPr>
-          <w:i/>
-        </w:rPr>
-        <w:t>Proc. 24th AAAI Conf. Artif. Intell.</w:t>
-      </w:r>
-      <w:r>
-        <w:t>, 2010, pp. 134–140.</w:t>
+        <w:t xml:space="preserve">M. Lanctot, V. Lisý, and M. H. M. Winands, “Monte Carlo tree search in simultaneous move games with applications to Goofspiel,” in </w:t>
+      </w:r>
+      <w:r>
+        <w:rPr>
+          <w:i/>
+        </w:rPr>
+        <w:t>Computer Games (CGW 2013)</w:t>
+      </w:r>
+      <w:r>
+        <w:t>, Commun. Comput. Inf. Sci., vol. 408. Cham, Switzerland: Springer, 2014, pp. 28–43.</w:t>
       </w:r>
     </w:p>
     <w:p>
@@ -4200,16 +5018,16 @@
         <w:pStyle w:val="references"/>
       </w:pPr>
       <w:r>
-        <w:t xml:space="preserve">I. Frank and D. Basin, “Search in games with incomplete information: A case study using Bridge card play,” </w:t>
-      </w:r>
-      <w:r>
-        <w:rPr>
-          <w:i/>
-        </w:rPr>
-        <w:t>Artif. Intell.</w:t>
-      </w:r>
-      <w:r>
-        <w:t>, vol. 100, no. 1–2, pp. 87–123, 1998.</w:t>
+        <w:t xml:space="preserve">M. J. W. Tak, M. Lanctot, and M. H. M. Winands, “Monte Carlo tree search variants for simultaneous move games,” in </w:t>
+      </w:r>
+      <w:r>
+        <w:rPr>
+          <w:i/>
+        </w:rPr>
+        <w:t>Proc. IEEE Conf. Comput. Intell. Games (CIG)</w:t>
+      </w:r>
+      <w:r>
+        <w:t>, 2014, pp. 1–8.</w:t>
       </w:r>
     </w:p>
     <w:p>
@@ -4217,16 +5035,16 @@
         <w:pStyle w:val="references"/>
       </w:pPr>
       <w:r>
-        <w:t xml:space="preserve">P. I. Cowling, E. J. Powley, and D. Whitehouse, “Information set Monte Carlo tree search,” </w:t>
-      </w:r>
-      <w:r>
-        <w:rPr>
-          <w:i/>
-        </w:rPr>
-        <w:t>IEEE Trans. Comput. Intell. AI Games</w:t>
-      </w:r>
-      <w:r>
-        <w:t>, vol. 4, no. 2, pp. 120–143, 2012.</w:t>
+        <w:t xml:space="preserve">N. R. Sturtevant, “An analysis of UCT in multi-player games,” in </w:t>
+      </w:r>
+      <w:r>
+        <w:rPr>
+          <w:i/>
+        </w:rPr>
+        <w:t>Computers and Games (CG 2008)</w:t>
+      </w:r>
+      <w:r>
+        <w:t>, Lect. Notes Comput. Sci., vol. 5131. Berlin, Germany: Springer, 2008, pp. 37–49.</w:t>
       </w:r>
     </w:p>
     <w:p>
@@ -4234,16 +5052,16 @@
         <w:pStyle w:val="references"/>
       </w:pPr>
       <w:r>
-        <w:t xml:space="preserve">M. Lanctot, V. Lisý, and M. H. M. Winands, “Monte Carlo tree search in simultaneous move games with applications to Goofspiel,” in </w:t>
-      </w:r>
-      <w:r>
-        <w:rPr>
-          <w:i/>
-        </w:rPr>
-        <w:t>Computer Games (CGW 2013)</w:t>
-      </w:r>
-      <w:r>
-        <w:t>, Commun. Comput. Inf. Sci., vol. 408. Cham, Switzerland: Springer, 2014, pp. 28–43.</w:t>
+        <w:t xml:space="preserve">E. B. Wilson, “Probable inference, the law of succession, and statistical inference,” </w:t>
+      </w:r>
+      <w:r>
+        <w:rPr>
+          <w:i/>
+        </w:rPr>
+        <w:t>J. Amer. Statist. Assoc.</w:t>
+      </w:r>
+      <w:r>
+        <w:t>, vol. 22, no. 158, pp. 209–212, 1927.</w:t>
       </w:r>
     </w:p>
     <w:p>
@@ -4251,50 +5069,7 @@
         <w:pStyle w:val="references"/>
       </w:pPr>
       <w:r>
-        <w:t xml:space="preserve">M. J. W. Tak, M. Lanctot, and M. H. M. Winands, “Monte Carlo tree search variants for simultaneous move games,” in </w:t>
-      </w:r>
-      <w:r>
-        <w:rPr>
-          <w:i/>
-        </w:rPr>
-        <w:t>Proc. IEEE Conf. Comput. Intell. Games (CIG)</w:t>
-      </w:r>
-      <w:r>
-        <w:t>, 2014, pp. 1–8.</w:t>
-      </w:r>
-    </w:p>
-    <w:p>
-      <w:pPr>
-        <w:pStyle w:val="references"/>
-      </w:pPr>
-      <w:r>
-        <w:t xml:space="preserve">N. R. Sturtevant, “An analysis of UCT in multi-player games,” in </w:t>
-      </w:r>
-      <w:r>
-        <w:rPr>
-          <w:i/>
-        </w:rPr>
-        <w:t>Computers and Games (CG 2008)</w:t>
-      </w:r>
-      <w:r>
-        <w:t>, Lect. Notes Comput. Sci., vol. 5131. Berlin, Germany: Springer, 2008, pp. 37–49.</w:t>
-      </w:r>
-    </w:p>
-    <w:p>
-      <w:pPr>
-        <w:pStyle w:val="references"/>
-      </w:pPr>
-      <w:r>
-        <w:t xml:space="preserve">E. B. Wilson, “Probable inference, the law of succession, and statistical inference,” </w:t>
-      </w:r>
-      <w:r>
-        <w:rPr>
-          <w:i/>
-        </w:rPr>
-        <w:t>J. Amer. Statist. Assoc.</w:t>
-      </w:r>
-      <w:r>
-        <w:t>, vol. 22, no. 158, pp. 209–212, 1927.</w:t>
+        <w:t>Anthropic, “Claude” (large language model, used through the Claude Code tool), 2026. [Online]. Available: https://claude.ai</w:t>
       </w:r>
     </w:p>
     <w:p>
@@ -4302,7 +5077,7 @@
         <w:sectPr>
           <w:type w:val="continuous"/>
           <w:pgSz w:w="11906" w:h="16838"/>
-          <w:pgMar w:left="893" w:right="893" w:gutter="0" w:header="0" w:top="540" w:footer="720" w:bottom="1440"/>
+          <w:pgMar w:left="893" w:right="893" w:gutter="0" w:header="0" w:top="1080" w:footer="720" w:bottom="1440"/>
           <w:cols w:num="2" w:space="360" w:equalWidth="true" w:sep="false"/>
           <w:formProt w:val="false"/>
           <w:titlePg/>
@@ -4323,7 +5098,7 @@
     <w:sectPr>
       <w:type w:val="continuous"/>
       <w:pgSz w:w="11906" w:h="16838"/>
-      <w:pgMar w:left="893" w:right="893" w:gutter="0" w:header="0" w:top="540" w:footer="720" w:bottom="1440"/>
+      <w:pgMar w:left="893" w:right="893" w:gutter="0" w:header="0" w:top="1080" w:footer="720" w:bottom="1440"/>
       <w:formProt w:val="false"/>
       <w:titlePg/>
       <w:textDirection w:val="lrTb"/>
@@ -4377,6 +5152,12 @@
         <w:sz w:val="16"/>
         <w:szCs w:val="16"/>
       </w:rPr>
+    </w:r>
+    <w:r>
+      <w:rPr>
+        <w:sz w:val="15"/>
+      </w:rPr>
+      <w:t>All sections, tables and figures of this paper were drafted with Claude [15]; the prompts are given in the statement on the use of generative AI at the end of the paper.</w:t>
     </w:r>
   </w:p>
 </w:ftr>

</xml_diff>

<commit_message>
Report draft 2: reviewer fixes (confounds named, UCB/CI defined, records row), aligned authors, lossless figures; v5 README/RESULTS document the revision runs
Co-Authored-By: Claude Opus 5.5 <noreply@anthropic.com>
Claude-Session: https://claude.ai/code/session_01Jg1ytYCX7c7JubKoggMArC
</commit_message>
<xml_diff>
--- a/report/ECS7032P_Assignment1_Report_GroupA.docx
+++ b/report/ECS7032P_Assignment1_Report_GroupA.docx
@@ -15,7 +15,16 @@
           <w:rFonts w:ascii="Times New Roman" w:hAnsi="Times New Roman" w:cs="Times New Roman" w:eastAsia="Times New Roman"/>
           <w:kern w:val="2"/>
         </w:rPr>
-        <w:t>Decoupled Information-Set MCTS with a Card-Value Model for Sushi Go!</w:t>
+        <w:t xml:space="preserve">Decoupled Information-Set MCTS with a </w:t>
+      </w:r>
+      <w:r>
+        <w:rPr>
+          <w:rFonts w:ascii="Times New Roman" w:hAnsi="Times New Roman" w:cs="Times New Roman" w:eastAsia="Times New Roman"/>
+          <w:kern w:val="2"/>
+        </w:rPr>
+        <w:t>Card</w:t>
+        <w:noBreakHyphen/>
+        <w:t xml:space="preserve">Value Model for Sushi Go!</w:t>
       </w:r>
     </w:p>
     <w:p>
@@ -75,16 +84,6 @@
         </w:rPr>
         <w:t>London, UK</w:t>
       </w:r>
-    </w:p>
-    <w:p>
-      <w:pPr>
-        <w:pStyle w:val="Normal"/>
-        <w:spacing w:beforeAutospacing="1" w:after="0"/>
-        <w:rPr>
-          <w:sz w:val="18"/>
-          <w:szCs w:val="18"/>
-        </w:rPr>
-      </w:pPr>
       <w:r>
         <w:br w:type="column"/>
       </w:r>
@@ -119,16 +118,6 @@
         </w:rPr>
         <w:t>London, UK</w:t>
       </w:r>
-    </w:p>
-    <w:p>
-      <w:pPr>
-        <w:pStyle w:val="Normal"/>
-        <w:spacing w:beforeAutospacing="1" w:after="0"/>
-        <w:rPr>
-          <w:sz w:val="18"/>
-          <w:szCs w:val="18"/>
-        </w:rPr>
-      </w:pPr>
       <w:r>
         <w:br w:type="column"/>
       </w:r>
@@ -386,7 +375,7 @@
         <w:pStyle w:val="BodyText"/>
       </w:pPr>
       <w:r>
-        <w:t xml:space="preserve">MCTS [2] builds a search tree by repeating selection, expansion, simulation (rollout) and backpropagation. Upper Confidence bounds applied to Trees (UCT) [5] selects the child that maximises </w:t>
+        <w:t xml:space="preserve">MCTS [2] builds a search tree by repeating selection, expansion, simulation (rollout) and backpropagation. Upper Confidence bounds applied to Trees (UCT) [5] selects the child that maximises the upper confidence bound (UCB1) </w:t>
       </w:r>
       <w:r>
         <w:rPr>
@@ -2876,7 +2865,7 @@
               <w:t>K</w:t>
             </w:r>
             <w:r>
-              <w:t xml:space="preserve"> 1.41. TAG ISMCTS: TAG's SushiGo_3+P_HiBudget configuration (information sets, one tree per player [10], UCB-Tuned, </w:t>
+              <w:t xml:space="preserve"> 1.41. TAG ISMCTS: TAG's SushiGo_3+P_HiBudget configuration, set for 400 ms and run at our budget (information sets, one tree per player [10], UCB-Tuned, </w:t>
             </w:r>
             <w:r>
               <w:rPr>
@@ -3214,6 +3203,9 @@
         </w:tc>
       </w:tr>
       <w:tr>
+        <w:trPr>
+          <w:cantSplit/>
+        </w:trPr>
         <w:tc>
           <w:tcPr>
             <w:tcW w:type="dxa" w:w="1037"/>
@@ -3225,6 +3217,7 @@
           <w:p>
             <w:pPr>
               <w:pStyle w:val="tablecopy"/>
+              <w:keepNext/>
               <w:jc w:val="left"/>
             </w:pPr>
             <w:r>
@@ -3243,10 +3236,49 @@
           <w:p>
             <w:pPr>
               <w:pStyle w:val="tablecopy"/>
+              <w:keepNext/>
               <w:jc w:val="left"/>
             </w:pPr>
             <w:r>
               <w:t>18-core laptop (6–16 games in parallel); last study and validation on a 4-core machine (4 in parallel)</w:t>
+            </w:r>
+          </w:p>
+        </w:tc>
+      </w:tr>
+      <w:tr>
+        <w:tc>
+          <w:tcPr>
+            <w:tcW w:type="dxa" w:w="1037"/>
+            <w:tcMar>
+              <w:left w:w="50" w:type="dxa"/>
+              <w:right w:w="50" w:type="dxa"/>
+            </w:tcMar>
+          </w:tcPr>
+          <w:p>
+            <w:pPr>
+              <w:pStyle w:val="tablecopy"/>
+              <w:jc w:val="left"/>
+            </w:pPr>
+            <w:r>
+              <w:t>Records</w:t>
+            </w:r>
+          </w:p>
+        </w:tc>
+        <w:tc>
+          <w:tcPr>
+            <w:tcW w:type="dxa" w:w="3830"/>
+            <w:tcMar>
+              <w:left w:w="50" w:type="dxa"/>
+              <w:right w:w="50" w:type="dxa"/>
+            </w:tcMar>
+          </w:tcPr>
+          <w:p>
+            <w:pPr>
+              <w:pStyle w:val="tablecopy"/>
+              <w:jc w:val="left"/>
+            </w:pPr>
+            <w:r>
+              <w:t>agent files, per-game results and scripts of every run are kept with our code (experiments_v3 to experiments_v5)</w:t>
             </w:r>
           </w:p>
         </w:tc>
@@ -3275,7 +3307,7 @@
         <w:t>k</w:t>
       </w:r>
       <w:r>
-        <w:t xml:space="preserve">-way shared first place and 0 otherwise. Win rates are reported with Wilson 95% intervals [14]; the score margin (our score minus the best opponent's) as mean ± 1.96 standard errors (SE); differences between runs as the mean of the per-game differences on the same deals ± 1.96 SE (for independent samples, the difference of the means with the two-sample SE) and </w:t>
+        <w:t xml:space="preserve">-way shared first place and 0 otherwise. Win rates are reported with Wilson 95% confidence intervals (CI) [14]; the score margin (our score minus the best opponent's) as mean ± 1.96 standard errors (SE); differences between runs as the mean of the per-game differences on the same deals ± 1.96 SE (for independent samples, the difference of the means with the two-sample SE) and </w:t>
       </w:r>
       <w:r>
         <w:rPr>
@@ -4607,7 +4639,7 @@
         <w:pStyle w:val="figurecaption"/>
       </w:pPr>
       <w:r>
-        <w:t>Paired effects with three players at 100 ms (seed 7, 500 games each), ± 95% CI. Top: one component removed from the final agent (base: final agent, 55.0%). Bottom: changes tested in our last study, against a re-run of the final agent on the 4-core machine (58.1%).</w:t>
+        <w:t>Paired effects with three players at 100 ms (seed 7, 500 games each), ± 95% CI. Top: one component removed from the final agent (base: final agent, 55.0%). Bottom: the lead-heuristic ablation and the changes of our last study, against a re-run of the final agent on the 4-core machine (58.1%).</w:t>
       </w:r>
     </w:p>
     <w:p>
@@ -4685,7 +4717,16 @@
         <w:t>z</w:t>
       </w:r>
       <w:r>
-        <w:t xml:space="preserve"> = 2.2). Together they support H3: X0 and W2 cost the 3-player agent 7.7 ± 5.4 pp (</w:t>
+        <w:t xml:space="preserve"> = 2.2). Together they support H3: adding X0, W2 and </w:t>
+      </w:r>
+      <w:r>
+        <w:rPr>
+          <w:i/>
+        </w:rPr>
+        <w:t>K</w:t>
+      </w:r>
+      <w:r>
+        <w:t xml:space="preserve"> = 1 to the 3-player agent at 500 ms cost 7.7 ± 5.4 pp (</w:t>
       </w:r>
       <w:r>
         <w:rPr>
@@ -4694,7 +4735,7 @@
         <w:t>z</w:t>
       </w:r>
       <w:r>
-        <w:t xml:space="preserve"> = 2.8) at 500 ms, so their effect differs by 14.9 ± 10.2 pp (</w:t>
+        <w:t xml:space="preserve"> = 2.8), so their effect differs by 14.9 ± 10.2 pp (</w:t>
       </w:r>
       <w:r>
         <w:rPr>
@@ -4721,7 +4762,16 @@
         <w:t>z</w:t>
       </w:r>
       <w:r>
-        <w:t xml:space="preserve"> = 2.3), yet 1 000 ms did not help (−4.8 ± 8.1 pp). On 73 positions from random four-player games the 500 ms tree has on average 704 joint-move children at the root, 53% of them visited once, and a mean depth of 1.5; doubling the time or the rollouts per leaf changed the chosen card in 2.7% and 5.5% of the positions, no more often than re-running the search (5.5%).</w:t>
+        <w:t xml:space="preserve"> = 2.3), yet 1 000 ms (with </w:t>
+      </w:r>
+      <w:r>
+        <w:rPr>
+          <w:i/>
+        </w:rPr>
+        <w:t>K</w:t>
+      </w:r>
+      <w:r>
+        <w:t xml:space="preserve"> = 1.37) did not help (−4.8 ± 8.1 pp). On 73 positions from random four-player games the 500 ms tree has on average 704 joint-move children at the root, 53% of them visited once, and a mean depth of 1.5; doubling the time or the rollouts per leaf changed the chosen card in 2.7% and 5.5% of the positions, no more often than re-running the search (5.5%).</w:t>
       </w:r>
     </w:p>
     <w:p>
@@ -4737,7 +4787,7 @@
         <w:pStyle w:val="BodyText"/>
       </w:pPr>
       <w:r>
-        <w:t>The last study (Fig. 3, bottom) changed the model and the value. Card constants tuned for three players (X3) make a far stronger greedy policy – it wins 45.0% of greedy games against two X0 players – yet did not strengthen the search (−1.3 ± 5.8 pp), consistent with simulation balancing [7]. Denial (“hate drafting”: simulated players also value taking the next player's best card) gained about 1 pp in greedy play and nothing in the search (−1.8 ± 5.8 pp); a win-gap or leader-only value did not change the win rate (−0.6, +0.7 pp), and rollouts to the game end with a win-gap value cost 23.7 ± 5.8 pp (</w:t>
+        <w:t>The last study (three players, Fig. 3 bottom) changed the model and the value. Card constants tuned for three players (X3) make a far stronger greedy policy – it wins 45.0% of greedy games against two X0 players – yet did not strengthen the search (−1.3 ± 5.8 pp), consistent with simulation balancing [7]. Denial (“hate drafting”: simulated players also value taking the next player's best card) gained about 1 pp in greedy play and nothing in the search (−1.8 ± 5.8 pp); a win-gap or leader-only value did not change the win rate (−0.6, +0.7 pp), and rollouts to the game end with a win-gap value cost 23.7 ± 5.8 pp (</w:t>
       </w:r>
       <w:r>
         <w:rPr>
@@ -4771,7 +4821,7 @@
         <w:t>z</w:t>
       </w:r>
       <w:r>
-        <w:t xml:space="preserve"> = 2.9), and with four players the wide joint-move tree, not the time, limits the search.</w:t>
+        <w:t xml:space="preserve"> = 2.9), and with four players extra time rarely changes the decision of the wide, shallow joint-move tree.</w:t>
       </w:r>
     </w:p>
     <w:p>

</xml_diff>

<commit_message>
Held-out validation, 4 players at 100 ms: 44.4% [40.1, 48.8] (chance 25%); report rebuilt
Co-Authored-By: Claude Opus 5.5 <noreply@anthropic.com>
Claude-Session: https://claude.ai/code/session_01Jg1ytYCX7c7JubKoggMArC
</commit_message>
<xml_diff>
--- a/report/ECS7032P_Assignment1_Report_GroupA.docx
+++ b/report/ECS7032P_Assignment1_Report_GroupA.docx
@@ -192,7 +192,7 @@
         <w:t>Abstract—</w:t>
       </w:r>
       <w:r>
-        <w:t>In Sushi Go! players pick cards simultaneously from hidden hands that rotate around the table, which basic Monte Carlo tree search (MCTS) does not model. Starting from TAG's BasicMCTS, we added a model of the game's scoring that drives evaluation and rollouts, rollouts that end with the round, max-n backups, decoupled UCT for the simultaneous choices and information-set search. On held-out deals the agent wins 52.6% of 500 three-player games at 100 ms against TAG's ISMCTS and our previous agent (chance 33.3%), [pending]% with four players (chance 25%) and [pending]% at 900 ms. Ablations show that the heuristic and the simultaneous-move tree matter most, that the tree's advantage tends to grow with the time budget, and that four players need different settings.</w:t>
+        <w:t>In Sushi Go! players pick cards simultaneously from hidden hands that rotate around the table, which basic Monte Carlo tree search (MCTS) does not model. Starting from TAG's BasicMCTS, we added a model of the game's scoring that drives evaluation and rollouts, rollouts that end with the round, max-n backups, decoupled UCT for the simultaneous choices and information-set search. On held-out deals the agent wins 52.6% of 500 three-player games at 100 ms against TAG's ISMCTS and our previous agent (chance 33.3%), 44.4% with four players (chance 25%) and [pending]% at 900 ms. Ablations show that the heuristic and the simultaneous-move tree matter most, that the tree's advantage tends to grow with the time budget, and that four players need different settings.</w:t>
       </w:r>
     </w:p>
     <w:p>
@@ -299,7 +299,7 @@
         <w:ind w:left="576" w:hanging="288"/>
       </w:pPr>
       <w:r>
-        <w:t>a study of 159 runs (67 850 games) with leave-one-out ablations, a 2</w:t>
+        <w:t>a study of 160 runs (68 350 games) with leave-one-out ablations, a 2</w:t>
       </w:r>
       <w:r>
         <w:rPr>
@@ -4011,7 +4011,7 @@
               <w:jc w:val="center"/>
             </w:pPr>
             <w:r>
-              <w:t>pending</w:t>
+              <w:t>44.4 [40.1, 48.8]</w:t>
             </w:r>
           </w:p>
         </w:tc>
@@ -4030,7 +4030,7 @@
               <w:jc w:val="center"/>
             </w:pPr>
             <w:r>
-              <w:t>pending</w:t>
+              <w:t>−0.61 ± 0.43</w:t>
             </w:r>
           </w:p>
         </w:tc>
@@ -4582,7 +4582,7 @@
         <w:pStyle w:val="BodyText"/>
       </w:pPr>
       <w:r>
-        <w:t>Table III reports the final agent on held-out deals. Against v2 and TAG's ISMCTS it wins 52.6% at 100 ms with three players. On seed block 7, which overlaps the development deals, it had won 55.0% at 100 ms (−2.4 ± 6.2 pp), so we see no sign that the development overfitted its deals. BasicMCTS, RHEA and OSLA win at most 12.8% of their seats; OSLA wins none, as cards are revealed only when all players have chosen, so its look-ahead rarely sees a change of score.</w:t>
+        <w:t>Table III reports the final agent on held-out deals. Against v2 and TAG's ISMCTS it wins 52.6% at 100 ms with three players, and 44.4% at 100 ms with four. On seed block 7, which overlaps the development deals, it had won 55.0% at 100 ms (−2.4 ± 6.2 pp), so we see no sign that the development overfitted its deals. BasicMCTS, RHEA and OSLA win at most 12.8% of their seats; OSLA wins none, as cards are revealed only when all players have chosen, so its look-ahead rarely sees a change of score.</w:t>
       </w:r>
     </w:p>
     <w:p>

</xml_diff>

<commit_message>
TAG DUCT comparison (seed block 100 000): our agent 55.0% [50.6, 59.3], DUCT seats 21.0%, ISMCTS 24.0%; report rebuilt
Co-Authored-By: Claude Opus 5.5 <noreply@anthropic.com>
Claude-Session: https://claude.ai/code/session_01Jg1ytYCX7c7JubKoggMArC
</commit_message>
<xml_diff>
--- a/report/ECS7032P_Assignment1_Report_GroupA.docx
+++ b/report/ECS7032P_Assignment1_Report_GroupA.docx
@@ -299,7 +299,7 @@
         <w:ind w:left="576" w:hanging="288"/>
       </w:pPr>
       <w:r>
-        <w:t>a study of 160 runs (68 350 games) with leave-one-out ablations, a 2</w:t>
+        <w:t>a study of 161 runs (68 850 games) with leave-one-out ablations, a 2</w:t>
       </w:r>
       <w:r>
         <w:rPr>
@@ -4211,7 +4211,7 @@
               <w:jc w:val="center"/>
             </w:pPr>
             <w:r>
-              <w:t>pending</w:t>
+              <w:t>55.0 [50.6, 59.3]</w:t>
             </w:r>
           </w:p>
         </w:tc>
@@ -4230,7 +4230,7 @@
               <w:jc w:val="center"/>
             </w:pPr>
             <w:r>
-              <w:t>pending</w:t>
+              <w:t>+0.72 ± 0.40</w:t>
             </w:r>
           </w:p>
         </w:tc>
@@ -4582,7 +4582,7 @@
         <w:pStyle w:val="BodyText"/>
       </w:pPr>
       <w:r>
-        <w:t>Table III reports the final agent on held-out deals. Against v2 and TAG's ISMCTS it wins 52.6% at 100 ms with three players, and 44.4% at 100 ms with four. On seed block 7, which overlaps the development deals, it had won 55.0% at 100 ms (−2.4 ± 6.2 pp), so we see no sign that the development overfitted its deals. BasicMCTS, RHEA and OSLA win at most 12.8% of their seats; OSLA wins none, as cards are revealed only when all players have chosen, so its look-ahead rarely sees a change of score.</w:t>
+        <w:t>Table III reports the final agent on held-out deals. Against v2 and TAG's ISMCTS it wins 52.6% at 100 ms with three players, and 44.4% at 100 ms with four. On seed block 7, which overlaps the development deals, it had won 55.0% at 100 ms (−2.4 ± 6.2 pp), so we see no sign that the development overfitted its deals. TAG's DUCT agent, which has decoupled selection and information sets but neither our card-value model nor round-end rollouts, wins only 21.0% of its seats when it replaces v2 (ISMCTS 24.0%, our agent 55.0%). BasicMCTS, RHEA and OSLA win at most 12.8% of their seats; OSLA wins none, as cards are revealed only when all players have chosen, so its look-ahead rarely sees a change of score.</w:t>
       </w:r>
     </w:p>
     <w:p>

</xml_diff>

<commit_message>
Lead-heuristic ablation: H -> TAG LeaderHeuristic (K 7.5) costs 13.6 +- 5.9 pp (z = 4.5), about half of H's effect; report rebuilt
Co-Authored-By: Claude Opus 5.5 <noreply@anthropic.com>
Claude-Session: https://claude.ai/code/session_01Jg1ytYCX7c7JubKoggMArC
</commit_message>
<xml_diff>
--- a/report/ECS7032P_Assignment1_Report_GroupA.docx
+++ b/report/ECS7032P_Assignment1_Report_GroupA.docx
@@ -299,7 +299,7 @@
         <w:ind w:left="576" w:hanging="288"/>
       </w:pPr>
       <w:r>
-        <w:t>a study of 161 runs (68 850 games) with leave-one-out ablations, a 2</w:t>
+        <w:t>a study of 162 runs (69 350 games) with leave-one-out ablations, a 2</w:t>
       </w:r>
       <w:r>
         <w:rPr>
@@ -4665,7 +4665,16 @@
         <w:t>K</w:t>
       </w:r>
       <w:r>
-        <w:t>: this costs 28.3 ± 5.8 pp. S and I together are worth 10.2 ± 5.7 pp (</w:t>
+        <w:t xml:space="preserve">: this costs 28.3 ± 5.8 pp. Replacing H by TAG's lead heuristic (own score minus the best opponent's, </w:t>
+      </w:r>
+      <w:r>
+        <w:rPr>
+          <w:i/>
+        </w:rPr>
+        <w:t>K</w:t>
+      </w:r>
+      <w:r>
+        <w:t xml:space="preserve"> = 7.5) cost 13.6 ± 5.9 pp (</w:t>
       </w:r>
       <w:r>
         <w:rPr>
@@ -4674,6 +4683,15 @@
         <w:t>z</w:t>
       </w:r>
       <w:r>
+        <w:t xml:space="preserve"> = 4.5), about half as much: valuing the lead instead of the own score accounts for about half of H's effect, and the Pudding standing, the term for the mean opponent and the bounded scale that H adds at the round-end leaves for the rest. S and I together are worth 10.2 ± 5.7 pp (</w:t>
+      </w:r>
+      <w:r>
+        <w:rPr>
+          <w:i/>
+        </w:rPr>
+        <w:t>z</w:t>
+      </w:r>
+      <w:r>
         <w:t xml:space="preserve"> = 3.5) but I alone only 3.8 ± 5.7 pp, as Long et al.'s analysis [8] suggests for a game that reveals its hidden information within </w:t>
       </w:r>
       <w:r>
@@ -4812,7 +4830,7 @@
         <w:pStyle w:val="BodyText"/>
       </w:pPr>
       <w:r>
-        <w:t>We adapted TAG's BasicMCTS to Sushi Go! with a card-value model for evaluation and simulation, round-end rollouts, max-n backups, decoupled UCT and information-set search. For RQ1, the heuristic (28.3 pp when removed) and the decoupled information-set tree (10.2 pp) contribute most, and round-end rollouts led v3's factorial (+8.7 pp). On held-out deals the final agent wins 52.6% of three-player games at 100 ms against TAG's ISMCTS and our previous agent. For RQ2, the decoupled tree loses less strength than the sequential one at longer budgets (−8.1 against −17.3 pp from 100 to 900 ms), though not significantly. For RQ3, the best settings differ between three and four players (</w:t>
+        <w:t>We adapted TAG's BasicMCTS to Sushi Go! with a card-value model for evaluation and simulation, round-end rollouts, max-n backups, decoupled UCT and information-set search. For RQ1, the heuristic (28.3 pp when removed; a plain lead recovers half of it) and the decoupled information-set tree (10.2 pp) contribute most, and round-end rollouts led v3's factorial (+8.7 pp). On held-out deals the final agent wins 52.6% of three-player games at 100 ms against TAG's ISMCTS and our previous agent. For RQ2, the decoupled tree loses less strength than the sequential one at longer budgets (−8.1 against −17.3 pp from 100 to 900 ms), though not significantly. For RQ3, the best settings differ between three and four players (</w:t>
       </w:r>
       <w:r>
         <w:rPr>

</xml_diff>

<commit_message>
Report draft 3 after the second independent review
- Results reordered (final agent, ablation, time budget, four players); every number computed from the CSVs
- four-player evidence with all replicates pooled, H3 stated as one-sided and exploratory, X0 effect corrected
- overfitting check against both seed-7 runs; budget evidence with TAG ISMCTS seat shares; hedged claims
- new conceptual Fig. 1 (decoupled turn node vs v3's sequential tree), larger figure text
- 7 Wonders MCTS reference instead of Chaslot; card-model constants explained; Table II referenced
- queued: held-out 500-game runs at 500/900 ms, v3 on the held-out deals, two-ISMCTS run to 500 games
- README: seed 7 overlaps the development deals; one competition file named
- independent reviews archived in report/reviews

Co-Authored-By: Claude Opus 5.5 <noreply@anthropic.com>
Claude-Session: https://claude.ai/code/session_01Jg1ytYCX7c7JubKoggMArC
</commit_message>
<xml_diff>
--- a/report/ECS7032P_Assignment1_Report_GroupA.docx
+++ b/report/ECS7032P_Assignment1_Report_GroupA.docx
@@ -192,7 +192,7 @@
         <w:t>Abstract—</w:t>
       </w:r>
       <w:r>
-        <w:t>In Sushi Go! players pick cards simultaneously from hidden hands that rotate around the table, which basic Monte Carlo tree search (MCTS) does not model. Starting from TAG's BasicMCTS, we added a model of the game's scoring that drives evaluation and rollouts, rollouts that end with the round, max-n backups, decoupled UCT for the simultaneous choices and information-set search. On held-out deals the agent wins 52.6% of 500 three-player games at 100 ms against TAG's ISMCTS and our previous agent (chance 33.3%), 44.4% with four players (chance 25%) and [pending]% at 900 ms. Ablations show that the heuristic and the simultaneous-move tree matter most, that the tree's advantage tends to grow with the time budget, and that four players need different settings.</w:t>
+        <w:t>In Sushi Go!, players pick cards simultaneously from hidden hands that are passed around, which basic Monte Carlo tree search (MCTS) does not model. Starting from BasicMCTS of the Tabletop Games (TAG) framework, we added a scoring model that drives evaluation and rollouts, round-end rollouts, max-n backups, decoupled selection for the simultaneous choices and information-set search. On held-out deals the agent wins 52.6% of 500 three-player games at 100 ms against TAG's information-set MCTS and our previous agent (chance 33.3%), [pending]% at 900 ms and 44.4% with four players (chance 25%). Ablations show that the scoring model and the decoupled information-set tree matter most; the tree's advantage grew with the budget, though not significantly, and four-player settings cost 7.7 percentage points with three players.</w:t>
       </w:r>
     </w:p>
     <w:p>
@@ -222,7 +222,7 @@
         <w:pStyle w:val="BodyText"/>
       </w:pPr>
       <w:r>
-        <w:t xml:space="preserve">Tabletop games combine chance, hidden information and several interacting players within small, well-defined rule sets, which makes them a long-standing test bed for game AI; the Tabletop Games framework (TAG) [1] gives many of them a common interface so that agents can be compared. Monte Carlo tree search (MCTS) [2] is the usual starting point for such agents, but its basic form assumes that the state is fully observed and that players move one after another [3]. </w:t>
+        <w:t xml:space="preserve">Tabletop games combine chance, hidden information and several interacting players within small rule sets; the Tabletop Games framework (TAG) [1] gives many of them a common interface so that agents can be compared. Monte Carlo tree search (MCTS) [2] is the usual starting point for such agents, but its basic form assumes that the state is fully observed and that players move one after another [3]. </w:t>
       </w:r>
       <w:r>
         <w:rPr>
@@ -239,7 +239,7 @@
         <w:pStyle w:val="BodyText"/>
       </w:pPr>
       <w:r>
-        <w:t>Four properties make the game hard for a search agent. (i) The opponents' hands are hidden until they are passed on. (ii) Moves are simultaneous: no card can be chosen in reaction to an opponent's card of the same turn. (iii) Many points are delayed and conditional – sets pay out only when completed, Maki rolls at the end of the round and Pudding at the end of the game – so short simulations miss them and long ones are noisy. (iv) Hands of nine (three players) or eight cards (four players) give up to 729 or 4 096 joint moves per turn, with 0.1–1 s per decision. TAG's BasicMCTS addresses none of the first three: it searches the one shuffled sample of the hidden cards it receives as if it were the true state, treats the players of a turn as moving one after another and evaluates random rollouts by the player's own score.</w:t>
+        <w:t>Four properties make the game hard for a search agent. (i) The opponents' hands are hidden until they are passed on. (ii) Moves are simultaneous: no card can be chosen in reaction to an opponent's card of the same turn. (iii) Many points are delayed and conditional – sets pay out only when completed, Maki rolls at the end of the round and Pudding at the end of the game – so short simulations miss them and long ones are noisy. (iv) Hands of nine (three players) or eight cards (four players) give 729 or 4 096 joint moves per turn (more with Chopsticks), with 0.1–1 s per decision. TAG's BasicMCTS addresses none of the first three: it searches the one shuffled sample of the hidden cards it receives as if it were the true state, treats the players of a turn as moving one after another and evaluates random rollouts by the player's own score.</w:t>
       </w:r>
     </w:p>
     <w:p>
@@ -247,7 +247,7 @@
         <w:pStyle w:val="BodyText"/>
       </w:pPr>
       <w:r>
-        <w:t>We ask which adaptations of MCTS to these properties make an agent stronger (RQ1), and how their value changes with the time per decision (RQ2) and the number of players (RQ3). We extend BasicMCTS in steps, keeping every modification as a switch, and test each in experiments of (mostly) 500 games. Our contributions are:</w:t>
+        <w:t>We ask which adaptations of MCTS to these properties make an agent stronger (RQ1), and how their value changes with the time per decision (RQ2) and the number of players (RQ3). We extend BasicMCTS in steps, keeping every modification as a switch, and test each in experiments of 500 games per condition (250 in some long-budget development runs). Our contributions are:</w:t>
       </w:r>
     </w:p>
     <w:p>
@@ -273,7 +273,7 @@
         <w:ind w:left="576" w:hanging="288"/>
       </w:pPr>
       <w:r>
-        <w:t>a re-implementation on BasicMCTS of round-end rollouts, max-n backups, decoupled UCT and information-set search, combined with this model and compared with TAG's own decoupled information-set MCTS;</w:t>
+        <w:t>its combination on BasicMCTS with round-end rollouts, max-n backups, decoupled UCT and information-set search, compared with TAG's own decoupled information-set MCTS;</w:t>
       </w:r>
     </w:p>
     <w:p>
@@ -286,7 +286,7 @@
         <w:ind w:left="576" w:hanging="288"/>
       </w:pPr>
       <w:r>
-        <w:t>evidence that the best settings differ between three and four players;</w:t>
+        <w:t>evidence that settings tuned for four players hurt with three, and a diagnosis of why extra time helps little with four (a wide, shallow joint-move tree);</w:t>
       </w:r>
     </w:p>
     <w:p>
@@ -299,16 +299,7 @@
         <w:ind w:left="576" w:hanging="288"/>
       </w:pPr>
       <w:r>
-        <w:t>a study of 162 runs (69 350 games) with leave-one-out ablations, a 2</w:t>
-      </w:r>
-      <w:r>
-        <w:rPr>
-          <w:vertAlign w:val="superscript"/>
-        </w:rPr>
-        <w:t>4</w:t>
-      </w:r>
-      <w:r>
-        <w:t xml:space="preserve"> factorial design, validation on held-out deals and negative results that locate the agent's remaining limits.</w:t>
+        <w:t>leave-one-out and factorial ablations, held-out validation and negative results (162 runs, 69 350 games).</w:t>
       </w:r>
     </w:p>
     <w:p>
@@ -438,7 +429,7 @@
         <w:t>N</w:t>
       </w:r>
       <w:r>
-        <w:t xml:space="preserve"> those of its parent. Domain knowledge can enter through heuristic rollout policies [2] or priors such as progressive bias [6]. A stronger rollout policy does not guarantee better estimates, however: Silver and Tesauro [7] showed that rollouts should be balanced, i.e., give unbiased value estimates, rather than be played by a strong policy.</w:t>
+        <w:t xml:space="preserve"> those of its parent. Domain knowledge can enter through heuristic rollout policies or priors such as progressive bias [2]. A stronger rollout policy does not guarantee better estimates, however: Silver and Tesauro [6] showed that rollouts should be balanced, i.e., give unbiased value estimates, rather than be played by a strong policy.</w:t>
       </w:r>
     </w:p>
     <w:p>
@@ -454,7 +445,7 @@
         <w:pStyle w:val="BodyText"/>
       </w:pPr>
       <w:r>
-        <w:t xml:space="preserve">Determinisation, or perfect-information Monte Carlo (PIMC) sampling, samples the hidden information, searches each sample as if it were the true state and combines the results. Long et al. [8] related its success in card games to properties such as how quickly hidden information is revealed during play, which in Sushi Go! happens within </w:t>
+        <w:t xml:space="preserve">Determinisation, or perfect-information Monte Carlo (PIMC) sampling, samples the hidden information, searches each sample as if it were the true state and combines the results. Long et al. [7] related its success in card games to properties such as how quickly hidden information is revealed during play, which in Sushi Go! happens within </w:t>
       </w:r>
       <w:r>
         <w:rPr>
@@ -463,7 +454,7 @@
         <w:t>n</w:t>
       </w:r>
       <w:r>
-        <w:t xml:space="preserve"> − 1 turns. Its known flaws are strategy fusion – the search assumes that it can act differently in states it cannot tell apart – and non-locality [9]. Information-set MCTS (ISMCTS) [3] avoids strategy fusion by searching one tree over the searcher's information sets and sampling the hidden information anew in every iteration; it was developed for card games such as the three-player Dou Di Zhu. In its single-observer form the opponents' choices in the tree are not conditioned on their own private information; the multiple-observer form models it with one tree per player at a higher cost [3], an idea TAG's advanced MCTS agent offers as MultiTree MCTS [10].</w:t>
+        <w:t xml:space="preserve"> − 1 turns. Its known flaws are strategy fusion – the search assumes that it can act differently in states it cannot tell apart – and non-locality [8]. Information-set MCTS (ISMCTS) [3] avoids strategy fusion by searching one tree over the searcher's information sets and sampling the hidden information anew in every iteration. In its single-observer form the opponents' choices in the tree are not conditioned on their own private information; the multiple-observer form models it with one tree per player at a higher cost [3], an idea TAG's advanced MCTS agent offers as MultiTree MCTS [9].</w:t>
       </w:r>
     </w:p>
     <w:p>
@@ -471,7 +462,7 @@
         <w:pStyle w:val="BodyText"/>
       </w:pPr>
       <w:r>
-        <w:t>Simultaneous moves are usually handled by decoupled UCT (DUCT): every player chooses its own action at a node from its own bandit statistics and the joint action leads to a child [11]. UCB-based DUCT need not converge to an equilibrium, so Lanctot et al. [11] compared it with EXP3 and regret-matching selection, and Tak et al. [12] found that the best variant depends on the game; both studies used two-player games such as Goofspiel. In multi-player games, UCT with max-n backups, in which every player maximises its own value, computes a mixed-strategy equilibrium and played as well as or better than earlier multi-player search algorithms in Sturtevant's experiments [13].</w:t>
+        <w:t>Simultaneous moves are usually handled by decoupled UCT (DUCT): every player chooses its own action at a node from its own bandit statistics and the joint action leads to a child [10]. UCB-based DUCT need not converge to an equilibrium, so Lanctot et al. [10] compared it with selection by the EXP3 bandit algorithm and by regret matching, and Tak et al. [11] found that the best variant depends on the game; both studies used two-player games such as Goofspiel. In multi-player games, UCT with max-n backups, in which every player maximises its own value, computes a mixed-strategy equilibrium and played at least as well as earlier algorithms in Sturtevant's experiments [12].</w:t>
       </w:r>
     </w:p>
     <w:p>
@@ -479,7 +470,7 @@
         <w:pStyle w:val="BodyText"/>
       </w:pPr>
       <w:r>
-        <w:t>TAG's advanced MCTS agent already offers information sets, one tree per player and a decoupled option, but the assignment does not allow it as a basis; BasicMCTS has none of these ideas. How they combine with domain knowledge in a multi-player drafting game, what each contributes, and how this depends on the time budget and the number of players has not been studied: the earlier Sushi Go! study [4] predates the version with hidden hands. These are the questions this paper answers.</w:t>
+        <w:t>MCTS has also been applied to the drafting game 7 Wonders, which passes hands in the same way [13]. TAG's advanced MCTS agent already offers information sets, one tree per player and a decoupled option; we build on BasicMCTS, which has none of them, so that the contribution of each idea can be measured. How these ideas combine with domain knowledge in a multi-player drafting game, and how their value depends on the time budget and the number of players, has not been measured; the earlier Sushi Go! study in TAG [4] focused on simultaneous action selection and complete information.</w:t>
       </w:r>
     </w:p>
     <w:p>
@@ -504,7 +495,7 @@
         <w:t>players.basicMCTS</w:t>
       </w:r>
       <w:r>
-        <w:t>) and uses no code of TAG's advanced MCTS agent. Every modification is a switch in its parameter class (Table I), so all variants run the same code; Fig. 1 shows one iteration of the final agent. The search techniques come from the literature; our own elements are the card-value model shared by the evaluation and every player's simulation, and its integration with these techniques on BasicMCTS.</w:t>
+        <w:t>) and uses no code of TAG's advanced MCTS agent. Every modification is a switch in its parameter class (Table I). We compare the final agent (v4) with two earlier versions, v2 (H, A, B, D) and v3 (H, B, D, P, R, M), whose tree treats the players of a turn as moving in sequence (Fig. 1). The search techniques come from the literature; our own element is the card-value model shared by the evaluation and every player's simulation.</w:t>
       </w:r>
     </w:p>
     <w:p>
@@ -642,7 +633,7 @@
               <w:jc w:val="left"/>
             </w:pPr>
             <w:r>
-              <w:t>heuristic (2)–(3) from the card-value model (1)</w:t>
+              <w:t>heuristic (2)–(3) from model (1)</w:t>
             </w:r>
           </w:p>
         </w:tc>
@@ -890,7 +881,7 @@
               <w:jc w:val="left"/>
             </w:pPr>
             <w:r>
-              <w:t>max-n backups [13]</w:t>
+              <w:t>max-n backups [12]</w:t>
             </w:r>
           </w:p>
         </w:tc>
@@ -952,7 +943,7 @@
               <w:jc w:val="left"/>
             </w:pPr>
             <w:r>
-              <w:t>decoupled UCT, one node per turn [11]</w:t>
+              <w:t>decoupled UCT, one node per turn [10]</w:t>
             </w:r>
           </w:p>
         </w:tc>
@@ -1076,7 +1067,7 @@
               <w:jc w:val="left"/>
             </w:pPr>
             <w:r>
-              <w:t xml:space="preserve">card-model constants tuned for 4 players </w:t>
+              <w:t xml:space="preserve">four-player card constants </w:t>
             </w:r>
             <w:r>
               <w:rPr>
@@ -1280,7 +1271,7 @@
               <w:jc w:val="left"/>
             </w:pPr>
             <w:r>
-              <w:t>progressive bias [6]</w:t>
+              <w:t>progressive bias [2]</w:t>
             </w:r>
           </w:p>
         </w:tc>
@@ -1339,7 +1330,7 @@
               <w:jc w:val="left"/>
             </w:pPr>
             <w:r>
-              <w:t>ensemble of up to 4 determinised trees [8]</w:t>
+              <w:t>ensemble of up to 4 determinised trees [7]</w:t>
             </w:r>
           </w:p>
         </w:tc>
@@ -1381,7 +1372,7 @@
         <w:rPr>
           <w:sz w:val="14"/>
         </w:rPr>
-        <w:t xml:space="preserve"> σ 15, </w:t>
+        <w:t xml:space="preserve"> (σ, </w:t>
       </w:r>
       <w:r>
         <w:rPr>
@@ -1394,7 +1385,7 @@
         <w:rPr>
           <w:sz w:val="14"/>
         </w:rPr>
-        <w:t xml:space="preserve"> 0.7, α 0.5, </w:t>
+        <w:t xml:space="preserve">, α, </w:t>
       </w:r>
       <w:r>
         <w:rPr>
@@ -1407,7 +1398,60 @@
         <w:rPr>
           <w:sz w:val="14"/>
         </w:rPr>
-        <w:t xml:space="preserve"> 6; Sashimi discount 0.5; Maki horizon 3 with 0.25 per icon; next-Dumpling weight 1.5; Pudding factor 1.25; average Nigiri 3; 3 cards per missing card left in the hands. </w:t>
+        <w:t xml:space="preserve">, β, </w:t>
+      </w:r>
+      <w:r>
+        <w:rPr>
+          <w:i/>
+          <w:sz w:val="14"/>
+        </w:rPr>
+        <w:t>T</w:t>
+      </w:r>
+      <w:r>
+        <w:rPr>
+          <w:sz w:val="14"/>
+          <w:vertAlign w:val="subscript"/>
+        </w:rPr>
+        <w:t>m</w:t>
+      </w:r>
+      <w:r>
+        <w:rPr>
+          <w:sz w:val="14"/>
+        </w:rPr>
+        <w:t xml:space="preserve">, κ, δ, π, ν, γ) = (15, 0.7, 0.5, 6, 0.5, 3, 0.25, 1.5, 1.25, 3, 3), default (15, 0.7, 0.5, 4, 1, 0, 0, 0, 1, 2, 0): β scales a Sashimi triple still needing two cards; the Maki standing gets weight 1/(1 + </w:t>
+      </w:r>
+      <w:r>
+        <w:rPr>
+          <w:i/>
+          <w:sz w:val="14"/>
+        </w:rPr>
+        <w:t>r</w:t>
+      </w:r>
+      <w:r>
+        <w:rPr>
+          <w:sz w:val="14"/>
+        </w:rPr>
+        <w:t>/</w:t>
+      </w:r>
+      <w:r>
+        <w:rPr>
+          <w:i/>
+          <w:sz w:val="14"/>
+        </w:rPr>
+        <w:t>T</w:t>
+      </w:r>
+      <w:r>
+        <w:rPr>
+          <w:sz w:val="14"/>
+          <w:vertAlign w:val="subscript"/>
+        </w:rPr>
+        <w:t>m</w:t>
+      </w:r>
+      <w:r>
+        <w:rPr>
+          <w:sz w:val="14"/>
+        </w:rPr>
+        <w:t xml:space="preserve">), κ points per icon the rest; δ adds the next Dumpling's points; π scales the Pudding standing; a set is likely only if γ cards per missing card remain in the hands. </w:t>
       </w:r>
       <w:r>
         <w:rPr>
@@ -1420,7 +1464,7 @@
         <w:rPr>
           <w:sz w:val="14"/>
         </w:rPr>
-        <w:t xml:space="preserve"> at 500 ms or more per decision.</w:t>
+        <w:t xml:space="preserve"> at 500 ms or more.</w:t>
       </w:r>
     </w:p>
     <w:p>
@@ -1432,7 +1476,7 @@
       <w:r>
         <w:drawing>
           <wp:inline xmlns:a="http://schemas.openxmlformats.org/drawingml/2006/main" xmlns:pic="http://schemas.openxmlformats.org/drawingml/2006/picture">
-            <wp:extent cx="3099816" cy="1517904"/>
+            <wp:extent cx="3099816" cy="1645920"/>
             <wp:docPr id="1" name="Picture 1"/>
             <wp:cNvGraphicFramePr>
               <a:graphicFrameLocks noChangeAspect="1"/>
@@ -1441,7 +1485,7 @@
               <a:graphicData uri="http://schemas.openxmlformats.org/drawingml/2006/picture">
                 <pic:pic>
                   <pic:nvPicPr>
-                    <pic:cNvPr id="0" name="fig1_iteration.png"/>
+                    <pic:cNvPr id="0" name="fig1_turnnode.png"/>
                     <pic:cNvPicPr/>
                   </pic:nvPicPr>
                   <pic:blipFill>
@@ -1453,7 +1497,7 @@
                   <pic:spPr>
                     <a:xfrm>
                       <a:off x="0" y="0"/>
-                      <a:ext cx="3099816" cy="1517904"/>
+                      <a:ext cx="3099816" cy="1645920"/>
                     </a:xfrm>
                     <a:prstGeom prst="rect"/>
                   </pic:spPr>
@@ -1467,9 +1511,10 @@
     <w:p>
       <w:pPr>
         <w:pStyle w:val="figurecaption"/>
-      </w:pPr>
-      <w:r>
-        <w:t>One iteration of the final agent. The letters refer to Table I; after the time budget the agent plays its most visited card at the root.</w:t>
+        <w:keepLines/>
+      </w:pPr>
+      <w:r>
+        <w:t>The turn node of the final agent (right) and the sequential tree of v3 (left). The final agent re-samples the cards it cannot see in every iteration (I), lets every player pick by UCB on its own card statistics (S, P), plays the joint pick, rolls out with card-value policies until the round is scored (B, R) and backs every player's value (H) up to the card it chose (M); after the time budget it plays its most visited root card.</w:t>
       </w:r>
     </w:p>
     <w:p>
@@ -1684,7 +1729,7 @@
         <w:t>p</w:t>
       </w:r>
       <w:r>
-        <w:t xml:space="preserve"> the value of unfinished sets, each weighted by a completion factor min(1, (</w:t>
+        <w:t xml:space="preserve"> the value of unfinished sets, of each unused Wasabi (2ν for the Nigiri it can still triple, ν = 2) and of Chopsticks (1), each weighted by a completion factor min(1, (</w:t>
       </w:r>
       <w:r>
         <w:rPr>
@@ -1729,7 +1774,7 @@
         <w:t>m</w:t>
       </w:r>
       <w:r>
-        <w:t xml:space="preserve">) for a set that needs </w:t>
+        <w:t xml:space="preserve">) when </w:t>
       </w:r>
       <w:r>
         <w:rPr>
@@ -1738,7 +1783,7 @@
         <w:t>m</w:t>
       </w:r>
       <w:r>
-        <w:t xml:space="preserve"> more cards with </w:t>
+        <w:t xml:space="preserve"> more cards are needed with </w:t>
       </w:r>
       <w:r>
         <w:rPr>
@@ -2204,7 +2249,7 @@
         <w:t>mv</w:t>
       </w:r>
       <w:r>
-        <w:t xml:space="preserve">, or a random card with probability ε = 0.2 (with Chopsticks, the second card is the best remaining one); the same policy models the opponents. </w:t>
+        <w:t xml:space="preserve">, or a random card with probability ε = 0.2 (with Chopsticks, the second card is chosen in the same way); the same policy models the opponents. </w:t>
       </w:r>
       <w:r>
         <w:rPr>
@@ -2244,7 +2289,7 @@
         <w:t>M:</w:t>
       </w:r>
       <w:r>
-        <w:t xml:space="preserve"> a node stores one value per player and every player maximises its own value [13]. </w:t>
+        <w:t xml:space="preserve"> a node stores one value per player and every player maximises its own value [12]. </w:t>
       </w:r>
       <w:r>
         <w:rPr>
@@ -2443,7 +2488,7 @@
         <w:pStyle w:val="BodyText"/>
       </w:pPr>
       <w:r>
-        <w:t xml:space="preserve">from its own statistics, trying untried cards first; the joint choice is played in the forward model and leads to the child of that joint action [11]. In v3 the players of a turn appeared one after another in the tree, so a later player “saw” the card an earlier player had just chosen, which is impossible in the real game. </w:t>
+        <w:t xml:space="preserve">from its own statistics, trying untried cards first; the joint choice is played in the forward model and leads to the child of that joint action [10]; in v3's tree a later player “saw” the card an earlier player had just chosen (Fig. 1). </w:t>
       </w:r>
       <w:r>
         <w:rPr>
@@ -2563,7 +2608,7 @@
         <w:pStyle w:val="BodyText"/>
       </w:pPr>
       <w:r>
-        <w:t xml:space="preserve">With four players the agent switches parameters (Section IV-D). It uses the card constants X0 (Table I), found by a search-free coordinate tuner that plays greedy card-value policies against each other. From 500 ms it also uses </w:t>
+        <w:t xml:space="preserve">With four players the agent switches parameters. It uses the card constants X0 (Table I), found by a search-free coordinate tuner that plays greedy card-value policies against each other. From 500 ms it also uses </w:t>
       </w:r>
       <w:r>
         <w:rPr>
@@ -2690,7 +2735,7 @@
         <w:t>K</w:t>
       </w:r>
       <w:r>
-        <w:t xml:space="preserve"> = 1. At 500 ms this gives 36 806 iterations of 8 rollouts per decision against 10 170 single-rollout iterations without F and L.</w:t>
+        <w:t xml:space="preserve"> = 1. The competition files use this agent with 900 ms (1 s limit) and 430 ms (500 ms limit) of CPU time and wall-clock guards.</w:t>
       </w:r>
     </w:p>
     <w:p>
@@ -2856,7 +2901,7 @@
               <w:jc w:val="left"/>
             </w:pPr>
             <w:r>
-              <w:t xml:space="preserve">v2 (frozen copy of our previous agent): H, progressive bias, B, D, </w:t>
+              <w:t xml:space="preserve">v2: our previous agent (H, A, B, D, </w:t>
             </w:r>
             <w:r>
               <w:rPr>
@@ -2865,7 +2910,7 @@
               <w:t>K</w:t>
             </w:r>
             <w:r>
-              <w:t xml:space="preserve"> 1.41. TAG ISMCTS: TAG's SushiGo_3+P_HiBudget configuration, set for 400 ms and run at our budget (information sets, one tree per player [10], UCB-Tuned, </w:t>
+              <w:t xml:space="preserve"> 1.41). TAG ISMCTS: TAG's SushiGo_3+P_HiBudget file (set for 400 ms) at our budget: one tree per player [9], UCB-Tuned, </w:t>
             </w:r>
             <w:r>
               <w:rPr>
@@ -2874,7 +2919,7 @@
               <w:t>K</w:t>
             </w:r>
             <w:r>
-              <w:t xml:space="preserve"> 1, random rollouts to the game end, score heuristic). TAG DUCT: TAG's SushiGoDUCT configuration (decoupled UCT, </w:t>
+              <w:t xml:space="preserve"> 1, random rollouts to the end, score heuristic. TAG DUCT: TAG's SushiGoDUCT file: decoupled UCT, </w:t>
             </w:r>
             <w:r>
               <w:rPr>
@@ -2883,7 +2928,7 @@
               <w:t>K</w:t>
             </w:r>
             <w:r>
-              <w:t xml:space="preserve"> 1, information sets, lead heuristic, 30-move rollouts). BasicMCTS (</w:t>
+              <w:t xml:space="preserve"> 1, information sets, lead heuristic, 30-move rollouts. BasicMCTS (</w:t>
             </w:r>
             <w:r>
               <w:rPr>
@@ -2892,7 +2937,7 @@
               <w:t>K</w:t>
             </w:r>
             <w:r>
-              <w:t xml:space="preserve"> 1.41, 10-move random rollouts), Rolling Horizon Evolutionary Algorithm (RHEA; horizon 10, population 10), One-Step Look-Ahead (OSLA, score heuristic)</w:t>
+              <w:t xml:space="preserve"> 1.41, 10-move rollouts), Rolling Horizon Evolutionary Algorithm (RHEA; horizon 10, population 10), One-Step Look-Ahead (OSLA, score heuristic)</w:t>
             </w:r>
           </w:p>
         </w:tc>
@@ -3075,7 +3120,7 @@
               <w:t>g</w:t>
             </w:r>
             <w:r>
-              <w:t xml:space="preserve">; since v4 a fixed deck order is shuffled with it, so equal </w:t>
+              <w:t xml:space="preserve">; since v4 a fixed deck order is shuffled with it (equal </w:t>
             </w:r>
             <w:r>
               <w:rPr>
@@ -3084,7 +3129,7 @@
               <w:t>s</w:t>
             </w:r>
             <w:r>
-              <w:t xml:space="preserve"> gives equal deals (paired runs); earlier runs used TAG's own deal, which differs between runs (independent samples)</w:t>
+              <w:t>, equal deals: paired runs); earlier runs used TAG's own deal (independent samples)</w:t>
             </w:r>
           </w:p>
         </w:tc>
@@ -3197,7 +3242,7 @@
               <w:jc w:val="left"/>
             </w:pPr>
             <w:r>
-              <w:t>500 per condition; 250 at 900 ms, in 4-player 500 ms development and in the 500/900 ms validation (48–73 s of CPU time per game); 300 in one run</w:t>
+              <w:t>500 per condition; 250 in development runs at 900 ms and with four players at 500 ms (48–73 s of CPU time per game)</w:t>
             </w:r>
           </w:p>
         </w:tc>
@@ -3278,7 +3323,7 @@
               <w:jc w:val="left"/>
             </w:pPr>
             <w:r>
-              <w:t>agent files, per-game results and scripts of every run are kept with our code (experiments_v3 to experiments_v5)</w:t>
+              <w:t>agent files, per-game results and scripts of every run: available from the authors</w:t>
             </w:r>
           </w:p>
         </w:tc>
@@ -3289,7 +3334,7 @@
         <w:pStyle w:val="BodyText"/>
       </w:pPr>
       <w:r>
-        <w:t>Each game is an independent trial whose outcome for our agent is 1 for a win, 1/</w:t>
+        <w:t>Table II summarises the setup. Each game is an independent trial whose outcome for our agent is 1 for a win, 1/</w:t>
       </w:r>
       <w:r>
         <w:rPr>
@@ -3316,7 +3361,7 @@
         <w:t>z</w:t>
       </w:r>
       <w:r>
-        <w:t xml:space="preserve"> = difference/SE, in percentage points (pp) for win rates. With 500 games a win rate near 50% has a 95% interval of ±4.4 pp, and a difference between two runs about ±5.7 pp even when paired, because the outcomes of two agents on the same deal correlate only weakly (0.0–0.15); the score margin is about twice as sensitive and served to screen ideas. We report unadjusted intervals and state where a conclusion survives a Holm correction. We expected (H1) every component to improve both measures, (H2) the decoupled information-set tree to matter more at longer budgets and (H3) the best settings to depend on the number of players.</w:t>
+        <w:t xml:space="preserve"> = difference/SE, in percentage points (pp) for win rates. With 500 games a win rate near 50% has a 95% interval of ±4.4 pp, and a difference between two runs about ±5.7 pp even when paired, because the outcomes of two agents on the same deal correlate only weakly (0.0–0.2); the score margin, about twice as sensitive, served to screen ideas. We report unadjusted intervals and state where a conclusion survives a Holm correction. We expected (H1) every component to improve both measures, (H2) the decoupled information-set tree to matter more at longer budgets and (H3) the best settings to depend on the number of players.</w:t>
       </w:r>
     </w:p>
     <w:p>
@@ -3332,161 +3377,7 @@
         <w:pStyle w:val="Heading2"/>
       </w:pPr>
       <w:r>
-        <w:t>Development from v2 to v4 (RQ1, RQ2)</w:t>
-      </w:r>
-    </w:p>
-    <w:p>
-      <w:pPr>
-        <w:pStyle w:val="BodyText"/>
-      </w:pPr>
-      <w:r>
-        <w:t xml:space="preserve">Fig. 2 traces the development with three players (independent samples). Removing progressive bias from v2 and adding P, R, M and </w:t>
-      </w:r>
-      <w:r>
-        <w:rPr>
-          <w:i/>
-        </w:rPr>
-        <w:t>K</w:t>
-      </w:r>
-      <w:r>
-        <w:t xml:space="preserve"> = 0.5 doubled the win rate at 100 ms (24.8% → 50.1%, +25.3 ± 5.8 pp). In a 2</w:t>
-      </w:r>
-      <w:r>
-        <w:rPr>
-          <w:vertAlign w:val="superscript"/>
-        </w:rPr>
-        <w:t>4</w:t>
-      </w:r>
-      <w:r>
-        <w:t xml:space="preserve"> factorial design on top of H + B + D + P (16 cells × 500 games) the main effects were +8.7 ± 2.1 pp for R (</w:t>
-      </w:r>
-      <w:r>
-        <w:rPr>
-          <w:i/>
-        </w:rPr>
-        <w:t>z</w:t>
-      </w:r>
-      <w:r>
-        <w:t xml:space="preserve"> = 8.1), +5.2 ± 2.2 for </w:t>
-      </w:r>
-      <w:r>
-        <w:rPr>
-          <w:i/>
-        </w:rPr>
-        <w:t>K</w:t>
-      </w:r>
-      <w:r>
-        <w:t xml:space="preserve"> = 0.5 instead of 1.41, +4.1 ± 2.0 for M and +3.6 ± 2.0 for a completion horizon </w:t>
-      </w:r>
-      <w:r>
-        <w:rPr>
-          <w:i/>
-        </w:rPr>
-        <w:t>T</w:t>
-      </w:r>
-      <w:r>
-        <w:t xml:space="preserve"> = 8; max-n backups needed less exploration (M × </w:t>
-      </w:r>
-      <w:r>
-        <w:rPr>
-          <w:i/>
-        </w:rPr>
-        <w:t>K</w:t>
-      </w:r>
-      <w:r>
-        <w:t xml:space="preserve"> +3.2 ± 2.2), and </w:t>
-      </w:r>
-      <w:r>
-        <w:rPr>
-          <w:i/>
-        </w:rPr>
-        <w:t>T</w:t>
-      </w:r>
-      <w:r>
-        <w:t xml:space="preserve"> = 8 was dropped because it overlaps with R (R × </w:t>
-      </w:r>
-      <w:r>
-        <w:rPr>
-          <w:i/>
-        </w:rPr>
-        <w:t>T</w:t>
-      </w:r>
-      <w:r>
-        <w:t xml:space="preserve"> −4.2 ± 2.1). Progressive bias no longer helped once informed rollouts were present (−1.2 ± 4.3 pp), and making the opponents in the tree follow the greedy card-value policy cost 16.9 ± 5.8 pp.</w:t>
-      </w:r>
-    </w:p>
-    <w:p>
-      <w:pPr>
-        <w:keepNext/>
-        <w:spacing w:before="120"/>
-        <w:jc w:val="center"/>
-      </w:pPr>
-      <w:r>
-        <w:drawing>
-          <wp:inline xmlns:a="http://schemas.openxmlformats.org/drawingml/2006/main" xmlns:pic="http://schemas.openxmlformats.org/drawingml/2006/picture">
-            <wp:extent cx="3099816" cy="1691640"/>
-            <wp:docPr id="2" name="Picture 2"/>
-            <wp:cNvGraphicFramePr>
-              <a:graphicFrameLocks noChangeAspect="1"/>
-            </wp:cNvGraphicFramePr>
-            <a:graphic>
-              <a:graphicData uri="http://schemas.openxmlformats.org/drawingml/2006/picture">
-                <pic:pic>
-                  <pic:nvPicPr>
-                    <pic:cNvPr id="0" name="fig2_budget.png"/>
-                    <pic:cNvPicPr/>
-                  </pic:nvPicPr>
-                  <pic:blipFill>
-                    <a:blip r:embed="rId11"/>
-                    <a:stretch>
-                      <a:fillRect/>
-                    </a:stretch>
-                  </pic:blipFill>
-                  <pic:spPr>
-                    <a:xfrm>
-                      <a:off x="0" y="0"/>
-                      <a:ext cx="3099816" cy="1691640"/>
-                    </a:xfrm>
-                    <a:prstGeom prst="rect"/>
-                  </pic:spPr>
-                </pic:pic>
-              </a:graphicData>
-            </a:graphic>
-          </wp:inline>
-        </w:drawing>
-      </w:r>
-    </w:p>
-    <w:p>
-      <w:pPr>
-        <w:pStyle w:val="figurecaption"/>
-      </w:pPr>
-      <w:r>
-        <w:t>Win rate with three players against v2 and TAG's ISMCTS by CPU time per decision. Lines: development runs (seed 1, independent samples; v2 = H + A + B + D, v3 = H + B + D + P + R + M, v4 = v3 + S + I − D). Open circles: the final agent on held-out deals. Bars: Wilson 95% intervals.</w:t>
-      </w:r>
-    </w:p>
-    <w:p>
-      <w:pPr>
-        <w:pStyle w:val="BodyText"/>
-      </w:pPr>
-      <w:r>
-        <w:t xml:space="preserve">With longer budgets v3 lost 17.3 ± 7.3 pp from 100 to 900 ms but v4 only 8.1 ± 7.6 pp, so the gain from S and I rose from +5.6 ± 6.2 to +14.8 ± 8.5 pp; the rise (+9.2 ± 10.5 pp, </w:t>
-      </w:r>
-      <w:r>
-        <w:rPr>
-          <w:i/>
-        </w:rPr>
-        <w:t>z</w:t>
-      </w:r>
-      <w:r>
-        <w:t xml:space="preserve"> = 1.7) agrees with H2 but is not significant. S alone added +1.3 pp to v3 at 100 ms and +6.2 pp at 500 ms, so the decoupled tree carries most of the budget dependence. We attribute this to v3's sequential tree, in which later players react to cards chosen earlier in the same turn: a wrong model that more iterations exploit more. It is not a lack of search: at 900 ms v3 ran 19 696 iterations per decision, v4 21 246. Part of every agent's decline comes from the opponents: the TAG ISMCTS seats won 27.7% of v4's validation games at 100 ms but 35.1% at 500 ms.</w:t>
-      </w:r>
-    </w:p>
-    <w:p>
-      <w:pPr>
-        <w:pStyle w:val="Heading2"/>
-      </w:pPr>
-      <w:r>
-        <w:t>Final Agent on Held-Out Deals (RQ1)</w:t>
+        <w:t>Final Agent (RQ1)</w:t>
       </w:r>
     </w:p>
     <w:p>
@@ -3495,7 +3386,7 @@
         <w:keepNext/>
       </w:pPr>
       <w:r>
-        <w:t>Final agent on held-out deals</w:t>
+        <w:t>Final agent on held-out deals and against other agents</w:t>
       </w:r>
     </w:p>
     <w:tbl>
@@ -3792,7 +3683,7 @@
               <w:jc w:val="center"/>
             </w:pPr>
             <w:r>
-              <w:t>250</w:t>
+              <w:t>500</w:t>
             </w:r>
           </w:p>
         </w:tc>
@@ -3892,7 +3783,7 @@
               <w:jc w:val="center"/>
             </w:pPr>
             <w:r>
-              <w:t>250</w:t>
+              <w:t>500</w:t>
             </w:r>
           </w:p>
         </w:tc>
@@ -4092,7 +3983,7 @@
               <w:jc w:val="center"/>
             </w:pPr>
             <w:r>
-              <w:t>250</w:t>
+              <w:t>500</w:t>
             </w:r>
           </w:p>
         </w:tc>
@@ -4561,7 +4452,7 @@
         <w:rPr>
           <w:sz w:val="14"/>
         </w:rPr>
-        <w:t xml:space="preserve">Setting: players / ms per decision. Seed block 100 000 except </w:t>
+        <w:t xml:space="preserve">Setting: players / ms per decision. Held-out seed block 100 000, except </w:t>
       </w:r>
       <w:r>
         <w:rPr>
@@ -4582,7 +4473,7 @@
         <w:pStyle w:val="BodyText"/>
       </w:pPr>
       <w:r>
-        <w:t>Table III reports the final agent on held-out deals. Against v2 and TAG's ISMCTS it wins 52.6% at 100 ms with three players, and 44.4% at 100 ms with four. On seed block 7, which overlaps the development deals, it had won 55.0% at 100 ms (−2.4 ± 6.2 pp), so we see no sign that the development overfitted its deals. TAG's DUCT agent, which has decoupled selection and information sets but neither our card-value model nor round-end rollouts, wins only 21.0% of its seats when it replaces v2 (ISMCTS 24.0%, our agent 55.0%). BasicMCTS, RHEA and OSLA win at most 12.8% of their seats; OSLA wins none, as cards are revealed only when all players have chosen, so its look-ahead rarely sees a change of score.</w:t>
+        <w:t>Table III reports the final agent. On the held-out deals it wins 52.6%, [pending] and [pending] of three-player games at 100, 500 and 900 ms against v2 and TAG's ISMCTS, and 44.4% and [pending] of four-player games at 100 and 500 ms. On seed block 7, whose deals overlap the development deals, it had won 55.0% at 100 ms (58.1% when re-run on the same machine), 2.4 ± 6.1 pp and 5.5 ± 6.1 pp more; neither difference is significant. TAG's DUCT agent, with decoupled selection and information sets but neither our card-value model nor round-end rollouts, wins only 21.0% of its seats when it replaces v2. BasicMCTS, RHEA and OSLA win at most 12.8% of their seats; OSLA wins none, as its copy of the state hides the other players' choices, so its look-ahead never reveals a card.</w:t>
       </w:r>
     </w:p>
     <w:p>
@@ -4602,8 +4493,8 @@
       <w:r>
         <w:drawing>
           <wp:inline xmlns:a="http://schemas.openxmlformats.org/drawingml/2006/main" xmlns:pic="http://schemas.openxmlformats.org/drawingml/2006/picture">
-            <wp:extent cx="3099816" cy="2331720"/>
-            <wp:docPr id="3" name="Picture 3"/>
+            <wp:extent cx="3099816" cy="2240280"/>
+            <wp:docPr id="2" name="Picture 2"/>
             <wp:cNvGraphicFramePr>
               <a:graphicFrameLocks noChangeAspect="1"/>
             </wp:cNvGraphicFramePr>
@@ -4615,6 +4506,179 @@
                     <pic:cNvPicPr/>
                   </pic:nvPicPr>
                   <pic:blipFill>
+                    <a:blip r:embed="rId11"/>
+                    <a:stretch>
+                      <a:fillRect/>
+                    </a:stretch>
+                  </pic:blipFill>
+                  <pic:spPr>
+                    <a:xfrm>
+                      <a:off x="0" y="0"/>
+                      <a:ext cx="3099816" cy="2240280"/>
+                    </a:xfrm>
+                    <a:prstGeom prst="rect"/>
+                  </pic:spPr>
+                </pic:pic>
+              </a:graphicData>
+            </a:graphic>
+          </wp:inline>
+        </w:drawing>
+      </w:r>
+    </w:p>
+    <w:p>
+      <w:pPr>
+        <w:pStyle w:val="figurecaption"/>
+        <w:keepLines/>
+      </w:pPr>
+      <w:r>
+        <w:t>Paired effects with three players at 100 ms (seed 7, 500 games each), ± 95% CI. Top: one component removed from the final agent (base: final agent, 55.0%). Bottom: the lead-heuristic ablation and the changes of our last study, against a re-run of the final agent on the 4-core machine (58.1%).</w:t>
+      </w:r>
+    </w:p>
+    <w:p>
+      <w:pPr>
+        <w:pStyle w:val="BodyText"/>
+      </w:pPr>
+      <w:r>
+        <w:t xml:space="preserve">Fig. 3 (top) removes one component at a time from the final agent. Every removal lowers both measures; on the score margin all five differences survive a Holm correction, on the win rate only those of H and of S + I (−R: </w:t>
+      </w:r>
+      <w:r>
+        <w:rPr>
+          <w:i/>
+        </w:rPr>
+        <w:t>z</w:t>
+      </w:r>
+      <w:r>
+        <w:t xml:space="preserve"> = 2.0, −B: 1.4, −I: 1.3), so H1 holds for the margin and only partly for wins. Without H the leaves are valued by TAG's default heuristic, the own score divided by 50, which ignores the opponents' scores and the Pudding standing and does not match the scale of </w:t>
+      </w:r>
+      <w:r>
+        <w:rPr>
+          <w:i/>
+        </w:rPr>
+        <w:t>K</w:t>
+      </w:r>
+      <w:r>
+        <w:t xml:space="preserve">: this costs 28.3 ± 5.8 pp. TAG's lead heuristic (own score minus the best opponent's, </w:t>
+      </w:r>
+      <w:r>
+        <w:rPr>
+          <w:i/>
+        </w:rPr>
+        <w:t>K</w:t>
+      </w:r>
+      <w:r>
+        <w:t xml:space="preserve"> rescaled to 7.5) in place of H costs 13.6 ± 5.9 pp (</w:t>
+      </w:r>
+      <w:r>
+        <w:rPr>
+          <w:i/>
+        </w:rPr>
+        <w:t>z</w:t>
+      </w:r>
+      <w:r>
+        <w:t xml:space="preserve"> = 4.5): valuing the lead recovers about half of H's effect; the rest (Pudding standing, mean-opponent term, bounded scale) was not separated. S and I together are worth 10.2 ± 5.7 pp (</w:t>
+      </w:r>
+      <w:r>
+        <w:rPr>
+          <w:i/>
+        </w:rPr>
+        <w:t>z</w:t>
+      </w:r>
+      <w:r>
+        <w:t xml:space="preserve"> = 3.5) but I alone only 3.8 ± 5.7 pp, as Long et al.'s analysis [7] suggests for a game that reveals its hidden information within </w:t>
+      </w:r>
+      <w:r>
+        <w:rPr>
+          <w:i/>
+        </w:rPr>
+        <w:t>n</w:t>
+      </w:r>
+      <w:r>
+        <w:t xml:space="preserve"> − 1 turns. P and M cannot be removed (decoupled selection needs one value per player; I's card-type statistics merge identical cards), but a 2</w:t>
+      </w:r>
+      <w:r>
+        <w:rPr>
+          <w:vertAlign w:val="superscript"/>
+        </w:rPr>
+        <w:t>4</w:t>
+      </w:r>
+      <w:r>
+        <w:t xml:space="preserve"> factorial on v3's components (16 × 500 games) gave main effects of +8.7 ± 2.1 pp for R (</w:t>
+      </w:r>
+      <w:r>
+        <w:rPr>
+          <w:i/>
+        </w:rPr>
+        <w:t>z</w:t>
+      </w:r>
+      <w:r>
+        <w:t xml:space="preserve"> = 8.1), +5.2 ± 2.2 for </w:t>
+      </w:r>
+      <w:r>
+        <w:rPr>
+          <w:i/>
+        </w:rPr>
+        <w:t>K</w:t>
+      </w:r>
+      <w:r>
+        <w:t xml:space="preserve"> = 0.5 instead of 1.41 and +4.1 ± 2.0 for M, with an M × </w:t>
+      </w:r>
+      <w:r>
+        <w:rPr>
+          <w:i/>
+        </w:rPr>
+        <w:t>K</w:t>
+      </w:r>
+      <w:r>
+        <w:t xml:space="preserve"> interaction of +3.2 ± 2.2: max-n backups need less exploration. Adding progressive bias back to v3 did not help (−1.2 ± 4.3 pp).</w:t>
+      </w:r>
+    </w:p>
+    <w:p>
+      <w:pPr>
+        <w:pStyle w:val="BodyText"/>
+      </w:pPr>
+      <w:r>
+        <w:t>The changes of our last study did not help (Fig. 3, bottom). Card constants tuned for three players (X3) make a far stronger greedy policy – they win 45.0% of greedy games against two X0 players, whereas the final agent's own constants win 7.3% in a pool of their own and X0 players – yet did not strengthen the search (−1.3 ± 5.8 pp), consistent with simulation balancing [6]. Denial (simulated players also value taking the next player's best card), a win-gap value and a leader-only value did not change the win rate either (−1.8, −0.6, +0.7 pp), and rollouts to the game end with a win-gap value cost 23.7 ± 5.8 pp (</w:t>
+      </w:r>
+      <w:r>
+        <w:rPr>
+          <w:i/>
+        </w:rPr>
+        <w:t>z</w:t>
+      </w:r>
+      <w:r>
+        <w:t xml:space="preserve"> = 8.0).</w:t>
+      </w:r>
+    </w:p>
+    <w:p>
+      <w:pPr>
+        <w:pStyle w:val="Heading2"/>
+      </w:pPr>
+      <w:r>
+        <w:t>Time Budget (RQ2)</w:t>
+      </w:r>
+    </w:p>
+    <w:p>
+      <w:pPr>
+        <w:keepNext/>
+        <w:spacing w:before="120"/>
+        <w:jc w:val="center"/>
+      </w:pPr>
+      <w:r>
+        <w:drawing>
+          <wp:inline xmlns:a="http://schemas.openxmlformats.org/drawingml/2006/main" xmlns:pic="http://schemas.openxmlformats.org/drawingml/2006/picture">
+            <wp:extent cx="3099816" cy="1737360"/>
+            <wp:docPr id="3" name="Picture 3"/>
+            <wp:cNvGraphicFramePr>
+              <a:graphicFrameLocks noChangeAspect="1"/>
+            </wp:cNvGraphicFramePr>
+            <a:graphic>
+              <a:graphicData uri="http://schemas.openxmlformats.org/drawingml/2006/picture">
+                <pic:pic>
+                  <pic:nvPicPr>
+                    <pic:cNvPr id="0" name="fig2_budget.png"/>
+                    <pic:cNvPicPr/>
+                  </pic:nvPicPr>
+                  <pic:blipFill>
                     <a:blip r:embed="rId12"/>
                     <a:stretch>
                       <a:fillRect/>
@@ -4623,7 +4687,7 @@
                   <pic:spPr>
                     <a:xfrm>
                       <a:off x="0" y="0"/>
-                      <a:ext cx="3099816" cy="2331720"/>
+                      <a:ext cx="3099816" cy="1737360"/>
                     </a:xfrm>
                     <a:prstGeom prst="rect"/>
                   </pic:spPr>
@@ -4637,9 +4701,10 @@
     <w:p>
       <w:pPr>
         <w:pStyle w:val="figurecaption"/>
-      </w:pPr>
-      <w:r>
-        <w:t>Paired effects with three players at 100 ms (seed 7, 500 games each), ± 95% CI. Top: one component removed from the final agent (base: final agent, 55.0%). Bottom: the lead-heuristic ablation and the changes of our last study, against a re-run of the final agent on the 4-core machine (58.1%).</w:t>
+        <w:keepLines/>
+      </w:pPr>
+      <w:r>
+        <w:t>Win rate with three players against v2 and TAG's ISMCTS by CPU time per decision. Lines: development runs (seed 1, independent samples). Open markers: the final agent and v3 on the held-out deals (seed block 100 000). Bars: Wilson 95% intervals.</w:t>
       </w:r>
     </w:p>
     <w:p>
@@ -4647,7 +4712,7 @@
         <w:pStyle w:val="BodyText"/>
       </w:pPr>
       <w:r>
-        <w:t xml:space="preserve">Fig. 3 (top) removes one component at a time. Every removal lowers both measures; on the score margin all five differences survive a Holm correction, on the win rate only those of H and of S + I (−R: </w:t>
+        <w:t>In development runs (Fig. 2; independent samples) v3 doubled v2's win rate at 100 ms (24.8% → 50.1%) but lost 17.3 ± 7.2 pp from 100 to 900 ms, the final agent 8.1 ± 7.5 pp; the gain from S and I rose from +5.6 ± 6.1 pp to +14.8 ± 8.4 pp (rise +9.2 ± 10.4 pp (</w:t>
       </w:r>
       <w:r>
         <w:rPr>
@@ -4656,7 +4721,23 @@
         <w:t>z</w:t>
       </w:r>
       <w:r>
-        <w:t xml:space="preserve"> = 2.0, −B: 1.4, −I: 1.3), so H1 holds for the margin and only partly for wins. Without H the leaves are valued by TAG's default heuristic, the own score divided by 50, which ignores the opponents' scores – although only first place wins – and the Pudding standing, and does not match the scale of </w:t>
+        <w:t xml:space="preserve"> = 1.7)). We attribute the gain to v3's sequential tree, in which later players react to cards chosen earlier in the same turn: a wrong model that more iterations exploit more. It is not a lack of search: at 900 ms v3 ran 19 696 iterations per decision, the final agent 21 246. Much of the fall of all curves comes from the opponent: TAG's ISMCTS won 23.1%, 33.1% and 37.4% of the development games against the final agent at 100, 500 and 900 ms (33.0%, 40.0% and 46.0% against v3).</w:t>
+      </w:r>
+    </w:p>
+    <w:p>
+      <w:pPr>
+        <w:pStyle w:val="Heading2"/>
+      </w:pPr>
+      <w:r>
+        <w:t>Four Players and the Limits of Search (RQ3)</w:t>
+      </w:r>
+    </w:p>
+    <w:p>
+      <w:pPr>
+        <w:pStyle w:val="BodyText"/>
+      </w:pPr>
+      <w:r>
+        <w:t xml:space="preserve">With four players the 3-player configuration won 46.4% and 43.5% in two runs at 100 ms and 38.4% at 500 ms (development; chance 25%). The four-player changes gave no significant gain at their own budgets: X0 added +4.3 ± 4.3 pp at 100 ms (two runs of each pooled); at 500 ms X0 with W2 and </w:t>
       </w:r>
       <w:r>
         <w:rPr>
@@ -4665,7 +4746,16 @@
         <w:t>K</w:t>
       </w:r>
       <w:r>
-        <w:t xml:space="preserve">: this costs 28.3 ± 5.8 pp. Replacing H by TAG's lead heuristic (own score minus the best opponent's, </w:t>
+        <w:t xml:space="preserve"> = 1 added +5.8 ± 7.4 pp (two runs pooled) and F + L a further +1.0 ± 7.9 pp, whereas F + L cost 6.6 ± 6.0 pp (</w:t>
+      </w:r>
+      <w:r>
+        <w:rPr>
+          <w:i/>
+        </w:rPr>
+        <w:t>z</w:t>
+      </w:r>
+      <w:r>
+        <w:t xml:space="preserve"> = 2.2) at 100 ms. With three players at 500 ms, X0, W2 and </w:t>
       </w:r>
       <w:r>
         <w:rPr>
@@ -4674,7 +4764,7 @@
         <w:t>K</w:t>
       </w:r>
       <w:r>
-        <w:t xml:space="preserve"> = 7.5) cost 13.6 ± 5.9 pp (</w:t>
+        <w:t xml:space="preserve"> = 1 cost 7.7 ± 5.4 pp (</w:t>
       </w:r>
       <w:r>
         <w:rPr>
@@ -4683,7 +4773,7 @@
         <w:t>z</w:t>
       </w:r>
       <w:r>
-        <w:t xml:space="preserve"> = 4.5), about half as much: valuing the lead instead of the own score accounts for about half of H's effect, and the Pudding standing, the term for the mean opponent and the bounded scale that H adds at the round-end leaves for the rest. S and I together are worth 10.2 ± 5.7 pp (</w:t>
+        <w:t xml:space="preserve"> = 2.8) (F + L in both arms), so their effect differs between the table sizes by 13.5 ± 9.1 pp (</w:t>
       </w:r>
       <w:r>
         <w:rPr>
@@ -4692,24 +4782,42 @@
         <w:t>z</w:t>
       </w:r>
       <w:r>
-        <w:t xml:space="preserve"> = 3.5) but I alone only 3.8 ± 5.7 pp, as Long et al.'s analysis [8] suggests for a game that reveals its hidden information within </w:t>
-      </w:r>
-      <w:r>
-        <w:rPr>
-          <w:i/>
-        </w:rPr>
-        <w:t>n</w:t>
-      </w:r>
-      <w:r>
-        <w:t xml:space="preserve"> − 1 turns. P and M cannot be removed from the final agent, since decoupled selection needs one value per player and the card-type statistics of I merge identical cards. The components also change the style of play: at 500 ms v3 scored fewer points than v2 from Sashimi (−2.7 per game) and Maki (−1.9) but more from Dumplings (+1.9) and Pudding (+1.3), sets that cannot fail or are decided over the whole game.</w:t>
-      </w:r>
-    </w:p>
-    <w:p>
-      <w:pPr>
-        <w:pStyle w:val="Heading2"/>
-      </w:pPr>
-      <w:r>
-        <w:t>Four Players and the Limits of Search (RQ3)</w:t>
+        <w:t xml:space="preserve"> = 2.9). This supports H3 only one-sidedly (a clear loss with three players, no clear gain with four), and the contrast was chosen after about 40 four-player runs, so it is exploratory. At 500 ms the four-player tree cut to depth 1 lost 17.4 ± 8.2 pp (</w:t>
+      </w:r>
+      <w:r>
+        <w:rPr>
+          <w:i/>
+        </w:rPr>
+        <w:t>z</w:t>
+      </w:r>
+      <w:r>
+        <w:t xml:space="preserve"> = 4.2) and our agent limited to 100 ms 9.0 ± 7.7 pp (</w:t>
+      </w:r>
+      <w:r>
+        <w:rPr>
+          <w:i/>
+        </w:rPr>
+        <w:t>z</w:t>
+      </w:r>
+      <w:r>
+        <w:t xml:space="preserve"> = 2.3), yet 1 000 ms (with </w:t>
+      </w:r>
+      <w:r>
+        <w:rPr>
+          <w:i/>
+        </w:rPr>
+        <w:t>K</w:t>
+      </w:r>
+      <w:r>
+        <w:t xml:space="preserve"> = 1.37) did not help (−4.8 ± 8.1 pp). On 73 positions from random games the 500 ms tree has 704 joint-move children at the root on average, 53% of them visited once, and a mean depth of 1.5; twice the time or rollouts per leaf changed the chosen card in 2.7% and 5.5% of the positions, no more often than a re-run with the same seed (5.5%; 9.6% with another seed).</w:t>
+      </w:r>
+    </w:p>
+    <w:p>
+      <w:pPr>
+        <w:pStyle w:val="Heading1"/>
+      </w:pPr>
+      <w:r>
+        <w:t>Conclusions and Future Work</w:t>
       </w:r>
     </w:p>
     <w:p>
@@ -4717,87 +4825,7 @@
         <w:pStyle w:val="BodyText"/>
       </w:pPr>
       <w:r>
-        <w:t xml:space="preserve">With four players the 3-player configuration won 46.4% at 100 ms and 38.4% at 500 ms (development; chance 25%). None of the 4-player changes is individually significant: X0 added +3.2 ± 6.2 pp at 100 ms; at 500 ms X0 with W2 and </w:t>
-      </w:r>
-      <w:r>
-        <w:rPr>
-          <w:i/>
-        </w:rPr>
-        <w:t>K</w:t>
-      </w:r>
-      <w:r>
-        <w:t xml:space="preserve"> = 1 added +7.2 ± 8.6 pp and F + L a further +1.0 ± 7.9 pp, whereas F + L cost 6.6 ± 6.0 pp at 100 ms (</w:t>
-      </w:r>
-      <w:r>
-        <w:rPr>
-          <w:i/>
-        </w:rPr>
-        <w:t>z</w:t>
-      </w:r>
-      <w:r>
-        <w:t xml:space="preserve"> = 2.2). Together they support H3: adding X0, W2 and </w:t>
-      </w:r>
-      <w:r>
-        <w:rPr>
-          <w:i/>
-        </w:rPr>
-        <w:t>K</w:t>
-      </w:r>
-      <w:r>
-        <w:t xml:space="preserve"> = 1 to the 3-player agent at 500 ms cost 7.7 ± 5.4 pp (</w:t>
-      </w:r>
-      <w:r>
-        <w:rPr>
-          <w:i/>
-        </w:rPr>
-        <w:t>z</w:t>
-      </w:r>
-      <w:r>
-        <w:t xml:space="preserve"> = 2.8), so their effect differs by 14.9 ± 10.2 pp (</w:t>
-      </w:r>
-      <w:r>
-        <w:rPr>
-          <w:i/>
-        </w:rPr>
-        <w:t>z</w:t>
-      </w:r>
-      <w:r>
-        <w:t xml:space="preserve"> = 2.9) between the table sizes. At 500 ms a 4-player tree cut to depth 1 lost 17.4 ± 8.2 pp (</w:t>
-      </w:r>
-      <w:r>
-        <w:rPr>
-          <w:i/>
-        </w:rPr>
-        <w:t>z</w:t>
-      </w:r>
-      <w:r>
-        <w:t xml:space="preserve"> = 4.2) and our agent limited to 100 ms 9.0 ± 7.7 pp (</w:t>
-      </w:r>
-      <w:r>
-        <w:rPr>
-          <w:i/>
-        </w:rPr>
-        <w:t>z</w:t>
-      </w:r>
-      <w:r>
-        <w:t xml:space="preserve"> = 2.3), yet 1 000 ms (with </w:t>
-      </w:r>
-      <w:r>
-        <w:rPr>
-          <w:i/>
-        </w:rPr>
-        <w:t>K</w:t>
-      </w:r>
-      <w:r>
-        <w:t xml:space="preserve"> = 1.37) did not help (−4.8 ± 8.1 pp). On 73 positions from random four-player games the 500 ms tree has on average 704 joint-move children at the root, 53% of them visited once, and a mean depth of 1.5; doubling the time or the rollouts per leaf changed the chosen card in 2.7% and 5.5% of the positions, no more often than re-running the search (5.5%).</w:t>
-      </w:r>
-    </w:p>
-    <w:p>
-      <w:pPr>
-        <w:pStyle w:val="Heading2"/>
-      </w:pPr>
-      <w:r>
-        <w:t>What Did Not Help</w:t>
+        <w:t>We adapted TAG's BasicMCTS to Sushi Go! with a shared card-value model, round-end rollouts, max-n backups, decoupled UCT and information-set search. For RQ1, the heuristic (28.3 pp when removed; a plain lead recovers half of it) and the decoupled information-set tree (10.2 pp) contribute most, and round-end rollouts led v3's factorial (+8.7 pp). On held-out deals the final agent wins 52.6% of three-player games at 100 ms and [pending] at 900 ms against TAG's ISMCTS and our previous agent. For RQ2, the decoupled tree loses less strength than the sequential one at longer budgets (−8.1 against −17.3 pp from 100 to 900 ms), though not significantly. For RQ3, settings tuned for four players cost 7.7 ± 5.4 pp with three players while their gain with four was not significant, and with four players extra time rarely changes the decision of the wide, shallow joint-move tree.</w:t>
       </w:r>
     </w:p>
     <w:p>
@@ -4805,49 +4833,7 @@
         <w:pStyle w:val="BodyText"/>
       </w:pPr>
       <w:r>
-        <w:t>The last study (three players, Fig. 3 bottom) changed the model and the value. Card constants tuned for three players (X3) make a far stronger greedy policy – it wins 45.0% of greedy games against two X0 players – yet did not strengthen the search (−1.3 ± 5.8 pp), consistent with simulation balancing [7]. Denial (“hate drafting”: simulated players also value taking the next player's best card) gained about 1 pp in greedy play and nothing in the search (−1.8 ± 5.8 pp); a win-gap or leader-only value did not change the win rate (−0.6, +0.7 pp), and rollouts to the game end with a win-gap value cost 23.7 ± 5.8 pp (</w:t>
-      </w:r>
-      <w:r>
-        <w:rPr>
-          <w:i/>
-        </w:rPr>
-        <w:t>z</w:t>
-      </w:r>
-      <w:r>
-        <w:t xml:space="preserve"> = 8.0).</w:t>
-      </w:r>
-    </w:p>
-    <w:p>
-      <w:pPr>
-        <w:pStyle w:val="Heading1"/>
-      </w:pPr>
-      <w:r>
-        <w:t>Conclusions and Future Work</w:t>
-      </w:r>
-    </w:p>
-    <w:p>
-      <w:pPr>
-        <w:pStyle w:val="BodyText"/>
-      </w:pPr>
-      <w:r>
-        <w:t>We adapted TAG's BasicMCTS to Sushi Go! with a card-value model for evaluation and simulation, round-end rollouts, max-n backups, decoupled UCT and information-set search. For RQ1, the heuristic (28.3 pp when removed; a plain lead recovers half of it) and the decoupled information-set tree (10.2 pp) contribute most, and round-end rollouts led v3's factorial (+8.7 pp). On held-out deals the final agent wins 52.6% of three-player games at 100 ms against TAG's ISMCTS and our previous agent. For RQ2, the decoupled tree loses less strength than the sequential one at longer budgets (−8.1 against −17.3 pp from 100 to 900 ms), though not significantly. For RQ3, the best settings differ between three and four players (</w:t>
-      </w:r>
-      <w:r>
-        <w:rPr>
-          <w:i/>
-        </w:rPr>
-        <w:t>z</w:t>
-      </w:r>
-      <w:r>
-        <w:t xml:space="preserve"> = 2.9), and with four players extra time rarely changes the decision of the wide, shallow joint-move tree.</w:t>
-      </w:r>
-    </w:p>
-    <w:p>
-      <w:pPr>
-        <w:pStyle w:val="BodyText"/>
-      </w:pPr>
-      <w:r>
-        <w:t>The study has limits: our opponents are framework agents and our own previous version; the long-budget validation and the 4-player 500 ms development rest on 250 games (about ±6 pp); the factorial and budget studies used independent rather than paired deals; and CPU-time budgets hide wall-clock effects such as garbage collection. As hand-tuned changes to the model no longer move the agent, future work should learn the evaluation from game outcomes, e.g. by regressing final ranks on features of round-end states. Regret matching or EXP3 could replace UCB in the decoupled selection [11], as the best variant depends on the game [12], and opponent models fitted to the observed picks of real opponents could replace the shared greedy policy, which models all players alike.</w:t>
+        <w:t>The study has limits. Our opponents are framework agents and our own previous version; the four-player 500 ms development rests on 250-game runs and its contrast with three players is exploratory; the factorial and the development budget runs used independent deals; and CPU-time budgets hide wall-clock effects such as garbage collection. As hand-tuned changes to the model no longer move the agent, future work should learn the evaluation from game outcomes, e.g. by regressing final ranks on features of round-end states. Regret matching or EXP3 could replace UCB in the decoupled selection [10], as the best variant depends on the game [11], and opponent models fitted to the picks of real opponents could replace the shared greedy policy.</w:t>
       </w:r>
     </w:p>
     <w:p>
@@ -4864,7 +4850,7 @@
         <w:pStyle w:val="BodyText"/>
       </w:pPr>
       <w:r>
-        <w:t xml:space="preserve">We used Claude [15] (Anthropic), through the Claude Code tool, throughout the project: to write and modify the Java code of our agent on top of BasicMCTS, to write and run the experiment and statistics scripts, and to draft all sections, tables and figures of this paper from the logs of our runs; every number comes from the result files in our repository (folders experiments_v3 to experiments_v5). The authors take full responsibility for the code and the paper, including any errors. The paper was generated with the prompt (original Turkish, then English translation): </w:t>
+        <w:t xml:space="preserve">We used Claude [15] (Anthropic), through the Claude Code tool, throughout the project: to write and modify the Java code of our agent on top of BasicMCTS, to write and run the experiment and statistics scripts, and to draft all sections, tables and figures of this paper from the logs of our runs; every number is computed from the result files of our runs. The authors take full responsibility for the code and the paper, including any errors. The paper was generated with the prompt (original Turkish, then English translation): </w:t>
       </w:r>
       <w:r>
         <w:rPr>
@@ -4873,7 +4859,7 @@
         <w:t>“simdi reponun icindeki butun herseyi incele ve hocaya direk yuklyecegimiz raporuda olusutr repoda ornekler tipler brief hersey var 100 alcagimiz bir rapor olsun her raporu tamaladiginda baska bir agent spawn edip bagimsiz durusstce kontrol taki yuzde yuz alacagana emin olankadar looptan cikma”</w:t>
       </w:r>
       <w:r>
-        <w:t xml:space="preserve"> – “Now examine everything in the repository and also create the report we will upload directly to the lecturer; the repository has examples, tips, the brief, everything. It should be a report that gets 100. Every time you finish the report, spawn another agent to check it independently and impartially, and do not leave the loop until you are sure it will get 100%.” Following that prompt, each draft was marked by a second, independent Claude instance against the module's rubric, and its findings were used to revise the text and to run the held-out validation, the comparison with TAG's DUCT agent, the lead-heuristic ablation and the four-player diagnostics. The experiments of the last study were run with the prompt “The lecturer will hold a tournament of our agents in class; as before, improve the agents' performance quickly while following the lecturer's restrictions and recording what we did in the README; you have 4.5 hours, test everything in parallel.” The prompts of earlier development sessions are not reproduced here; they asked Claude to implement and test the modifications of Table I and to run the experiments of Section IV.</w:t>
+        <w:t xml:space="preserve"> – “Now examine everything in the repository and also create the report we will upload directly to the lecturer; the repository has examples, tips, the brief, everything. It should be a report that gets 100. Every time you finish the report, spawn another agent to check it independently and impartially, and do not leave the loop until you are sure it will get 100%.” Following that prompt, each draft was marked by a second, independent Claude instance against the module's rubric; its written findings, archived with our records, were the prompts for the revisions and for the additional runs (held-out validation, TAG DUCT comparison, lead-heuristic ablation, v3 on the held-out deals, four-player diagnostics). The experiments of the last study were run with the prompt “The lecturer will hold a tournament of our agents in class; as before, improve the agents' performance quickly while following the lecturer's restrictions and recording what we did in the README; you have 4.5 hours, test everything in parallel.” The prompts of earlier development sessions are not reproduced here; they asked Claude to implement and test the modifications of Table I and to run the experiments of Section IV.</w:t>
       </w:r>
     </w:p>
     <w:p>
@@ -4984,16 +4970,16 @@
         <w:pStyle w:val="references"/>
       </w:pPr>
       <w:r>
-        <w:t xml:space="preserve">G. M. J.-B. Chaslot, M. H. M. Winands, H. J. van den Herik, J. W. H. M. Uiterwijk, and B. Bouzy, “Progressive strategies for Monte-Carlo tree search,” </w:t>
-      </w:r>
-      <w:r>
-        <w:rPr>
-          <w:i/>
-        </w:rPr>
-        <w:t>New Math. Natural Comput.</w:t>
-      </w:r>
-      <w:r>
-        <w:t>, vol. 4, no. 3, pp. 343–357, 2008.</w:t>
+        <w:t xml:space="preserve">D. Silver and G. Tesauro, “Monte-Carlo simulation balancing,” in </w:t>
+      </w:r>
+      <w:r>
+        <w:rPr>
+          <w:i/>
+        </w:rPr>
+        <w:t>Proc. 26th Int. Conf. Mach. Learn. (ICML)</w:t>
+      </w:r>
+      <w:r>
+        <w:t>, 2009, pp. 945–952.</w:t>
       </w:r>
     </w:p>
     <w:p>
@@ -5001,16 +4987,16 @@
         <w:pStyle w:val="references"/>
       </w:pPr>
       <w:r>
-        <w:t xml:space="preserve">D. Silver and G. Tesauro, “Monte-Carlo simulation balancing,” in </w:t>
-      </w:r>
-      <w:r>
-        <w:rPr>
-          <w:i/>
-        </w:rPr>
-        <w:t>Proc. 26th Int. Conf. Mach. Learn. (ICML)</w:t>
-      </w:r>
-      <w:r>
-        <w:t>, 2009, pp. 945–952.</w:t>
+        <w:t xml:space="preserve">J. Long, N. R. Sturtevant, M. Buro, and T. Furtak, “Understanding the success of perfect information Monte Carlo sampling in game tree search,” in </w:t>
+      </w:r>
+      <w:r>
+        <w:rPr>
+          <w:i/>
+        </w:rPr>
+        <w:t>Proc. 24th AAAI Conf. Artif. Intell.</w:t>
+      </w:r>
+      <w:r>
+        <w:t>, 2010, pp. 134–140.</w:t>
       </w:r>
     </w:p>
     <w:p>
@@ -5018,16 +5004,16 @@
         <w:pStyle w:val="references"/>
       </w:pPr>
       <w:r>
-        <w:t xml:space="preserve">J. Long, N. R. Sturtevant, M. Buro, and T. Furtak, “Understanding the success of perfect information Monte Carlo sampling in game tree search,” in </w:t>
-      </w:r>
-      <w:r>
-        <w:rPr>
-          <w:i/>
-        </w:rPr>
-        <w:t>Proc. 24th AAAI Conf. Artif. Intell.</w:t>
-      </w:r>
-      <w:r>
-        <w:t>, 2010, pp. 134–140.</w:t>
+        <w:t xml:space="preserve">I. Frank and D. Basin, “Search in games with incomplete information: A case study using Bridge card play,” </w:t>
+      </w:r>
+      <w:r>
+        <w:rPr>
+          <w:i/>
+        </w:rPr>
+        <w:t>Artif. Intell.</w:t>
+      </w:r>
+      <w:r>
+        <w:t>, vol. 100, no. 1–2, pp. 87–123, 1998.</w:t>
       </w:r>
     </w:p>
     <w:p>
@@ -5035,16 +5021,16 @@
         <w:pStyle w:val="references"/>
       </w:pPr>
       <w:r>
-        <w:t xml:space="preserve">I. Frank and D. Basin, “Search in games with incomplete information: A case study using Bridge card play,” </w:t>
-      </w:r>
-      <w:r>
-        <w:rPr>
-          <w:i/>
-        </w:rPr>
-        <w:t>Artif. Intell.</w:t>
-      </w:r>
-      <w:r>
-        <w:t>, vol. 100, no. 1–2, pp. 87–123, 1998.</w:t>
+        <w:t xml:space="preserve">J. Goodman, D. Perez-Liebana, and S. Lucas, “MultiTree MCTS in tabletop games,” in </w:t>
+      </w:r>
+      <w:r>
+        <w:rPr>
+          <w:i/>
+        </w:rPr>
+        <w:t>Proc. IEEE Conf. Games (CoG)</w:t>
+      </w:r>
+      <w:r>
+        <w:t>, 2022, pp. 292–299.</w:t>
       </w:r>
     </w:p>
     <w:p>
@@ -5052,16 +5038,16 @@
         <w:pStyle w:val="references"/>
       </w:pPr>
       <w:r>
-        <w:t xml:space="preserve">J. Goodman, D. Perez-Liebana, and S. Lucas, “MultiTree MCTS in tabletop games,” in </w:t>
-      </w:r>
-      <w:r>
-        <w:rPr>
-          <w:i/>
-        </w:rPr>
-        <w:t>Proc. IEEE Conf. Games (CoG)</w:t>
-      </w:r>
-      <w:r>
-        <w:t>, 2022, pp. 292–299.</w:t>
+        <w:t xml:space="preserve">M. Lanctot, V. Lisý, and M. H. M. Winands, “Monte Carlo tree search in simultaneous move games with applications to Goofspiel,” in </w:t>
+      </w:r>
+      <w:r>
+        <w:rPr>
+          <w:i/>
+        </w:rPr>
+        <w:t>Computer Games (CGW 2013)</w:t>
+      </w:r>
+      <w:r>
+        <w:t>, Commun. Comput. Inf. Sci., vol. 408. Cham, Switzerland: Springer, 2014, pp. 28–43.</w:t>
       </w:r>
     </w:p>
     <w:p>
@@ -5069,16 +5055,16 @@
         <w:pStyle w:val="references"/>
       </w:pPr>
       <w:r>
-        <w:t xml:space="preserve">M. Lanctot, V. Lisý, and M. H. M. Winands, “Monte Carlo tree search in simultaneous move games with applications to Goofspiel,” in </w:t>
-      </w:r>
-      <w:r>
-        <w:rPr>
-          <w:i/>
-        </w:rPr>
-        <w:t>Computer Games (CGW 2013)</w:t>
-      </w:r>
-      <w:r>
-        <w:t>, Commun. Comput. Inf. Sci., vol. 408. Cham, Switzerland: Springer, 2014, pp. 28–43.</w:t>
+        <w:t xml:space="preserve">M. J. W. Tak, M. Lanctot, and M. H. M. Winands, “Monte Carlo tree search variants for simultaneous move games,” in </w:t>
+      </w:r>
+      <w:r>
+        <w:rPr>
+          <w:i/>
+        </w:rPr>
+        <w:t>Proc. IEEE Conf. Comput. Intell. Games (CIG)</w:t>
+      </w:r>
+      <w:r>
+        <w:t>, 2014, pp. 1–8.</w:t>
       </w:r>
     </w:p>
     <w:p>
@@ -5086,16 +5072,16 @@
         <w:pStyle w:val="references"/>
       </w:pPr>
       <w:r>
-        <w:t xml:space="preserve">M. J. W. Tak, M. Lanctot, and M. H. M. Winands, “Monte Carlo tree search variants for simultaneous move games,” in </w:t>
-      </w:r>
-      <w:r>
-        <w:rPr>
-          <w:i/>
-        </w:rPr>
-        <w:t>Proc. IEEE Conf. Comput. Intell. Games (CIG)</w:t>
-      </w:r>
-      <w:r>
-        <w:t>, 2014, pp. 1–8.</w:t>
+        <w:t xml:space="preserve">N. R. Sturtevant, “An analysis of UCT in multi-player games,” in </w:t>
+      </w:r>
+      <w:r>
+        <w:rPr>
+          <w:i/>
+        </w:rPr>
+        <w:t>Computers and Games (CG 2008)</w:t>
+      </w:r>
+      <w:r>
+        <w:t>, Lect. Notes Comput. Sci., vol. 5131. Berlin, Germany: Springer, 2008, pp. 37–49.</w:t>
       </w:r>
     </w:p>
     <w:p>
@@ -5103,16 +5089,16 @@
         <w:pStyle w:val="references"/>
       </w:pPr>
       <w:r>
-        <w:t xml:space="preserve">N. R. Sturtevant, “An analysis of UCT in multi-player games,” in </w:t>
-      </w:r>
-      <w:r>
-        <w:rPr>
-          <w:i/>
-        </w:rPr>
-        <w:t>Computers and Games (CG 2008)</w:t>
-      </w:r>
-      <w:r>
-        <w:t>, Lect. Notes Comput. Sci., vol. 5131. Berlin, Germany: Springer, 2008, pp. 37–49.</w:t>
+        <w:t xml:space="preserve">D. Robilliard, C. Fonlupt, and F. Teytaud, “Monte-Carlo tree search for the game of ‘7 Wonders’,” in </w:t>
+      </w:r>
+      <w:r>
+        <w:rPr>
+          <w:i/>
+        </w:rPr>
+        <w:t>Computer Games (CGW 2014)</w:t>
+      </w:r>
+      <w:r>
+        <w:t>, Commun. Comput. Inf. Sci., vol. 504. Cham, Switzerland: Springer, 2014, pp. 64–77.</w:t>
       </w:r>
     </w:p>
     <w:p>

</xml_diff>

<commit_message>
Report draft 4 after the third independent review
- figure numbers assigned by order of appearance (the ablation figure is Fig. 2, the budget figure Fig. 3)
- four-player 100 ms comparison no longer misdescribed (dropped); full factorial reported (T = 8, R x T)
- seed-7 runs at 500/900 ms reported; decoupling alone (+6.4 pp, z = 2.2); confounds and nulls stated as such
- conditional wording for the pending held-out results; Holm scope stated; diagnostics as counts of 73 positions
- Tak et al. (decoupled UCT best overall) and Klang et al. (better heuristics) cited accurately
- max-n replaces BasicMCTS's paranoid backup; pi in eq. (1); Table notes at 8 pt
- generative-AI statement summarises the revision prompts (reviews archived in report/reviews)

Co-Authored-By: Claude Opus 5.5 <noreply@anthropic.com>
Claude-Session: https://claude.ai/code/session_01Jg1ytYCX7c7JubKoggMArC
</commit_message>
<xml_diff>
--- a/report/ECS7032P_Assignment1_Report_GroupA.docx
+++ b/report/ECS7032P_Assignment1_Report_GroupA.docx
@@ -192,7 +192,7 @@
         <w:t>Abstract—</w:t>
       </w:r>
       <w:r>
-        <w:t>In Sushi Go!, players pick cards simultaneously from hidden hands that are passed around, which basic Monte Carlo tree search (MCTS) does not model. Starting from BasicMCTS of the Tabletop Games (TAG) framework, we added a scoring model that drives evaluation and rollouts, round-end rollouts, max-n backups, decoupled selection for the simultaneous choices and information-set search. On held-out deals the agent wins 52.6% of 500 three-player games at 100 ms against TAG's information-set MCTS and our previous agent (chance 33.3%), [pending]% at 900 ms and 44.4% with four players (chance 25%). Ablations show that the scoring model and the decoupled information-set tree matter most; the tree's advantage grew with the budget, though not significantly, and four-player settings cost 7.7 percentage points with three players.</w:t>
+        <w:t>In Sushi Go!, players pick cards simultaneously from hidden hands that are passed around, which basic Monte Carlo tree search (MCTS) does not model. To BasicMCTS of the Tabletop Games (TAG) framework we added a card-value model that drives evaluation and rollouts, round-end rollouts, max-n backups, decoupled selection for the simultaneous choices and information-set search. On held-out deals the agent wins 52.6% of 500 three-player games at 100 ms against TAG's information-set MCTS and our previous agent (chance 33.3%), [pending]% at 900 ms, and 44.4% of four-player games at 100 ms (chance 25%). Ablations show that the card-value model and decoupled selection matter most; settings tuned for four players cost 7.7 percentage points with three, so the best configuration depends on the table size.</w:t>
       </w:r>
     </w:p>
     <w:p>
@@ -231,7 +231,7 @@
         <w:t>Sushi Go!</w:t>
       </w:r>
       <w:r>
-        <w:t>, one of TAG's games, breaks both assumptions: every player secretly picks one card from its hand, all players reveal their cards together and pass the rest of their hands on, and after three rounds the highest score wins. Klang et al. [4] introduced the game to TAG and assessed simultaneous action selection and complete information in it; the current version, which we use, shows an agent only the cards it has seen.</w:t>
+        <w:t>, one of TAG's games, breaks both assumptions: every player secretly picks one card from its hand, all players reveal their cards together and pass the rest of their hands on, and after three rounds the highest score wins. Klang et al. [4] introduced the game to TAG; the current version shows an agent only the cards it has seen.</w:t>
       </w:r>
     </w:p>
     <w:p>
@@ -299,7 +299,15 @@
         <w:ind w:left="576" w:hanging="288"/>
       </w:pPr>
       <w:r>
-        <w:t>leave-one-out and factorial ablations, held-out validation and negative results (162 runs, 69 350 games).</w:t>
+        <w:t>leave-one-out and factorial ablations, held-out validation and negative results that locate the agent's remaining limits.</w:t>
+      </w:r>
+    </w:p>
+    <w:p>
+      <w:pPr>
+        <w:pStyle w:val="BodyText"/>
+      </w:pPr>
+      <w:r>
+        <w:t>Together they suggest that in a drafting game the simultaneous moves matter more to the search than the hidden hands.</w:t>
       </w:r>
     </w:p>
     <w:p>
@@ -429,7 +437,7 @@
         <w:t>N</w:t>
       </w:r>
       <w:r>
-        <w:t xml:space="preserve"> those of its parent. Domain knowledge can enter through heuristic rollout policies or priors such as progressive bias [2]. A stronger rollout policy does not guarantee better estimates, however: Silver and Tesauro [6] showed that rollouts should be balanced, i.e., give unbiased value estimates, rather than be played by a strong policy.</w:t>
+        <w:t xml:space="preserve"> those of its parent. Domain knowledge can enter through heuristic rollout policies or priors such as progressive bias [2], but a stronger rollout policy does not guarantee better estimates: Silver and Tesauro [6] showed that rollouts should be balanced, i.e., give unbiased value estimates.</w:t>
       </w:r>
     </w:p>
     <w:p>
@@ -462,7 +470,7 @@
         <w:pStyle w:val="BodyText"/>
       </w:pPr>
       <w:r>
-        <w:t>Simultaneous moves are usually handled by decoupled UCT (DUCT): every player chooses its own action at a node from its own bandit statistics and the joint action leads to a child [10]. UCB-based DUCT need not converge to an equilibrium, so Lanctot et al. [10] compared it with selection by the EXP3 bandit algorithm and by regret matching, and Tak et al. [11] found that the best variant depends on the game; both studies used two-player games such as Goofspiel. In multi-player games, UCT with max-n backups, in which every player maximises its own value, computes a mixed-strategy equilibrium and played at least as well as earlier algorithms in Sturtevant's experiments [12].</w:t>
+        <w:t>Simultaneous moves are usually handled by decoupled UCT (DUCT): every player chooses its own action at a node from its own bandit statistics and the joint action leads to a child [10]. UCB-based DUCT need not converge to an equilibrium, so Lanctot et al. [10] compared it with selection by the EXP3 bandit algorithm and by regret matching in Goofspiel, and Tak et al. [11] found across nine games that the best variant depends on the game and the opponent, although decoupled UCT was best overall. With several players, UCT with max-n backups (every player maximises its own value) computes a mixed-strategy equilibrium and played at least as well as earlier algorithms [12].</w:t>
       </w:r>
     </w:p>
     <w:p>
@@ -470,7 +478,7 @@
         <w:pStyle w:val="BodyText"/>
       </w:pPr>
       <w:r>
-        <w:t>MCTS has also been applied to the drafting game 7 Wonders, which passes hands in the same way [13]. TAG's advanced MCTS agent already offers information sets, one tree per player and a decoupled option; we build on BasicMCTS, which has none of them, so that the contribution of each idea can be measured. How these ideas combine with domain knowledge in a multi-player drafting game, and how their value depends on the time budget and the number of players, has not been measured; the earlier Sushi Go! study in TAG [4] focused on simultaneous action selection and complete information.</w:t>
+        <w:t>MCTS has also been applied to the drafting game 7 Wonders, which passes hands in the same way [13]. TAG's advanced MCTS agent already offers information sets, one tree per player and a decoupled option; we build on BasicMCTS, which has none of them, so that the contribution of each idea can be measured. How these ideas combine with domain knowledge in a multi-player drafting game, and how their value depends on the time budget and the number of players, has not been measured; the earlier Sushi Go! study in TAG [4] focused on simultaneous action selection and complete information and concluded that better heuristics should improve the agents, which motivates our card-value model.</w:t>
       </w:r>
     </w:p>
     <w:p>
@@ -1330,7 +1338,7 @@
               <w:jc w:val="left"/>
             </w:pPr>
             <w:r>
-              <w:t>ensemble of up to 4 determinised trees [7]</w:t>
+              <w:t>ensemble of up to 4 determinised trees [3]</w:t>
             </w:r>
           </w:p>
         </w:tc>
@@ -1363,108 +1371,93 @@
       </w:pPr>
       <w:r>
         <w:rPr>
-          <w:sz w:val="14"/>
           <w:vertAlign w:val="superscript"/>
         </w:rPr>
         <w:t>a</w:t>
       </w:r>
       <w:r>
-        <w:rPr>
-          <w:sz w:val="14"/>
-        </w:rPr>
         <w:t xml:space="preserve"> (σ, </w:t>
       </w:r>
       <w:r>
         <w:rPr>
           <w:i/>
-          <w:sz w:val="14"/>
         </w:rPr>
         <w:t>w</w:t>
       </w:r>
       <w:r>
-        <w:rPr>
-          <w:sz w:val="14"/>
-        </w:rPr>
         <w:t xml:space="preserve">, α, </w:t>
       </w:r>
       <w:r>
         <w:rPr>
           <w:i/>
-          <w:sz w:val="14"/>
         </w:rPr>
         <w:t>T</w:t>
       </w:r>
       <w:r>
-        <w:rPr>
-          <w:sz w:val="14"/>
-        </w:rPr>
         <w:t xml:space="preserve">, β, </w:t>
       </w:r>
       <w:r>
         <w:rPr>
           <w:i/>
-          <w:sz w:val="14"/>
         </w:rPr>
         <w:t>T</w:t>
       </w:r>
       <w:r>
         <w:rPr>
-          <w:sz w:val="14"/>
           <w:vertAlign w:val="subscript"/>
         </w:rPr>
         <w:t>m</w:t>
       </w:r>
       <w:r>
-        <w:rPr>
-          <w:sz w:val="14"/>
-        </w:rPr>
-        <w:t xml:space="preserve">, κ, δ, π, ν, γ) = (15, 0.7, 0.5, 6, 0.5, 3, 0.25, 1.5, 1.25, 3, 3), default (15, 0.7, 0.5, 4, 1, 0, 0, 0, 1, 2, 0): β scales a Sashimi triple still needing two cards; the Maki standing gets weight 1/(1 + </w:t>
-      </w:r>
-      <w:r>
-        <w:rPr>
-          <w:i/>
-          <w:sz w:val="14"/>
+        <w:t xml:space="preserve">, κ, δ, π, ν, γ) = (15, 0.7, 0.5, 6, 0.5, 3, 0.25, 1.5, 1.25, 3, 3), default (15, 0.7, 0.5, 4, 1, 0, 0, 0, 1, 2, 0). β scales a Sashimi triple still needing two cards; the Maki standing has weight 1/(1 + </w:t>
+      </w:r>
+      <w:r>
+        <w:rPr>
+          <w:i/>
         </w:rPr>
         <w:t>r</w:t>
       </w:r>
       <w:r>
-        <w:rPr>
-          <w:sz w:val="14"/>
-        </w:rPr>
         <w:t>/</w:t>
       </w:r>
       <w:r>
         <w:rPr>
           <w:i/>
-          <w:sz w:val="14"/>
         </w:rPr>
         <w:t>T</w:t>
       </w:r>
       <w:r>
         <w:rPr>
-          <w:sz w:val="14"/>
           <w:vertAlign w:val="subscript"/>
         </w:rPr>
         <w:t>m</w:t>
       </w:r>
       <w:r>
-        <w:rPr>
-          <w:sz w:val="14"/>
-        </w:rPr>
-        <w:t xml:space="preserve">), κ points per icon the rest; δ adds the next Dumpling's points; π scales the Pudding standing; a set is likely only if γ cards per missing card remain in the hands. </w:t>
-      </w:r>
-      <w:r>
-        <w:rPr>
-          <w:sz w:val="14"/>
+        <w:t xml:space="preserve">) (1 if </w:t>
+      </w:r>
+      <w:r>
+        <w:rPr>
+          <w:i/>
+        </w:rPr>
+        <w:t>T</w:t>
+      </w:r>
+      <w:r>
+        <w:rPr>
+          <w:vertAlign w:val="subscript"/>
+        </w:rPr>
+        <w:t>m</w:t>
+      </w:r>
+      <w:r>
+        <w:t xml:space="preserve"> = 0), κ per icon the rest; δ weights the next Dumpling; γ: cards needed per missing card. </w:t>
+      </w:r>
+      <w:r>
+        <w:rPr>
           <w:vertAlign w:val="superscript"/>
         </w:rPr>
         <w:t>b</w:t>
       </w:r>
       <w:r>
-        <w:rPr>
-          <w:sz w:val="14"/>
-        </w:rPr>
-        <w:t xml:space="preserve"> at 500 ms or more.</w:t>
+        <w:t xml:space="preserve"> 500 ms or more.</w:t>
       </w:r>
     </w:p>
     <w:p>
@@ -1476,7 +1469,7 @@
       <w:r>
         <w:drawing>
           <wp:inline xmlns:a="http://schemas.openxmlformats.org/drawingml/2006/main" xmlns:pic="http://schemas.openxmlformats.org/drawingml/2006/picture">
-            <wp:extent cx="3099816" cy="1645920"/>
+            <wp:extent cx="3099816" cy="1444752"/>
             <wp:docPr id="1" name="Picture 1"/>
             <wp:cNvGraphicFramePr>
               <a:graphicFrameLocks noChangeAspect="1"/>
@@ -1497,7 +1490,7 @@
                   <pic:spPr>
                     <a:xfrm>
                       <a:off x="0" y="0"/>
-                      <a:ext cx="3099816" cy="1645920"/>
+                      <a:ext cx="3099816" cy="1444752"/>
                     </a:xfrm>
                     <a:prstGeom prst="rect"/>
                   </pic:spPr>
@@ -1646,7 +1639,7 @@
         <w:rPr>
           <w:rFonts w:ascii="Times New Roman" w:hAnsi="Times New Roman" w:cs="Times New Roman" w:eastAsia="Times New Roman"/>
         </w:rPr>
-        <w:t xml:space="preserve"> + </w:t>
+        <w:t xml:space="preserve"> + π</w:t>
       </w:r>
       <w:r>
         <w:rPr>
@@ -1876,7 +1869,7 @@
         <w:t>T</w:t>
       </w:r>
       <w:r>
-        <w:t xml:space="preserve"> = 4). The value of </w:t>
+        <w:t xml:space="preserve"> = 4, π = 1). The value of </w:t>
       </w:r>
       <w:r>
         <w:rPr>
@@ -2249,7 +2242,7 @@
         <w:t>mv</w:t>
       </w:r>
       <w:r>
-        <w:t xml:space="preserve">, or a random card with probability ε = 0.2 (with Chopsticks, the second card is chosen in the same way); the same policy models the opponents. </w:t>
+        <w:t xml:space="preserve">, or a random card with probability ε = 0.2 (the second card of a Chopsticks move is chosen in the same way); the same policy models the opponents. </w:t>
       </w:r>
       <w:r>
         <w:rPr>
@@ -2289,7 +2282,7 @@
         <w:t>M:</w:t>
       </w:r>
       <w:r>
-        <w:t xml:space="preserve"> a node stores one value per player and every player maximises its own value [12]. </w:t>
+        <w:t xml:space="preserve"> a node stores one value per player and every player maximises its own value [12], instead of BasicMCTS's paranoid assumption that every opponent minimises ours. </w:t>
       </w:r>
       <w:r>
         <w:rPr>
@@ -2608,7 +2601,7 @@
         <w:pStyle w:val="BodyText"/>
       </w:pPr>
       <w:r>
-        <w:t xml:space="preserve">With four players the agent switches parameters. It uses the card constants X0 (Table I), found by a search-free coordinate tuner that plays greedy card-value policies against each other. From 500 ms it also uses </w:t>
+        <w:t xml:space="preserve">With four players the agent switches parameters. It uses the card constants X0 (Table I), found by a search-free tuner of greedy card-value policies. From 500 ms it also uses </w:t>
       </w:r>
       <w:r>
         <w:rPr>
@@ -2735,7 +2728,7 @@
         <w:t>K</w:t>
       </w:r>
       <w:r>
-        <w:t xml:space="preserve"> = 1. The competition files use this agent with 900 ms (1 s limit) and 430 ms (500 ms limit) of CPU time and wall-clock guards.</w:t>
+        <w:t xml:space="preserve"> = 1.</w:t>
       </w:r>
     </w:p>
     <w:p>
@@ -2910,7 +2903,7 @@
               <w:t>K</w:t>
             </w:r>
             <w:r>
-              <w:t xml:space="preserve"> 1.41). TAG ISMCTS: TAG's SushiGo_3+P_HiBudget file (set for 400 ms) at our budget: one tree per player [9], UCB-Tuned, </w:t>
+              <w:t xml:space="preserve"> 1.41). TAG ISMCTS: SushiGo_3+P_HiBudget (set for 400 ms) at our budget: one tree per player [9], UCB-Tuned, </w:t>
             </w:r>
             <w:r>
               <w:rPr>
@@ -2919,7 +2912,7 @@
               <w:t>K</w:t>
             </w:r>
             <w:r>
-              <w:t xml:space="preserve"> 1, random rollouts to the end, score heuristic. TAG DUCT: TAG's SushiGoDUCT file: decoupled UCT, </w:t>
+              <w:t xml:space="preserve"> 1, random rollouts to the end, score heuristic. TAG DUCT: SushiGoDUCT: decoupled UCT, </w:t>
             </w:r>
             <w:r>
               <w:rPr>
@@ -2980,7 +2973,7 @@
               <w:jc w:val="left"/>
             </w:pPr>
             <w:r>
-              <w:t>CPU time per decision, equal for all agents: 100 ms (most development), 500 and 900 ms</w:t>
+              <w:t>CPU time per decision, equal for all agents: 100 ms (most development), 500 and 900 ms; competition files 900 ms (1 s limit) or 430 ms (500 ms limit) with wall-clock guards</w:t>
             </w:r>
           </w:p>
         </w:tc>
@@ -3120,7 +3113,7 @@
               <w:t>g</w:t>
             </w:r>
             <w:r>
-              <w:t xml:space="preserve">; since v4 a fixed deck order is shuffled with it (equal </w:t>
+              <w:t xml:space="preserve">; from 19 October (all seed-7 and held-out runs) a fixed deck order is shuffled with it (equal </w:t>
             </w:r>
             <w:r>
               <w:rPr>
@@ -3181,7 +3174,7 @@
               <w:t>s</w:t>
             </w:r>
             <w:r>
-              <w:t xml:space="preserve"> = 1, 2 (v3 also 1001–3001); ablation and last study </w:t>
+              <w:t xml:space="preserve"> = 1, 2 (v3 also 1001–3001); ablation and last study (v5, before the in-class tournament) </w:t>
             </w:r>
             <w:r>
               <w:rPr>
@@ -3190,7 +3183,7 @@
               <w:t>s</w:t>
             </w:r>
             <w:r>
-              <w:t xml:space="preserve"> = 7; held-out validation </w:t>
+              <w:t xml:space="preserve"> = 7; held-out </w:t>
             </w:r>
             <w:r>
               <w:rPr>
@@ -3242,15 +3235,12 @@
               <w:jc w:val="left"/>
             </w:pPr>
             <w:r>
-              <w:t>500 per condition; 250 in development runs at 900 ms and with four players at 500 ms (48–73 s of CPU time per game)</w:t>
+              <w:t>500 per condition; 250 in development runs at 900 ms and with four players at 500 ms (45–70 s of CPU time per game)</w:t>
             </w:r>
           </w:p>
         </w:tc>
       </w:tr>
       <w:tr>
-        <w:trPr>
-          <w:cantSplit/>
-        </w:trPr>
         <w:tc>
           <w:tcPr>
             <w:tcW w:type="dxa" w:w="1037"/>
@@ -3262,11 +3252,10 @@
           <w:p>
             <w:pPr>
               <w:pStyle w:val="tablecopy"/>
-              <w:keepNext/>
               <w:jc w:val="left"/>
             </w:pPr>
             <w:r>
-              <w:t>Hardware</w:t>
+              <w:t>Hardware, records</w:t>
             </w:r>
           </w:p>
         </w:tc>
@@ -3281,49 +3270,10 @@
           <w:p>
             <w:pPr>
               <w:pStyle w:val="tablecopy"/>
-              <w:keepNext/>
               <w:jc w:val="left"/>
             </w:pPr>
             <w:r>
-              <w:t>18-core laptop (6–16 games in parallel); last study and validation on a 4-core machine (4 in parallel)</w:t>
-            </w:r>
-          </w:p>
-        </w:tc>
-      </w:tr>
-      <w:tr>
-        <w:tc>
-          <w:tcPr>
-            <w:tcW w:type="dxa" w:w="1037"/>
-            <w:tcMar>
-              <w:left w:w="50" w:type="dxa"/>
-              <w:right w:w="50" w:type="dxa"/>
-            </w:tcMar>
-          </w:tcPr>
-          <w:p>
-            <w:pPr>
-              <w:pStyle w:val="tablecopy"/>
-              <w:jc w:val="left"/>
-            </w:pPr>
-            <w:r>
-              <w:t>Records</w:t>
-            </w:r>
-          </w:p>
-        </w:tc>
-        <w:tc>
-          <w:tcPr>
-            <w:tcW w:type="dxa" w:w="3830"/>
-            <w:tcMar>
-              <w:left w:w="50" w:type="dxa"/>
-              <w:right w:w="50" w:type="dxa"/>
-            </w:tcMar>
-          </w:tcPr>
-          <w:p>
-            <w:pPr>
-              <w:pStyle w:val="tablecopy"/>
-              <w:jc w:val="left"/>
-            </w:pPr>
-            <w:r>
-              <w:t>agent files, per-game results and scripts of every run: available from the authors</w:t>
+              <w:t>18-core laptop (6–16 games in parallel); last study and validation on a 4-core machine (4 in parallel). Agent files, per-game results and scripts: from the authors</w:t>
             </w:r>
           </w:p>
         </w:tc>
@@ -3331,6 +3281,12 @@
     </w:tbl>
     <w:p>
       <w:pPr>
+        <w:pStyle w:val="tablecopy"/>
+        <w:spacing w:after="80"/>
+      </w:pPr>
+    </w:p>
+    <w:p>
+      <w:pPr>
         <w:pStyle w:val="BodyText"/>
       </w:pPr>
       <w:r>
@@ -3361,7 +3317,16 @@
         <w:t>z</w:t>
       </w:r>
       <w:r>
-        <w:t xml:space="preserve"> = difference/SE, in percentage points (pp) for win rates. With 500 games a win rate near 50% has a 95% interval of ±4.4 pp, and a difference between two runs about ±5.7 pp even when paired, because the outcomes of two agents on the same deal correlate only weakly (0.0–0.2); the score margin, about twice as sensitive, served to screen ideas. We report unadjusted intervals and state where a conclusion survives a Holm correction. We expected (H1) every component to improve both measures, (H2) the decoupled information-set tree to matter more at longer budgets and (H3) the best settings to depend on the number of players.</w:t>
+        <w:t xml:space="preserve"> = difference/SE, in percentage points (pp) for win rates. With 500 games a win rate near 50% has a 95% interval of ±4.4 pp, and a difference between two runs about ±5.7 pp even when paired, because the outcomes of two agents on the same deal correlate only weakly (0.0–0.2); the score margin, 1.5–2 times as sensitive in </w:t>
+      </w:r>
+      <w:r>
+        <w:rPr>
+          <w:i/>
+        </w:rPr>
+        <w:t>z</w:t>
+      </w:r>
+      <w:r>
+        <w:t>, served to screen ideas. We report unadjusted intervals, apply a Holm correction within the ablation and within the last study, and treat the four-player comparisons as exploratory. We expected (H1) every component to improve both measures, (H2) the decoupled information-set tree to matter more at longer budgets and (H3) the best settings to depend on the number of players.</w:t>
       </w:r>
     </w:p>
     <w:p>
@@ -4449,23 +4414,16 @@
         <w:jc w:val="left"/>
       </w:pPr>
       <w:r>
-        <w:rPr>
-          <w:sz w:val="14"/>
-        </w:rPr>
-        <w:t xml:space="preserve">Setting: players / ms per decision. Held-out seed block 100 000, except </w:t>
-      </w:r>
-      <w:r>
-        <w:rPr>
-          <w:sz w:val="14"/>
+        <w:t xml:space="preserve">Setting: players / ms per decision. Seed block 100 000, </w:t>
+      </w:r>
+      <w:r>
+        <w:rPr>
           <w:vertAlign w:val="superscript"/>
         </w:rPr>
         <w:t>a</w:t>
       </w:r>
       <w:r>
-        <w:rPr>
-          <w:sz w:val="14"/>
-        </w:rPr>
-        <w:t xml:space="preserve"> seed block 7 (used for no decision about these opponents). Margin: our score minus the best opponent's, ± 95% CI. Chance: 33.3% (3 players), 25% (4 players).</w:t>
+        <w:t xml:space="preserve"> 7. Margin: our score minus the best opponent's, ± 95% CI. Chance: 33.3% (3 players), 25% (4 players).</w:t>
       </w:r>
     </w:p>
     <w:p>
@@ -4473,7 +4431,7 @@
         <w:pStyle w:val="BodyText"/>
       </w:pPr>
       <w:r>
-        <w:t>Table III reports the final agent. On the held-out deals it wins 52.6%, [pending] and [pending] of three-player games at 100, 500 and 900 ms against v2 and TAG's ISMCTS, and 44.4% and [pending] of four-player games at 100 and 500 ms. On seed block 7, whose deals overlap the development deals, it had won 55.0% at 100 ms (58.1% when re-run on the same machine), 2.4 ± 6.1 pp and 5.5 ± 6.1 pp more; neither difference is significant. TAG's DUCT agent, with decoupled selection and information sets but neither our card-value model nor round-end rollouts, wins only 21.0% of its seats when it replaces v2. BasicMCTS, RHEA and OSLA win at most 12.8% of their seats; OSLA wins none, as its copy of the state hides the other players' choices, so its look-ahead never reveals a card.</w:t>
+        <w:t>Table III reports the final agent. On the held-out deals it wins 52.6%, [pending] and [pending] of three-player games at 100, 500 and 900 ms against v2 and TAG's ISMCTS, and 44.4% and [pending] of four-player games at 100 and 500 ms. On seed block 7, whose deals overlap the development deals, it had won 55.0% at 100 ms (58.1% when re-run on the machine of the held-out runs), 2.4 ± 6.1 pp and 5.5 ± 6.1 pp more, neither significant. TAG's DUCT agent, with decoupled selection and information sets but neither our card-value model nor round-end rollouts, wins 21.0% of its seats when it replaces v2, the same share as v2. BasicMCTS, RHEA and OSLA win at most 12.8% of their seats; OSLA none, as its one-step look-ahead never reaches the simultaneous reveal.</w:t>
       </w:r>
     </w:p>
     <w:p>
@@ -4493,7 +4451,7 @@
       <w:r>
         <w:drawing>
           <wp:inline xmlns:a="http://schemas.openxmlformats.org/drawingml/2006/main" xmlns:pic="http://schemas.openxmlformats.org/drawingml/2006/picture">
-            <wp:extent cx="3099816" cy="2240280"/>
+            <wp:extent cx="3099816" cy="2011680"/>
             <wp:docPr id="2" name="Picture 2"/>
             <wp:cNvGraphicFramePr>
               <a:graphicFrameLocks noChangeAspect="1"/>
@@ -4514,7 +4472,7 @@
                   <pic:spPr>
                     <a:xfrm>
                       <a:off x="0" y="0"/>
-                      <a:ext cx="3099816" cy="2240280"/>
+                      <a:ext cx="3099816" cy="2011680"/>
                     </a:xfrm>
                     <a:prstGeom prst="rect"/>
                   </pic:spPr>
@@ -4531,7 +4489,7 @@
         <w:keepLines/>
       </w:pPr>
       <w:r>
-        <w:t>Paired effects with three players at 100 ms (seed 7, 500 games each), ± 95% CI. Top: one component removed from the final agent (base: final agent, 55.0%). Bottom: the lead-heuristic ablation and the changes of our last study, against a re-run of the final agent on the 4-core machine (58.1%).</w:t>
+        <w:t>Paired effects with three players at 100 ms (seed block 7, 500 games each), ± 95% CI. Top: one component removed from the final agent (base: final agent, 55.0%). Bottom: the lead-heuristic ablation and the changes of our last study, against a re-run of the final agent on the 4-core machine (58.1%).</w:t>
       </w:r>
     </w:p>
     <w:p>
@@ -4539,7 +4497,7 @@
         <w:pStyle w:val="BodyText"/>
       </w:pPr>
       <w:r>
-        <w:t xml:space="preserve">Fig. 3 (top) removes one component at a time from the final agent. Every removal lowers both measures; on the score margin all five differences survive a Holm correction, on the win rate only those of H and of S + I (−R: </w:t>
+        <w:t xml:space="preserve">Fig. 2 (top) removes one component at a time from the final agent. Every removal lowers both measures; on the score margin all five differences survive a Holm correction, on the win rate only those of H and of S + I (−R: </w:t>
       </w:r>
       <w:r>
         <w:rPr>
@@ -4548,7 +4506,7 @@
         <w:t>z</w:t>
       </w:r>
       <w:r>
-        <w:t xml:space="preserve"> = 2.0, −B: 1.4, −I: 1.3), so H1 holds for the margin and only partly for wins. Without H the leaves are valued by TAG's default heuristic, the own score divided by 50, which ignores the opponents' scores and the Pudding standing and does not match the scale of </w:t>
+        <w:t xml:space="preserve"> = 2.0, −B: 1.4, −I: 1.3), so H1 holds for the margin and only partly for wins. Without H the leaves are valued by TAG's default heuristic, the own score divided by 50, which ignores the opponents' scores and the Pudding standing; as </w:t>
       </w:r>
       <w:r>
         <w:rPr>
@@ -4557,7 +4515,7 @@
         <w:t>K</w:t>
       </w:r>
       <w:r>
-        <w:t xml:space="preserve">: this costs 28.3 ± 5.8 pp. TAG's lead heuristic (own score minus the best opponent's, </w:t>
+        <w:t xml:space="preserve"> was not retuned to its scale, the 28.3 ± 5.8 pp loss mixes the value of H with mis-scaled exploration. TAG's lead heuristic (own score minus the best opponent's) with </w:t>
       </w:r>
       <w:r>
         <w:rPr>
@@ -4566,7 +4524,7 @@
         <w:t>K</w:t>
       </w:r>
       <w:r>
-        <w:t xml:space="preserve"> rescaled to 7.5) in place of H costs 13.6 ± 5.9 pp (</w:t>
+        <w:t xml:space="preserve"> rescaled to 7.5 costs 13.6 ± 5.9 pp (</w:t>
       </w:r>
       <w:r>
         <w:rPr>
@@ -4575,7 +4533,7 @@
         <w:t>z</w:t>
       </w:r>
       <w:r>
-        <w:t xml:space="preserve"> = 4.5): valuing the lead recovers about half of H's effect; the rest (Pudding standing, mean-opponent term, bounded scale) was not separated. S and I together are worth 10.2 ± 5.7 pp (</w:t>
+        <w:t xml:space="preserve"> = 4.5): valuing the lead recovers roughly half of H's effect (two estimates against different base runs), and the rest (Pudding standing, mean-opponent term, bounded scale) was not separated. S and I together are worth 10.2 ± 5.7 pp (</w:t>
       </w:r>
       <w:r>
         <w:rPr>
@@ -4584,7 +4542,16 @@
         <w:t>z</w:t>
       </w:r>
       <w:r>
-        <w:t xml:space="preserve"> = 3.5) but I alone only 3.8 ± 5.7 pp, as Long et al.'s analysis [7] suggests for a game that reveals its hidden information within </w:t>
+        <w:t xml:space="preserve"> = 3.5). S alone, decoupled selection with v3's determinisation, beats v3 by +6.4 ± 5.7 pp (</w:t>
+      </w:r>
+      <w:r>
+        <w:rPr>
+          <w:i/>
+        </w:rPr>
+        <w:t>z</w:t>
+      </w:r>
+      <w:r>
+        <w:t xml:space="preserve"> = 2.2), whereas I then adds only 3.8 ± 5.7 pp, as Long et al.'s analysis [7] suggests for a game that reveals its hidden information within </w:t>
       </w:r>
       <w:r>
         <w:rPr>
@@ -4602,7 +4569,25 @@
         <w:t>4</w:t>
       </w:r>
       <w:r>
-        <w:t xml:space="preserve"> factorial on v3's components (16 × 500 games) gave main effects of +8.7 ± 2.1 pp for R (</w:t>
+        <w:t xml:space="preserve"> factorial on v3 (R; M; </w:t>
+      </w:r>
+      <w:r>
+        <w:rPr>
+          <w:i/>
+        </w:rPr>
+        <w:t>K</w:t>
+      </w:r>
+      <w:r>
+        <w:t xml:space="preserve"> = 0.5 vs 1.41; completion horizon </w:t>
+      </w:r>
+      <w:r>
+        <w:rPr>
+          <w:i/>
+        </w:rPr>
+        <w:t>T</w:t>
+      </w:r>
+      <w:r>
+        <w:t xml:space="preserve"> = 8 vs 4; 16 × 500 games, independent deals) gave main effects of +8.7 pp for R (</w:t>
       </w:r>
       <w:r>
         <w:rPr>
@@ -4611,7 +4596,7 @@
         <w:t>z</w:t>
       </w:r>
       <w:r>
-        <w:t xml:space="preserve"> = 8.1), +5.2 ± 2.2 for </w:t>
+        <w:t xml:space="preserve"> = 8.1), +5.2 for </w:t>
       </w:r>
       <w:r>
         <w:rPr>
@@ -4620,7 +4605,34 @@
         <w:t>K</w:t>
       </w:r>
       <w:r>
-        <w:t xml:space="preserve"> = 0.5 instead of 1.41 and +4.1 ± 2.0 for M, with an M × </w:t>
+        <w:t xml:space="preserve">, +4.1 for M and +3.6 for </w:t>
+      </w:r>
+      <w:r>
+        <w:rPr>
+          <w:i/>
+        </w:rPr>
+        <w:t>T</w:t>
+      </w:r>
+      <w:r>
+        <w:t xml:space="preserve"> = 8 (each ±2.1). Of the six interactions only R × </w:t>
+      </w:r>
+      <w:r>
+        <w:rPr>
+          <w:i/>
+        </w:rPr>
+        <w:t>T</w:t>
+      </w:r>
+      <w:r>
+        <w:t xml:space="preserve"> (−4.2; </w:t>
+      </w:r>
+      <w:r>
+        <w:rPr>
+          <w:i/>
+        </w:rPr>
+        <w:t>T</w:t>
+      </w:r>
+      <w:r>
+        <w:t xml:space="preserve"> = 4 was kept) and M × </w:t>
       </w:r>
       <w:r>
         <w:rPr>
@@ -4629,7 +4641,16 @@
         <w:t>K</w:t>
       </w:r>
       <w:r>
-        <w:t xml:space="preserve"> interaction of +3.2 ± 2.2: max-n backups need less exploration. Adding progressive bias back to v3 did not help (−1.2 ± 4.3 pp).</w:t>
+        <w:t xml:space="preserve"> (+3.2: max-n backups need less exploration) exceed |</w:t>
+      </w:r>
+      <w:r>
+        <w:rPr>
+          <w:i/>
+        </w:rPr>
+        <w:t>z</w:t>
+      </w:r>
+      <w:r>
+        <w:t>| = 2.</w:t>
       </w:r>
     </w:p>
     <w:p>
@@ -4637,7 +4658,7 @@
         <w:pStyle w:val="BodyText"/>
       </w:pPr>
       <w:r>
-        <w:t>The changes of our last study did not help (Fig. 3, bottom). Card constants tuned for three players (X3) make a far stronger greedy policy – they win 45.0% of greedy games against two X0 players, whereas the final agent's own constants win 7.3% in a pool of their own and X0 players – yet did not strengthen the search (−1.3 ± 5.8 pp), consistent with simulation balancing [6]. Denial (simulated players also value taking the next player's best card), a win-gap value and a leader-only value did not change the win rate either (−1.8, −0.6, +0.7 pp), and rollouts to the game end with a win-gap value cost 23.7 ± 5.8 pp (</w:t>
+        <w:t>The five changes of our last study (Fig. 2, bottom) showed no detectable gain: card constants tuned for three players (X3), a much stronger greedy policy (45.0% of greedy games against two X0 players), changed the win rate by −1.3 ± 5.8 pp, denial in the rollouts, a win-gap and a leader-only value by −1.8, −0.6 and +0.7 pp (each ±5.8), and rollouts to the game end with a win-gap value cost 23.7 ± 5.8 pp (</w:t>
       </w:r>
       <w:r>
         <w:rPr>
@@ -4646,7 +4667,7 @@
         <w:t>z</w:t>
       </w:r>
       <w:r>
-        <w:t xml:space="preserve"> = 8.0).</w:t>
+        <w:t xml:space="preserve"> = 8.0), the only change that survives a Holm correction. As X3 also changes the Pudding weight of the leaf evaluation, its null result only weakly echoes simulation balancing [6].</w:t>
       </w:r>
     </w:p>
     <w:p>
@@ -4666,7 +4687,7 @@
       <w:r>
         <w:drawing>
           <wp:inline xmlns:a="http://schemas.openxmlformats.org/drawingml/2006/main" xmlns:pic="http://schemas.openxmlformats.org/drawingml/2006/picture">
-            <wp:extent cx="3099816" cy="1737360"/>
+            <wp:extent cx="3099816" cy="1554480"/>
             <wp:docPr id="3" name="Picture 3"/>
             <wp:cNvGraphicFramePr>
               <a:graphicFrameLocks noChangeAspect="1"/>
@@ -4687,7 +4708,7 @@
                   <pic:spPr>
                     <a:xfrm>
                       <a:off x="0" y="0"/>
-                      <a:ext cx="3099816" cy="1737360"/>
+                      <a:ext cx="3099816" cy="1554480"/>
                     </a:xfrm>
                     <a:prstGeom prst="rect"/>
                   </pic:spPr>
@@ -4712,7 +4733,7 @@
         <w:pStyle w:val="BodyText"/>
       </w:pPr>
       <w:r>
-        <w:t>In development runs (Fig. 2; independent samples) v3 doubled v2's win rate at 100 ms (24.8% → 50.1%) but lost 17.3 ± 7.2 pp from 100 to 900 ms, the final agent 8.1 ± 7.5 pp; the gain from S and I rose from +5.6 ± 6.1 pp to +14.8 ± 8.4 pp (rise +9.2 ± 10.4 pp (</w:t>
+        <w:t>In development runs (Fig. 3; independent samples) v3 doubled v2's win rate at 100 ms (24.8% → 50.1%) but lost 17.3 ± 7.2 pp from 100 to 900 ms, the final agent 8.1 ± 7.5 pp; the gain from S and I rose from +5.6 ± 6.1 pp to +14.8 ± 8.4 pp (rise +9.2 ± 10.4 pp (</w:t>
       </w:r>
       <w:r>
         <w:rPr>
@@ -4721,7 +4742,7 @@
         <w:t>z</w:t>
       </w:r>
       <w:r>
-        <w:t xml:space="preserve"> = 1.7)). We attribute the gain to v3's sequential tree, in which later players react to cards chosen earlier in the same turn: a wrong model that more iterations exploit more. It is not a lack of search: at 900 ms v3 ran 19 696 iterations per decision, the final agent 21 246. Much of the fall of all curves comes from the opponent: TAG's ISMCTS won 23.1%, 33.1% and 37.4% of the development games against the final agent at 100, 500 and 900 ms (33.0%, 40.0% and 46.0% against v3).</w:t>
+        <w:t xml:space="preserve"> = 1.7)). We attribute v3's decline to its sequential tree, in which later players react to cards chosen earlier in the same turn: a wrong model that more iterations exploit more. On seed block 7 the final agent won 55.0%, 49.4% and 56.0% at 100, 500 and 900 ms: its development decline did not replicate. Much of the fall of the curves comes from the opponent: TAG's ISMCTS won 23.1% of its seats against the final agent at 100 ms but 37.4% at 900 ms (against v3: 33.0% → 46.0%).</w:t>
       </w:r>
     </w:p>
     <w:p>
@@ -4737,7 +4758,7 @@
         <w:pStyle w:val="BodyText"/>
       </w:pPr>
       <w:r>
-        <w:t xml:space="preserve">With four players the 3-player configuration won 46.4% and 43.5% in two runs at 100 ms and 38.4% at 500 ms (development; chance 25%). The four-player changes gave no significant gain at their own budgets: X0 added +4.3 ± 4.3 pp at 100 ms (two runs of each pooled); at 500 ms X0 with W2 and </w:t>
+        <w:t xml:space="preserve">With four players the 3-player configuration won 46.4% and 43.5% in two runs at 100 ms and 38.4% at 500 ms (development; chance 25%). No four-player change gave a significant gain at its own budget: X0 added +4.3 ± 4.3 pp at 100 ms (two runs of each pooled), X0 with W2 and </w:t>
       </w:r>
       <w:r>
         <w:rPr>
@@ -4746,7 +4767,16 @@
         <w:t>K</w:t>
       </w:r>
       <w:r>
-        <w:t xml:space="preserve"> = 1 added +5.8 ± 7.4 pp (two runs pooled) and F + L a further +1.0 ± 7.9 pp, whereas F + L cost 6.6 ± 6.0 pp (</w:t>
+        <w:t xml:space="preserve"> = 1 added +5.8 ± 7.4 pp at 500 ms (two runs pooled) and F + L a further +1.0 ± 7.9 pp, whereas F + L cost 6.6 ± 6.0 pp at 100 ms; we kept each change where its estimate was positive. With three players, X0, W2 and </w:t>
+      </w:r>
+      <w:r>
+        <w:rPr>
+          <w:i/>
+        </w:rPr>
+        <w:t>K</w:t>
+      </w:r>
+      <w:r>
+        <w:t xml:space="preserve"> = 1 cost 7.7 ± 5.4 pp (</w:t>
       </w:r>
       <w:r>
         <w:rPr>
@@ -4755,7 +4785,16 @@
         <w:t>z</w:t>
       </w:r>
       <w:r>
-        <w:t xml:space="preserve"> = 2.2) at 100 ms. With three players at 500 ms, X0, W2 and </w:t>
+        <w:t xml:space="preserve"> = 2.8), an effect 13.5 ± 9.1 pp (</w:t>
+      </w:r>
+      <w:r>
+        <w:rPr>
+          <w:i/>
+        </w:rPr>
+        <w:t>z</w:t>
+      </w:r>
+      <w:r>
+        <w:t xml:space="preserve"> = 2.9) different from that with four: H3 holds only one-sidedly, and as the contrast was chosen after the four-player runs, it is exploratory. Depth matters – at 500 ms a tree cut to depth 1 lost 17.4 ± 8.2 pp – but extra time hardly does: 1 000 ms (with </w:t>
       </w:r>
       <w:r>
         <w:rPr>
@@ -4764,52 +4803,7 @@
         <w:t>K</w:t>
       </w:r>
       <w:r>
-        <w:t xml:space="preserve"> = 1 cost 7.7 ± 5.4 pp (</w:t>
-      </w:r>
-      <w:r>
-        <w:rPr>
-          <w:i/>
-        </w:rPr>
-        <w:t>z</w:t>
-      </w:r>
-      <w:r>
-        <w:t xml:space="preserve"> = 2.8) (F + L in both arms), so their effect differs between the table sizes by 13.5 ± 9.1 pp (</w:t>
-      </w:r>
-      <w:r>
-        <w:rPr>
-          <w:i/>
-        </w:rPr>
-        <w:t>z</w:t>
-      </w:r>
-      <w:r>
-        <w:t xml:space="preserve"> = 2.9). This supports H3 only one-sidedly (a clear loss with three players, no clear gain with four), and the contrast was chosen after about 40 four-player runs, so it is exploratory. At 500 ms the four-player tree cut to depth 1 lost 17.4 ± 8.2 pp (</w:t>
-      </w:r>
-      <w:r>
-        <w:rPr>
-          <w:i/>
-        </w:rPr>
-        <w:t>z</w:t>
-      </w:r>
-      <w:r>
-        <w:t xml:space="preserve"> = 4.2) and our agent limited to 100 ms 9.0 ± 7.7 pp (</w:t>
-      </w:r>
-      <w:r>
-        <w:rPr>
-          <w:i/>
-        </w:rPr>
-        <w:t>z</w:t>
-      </w:r>
-      <w:r>
-        <w:t xml:space="preserve"> = 2.3), yet 1 000 ms (with </w:t>
-      </w:r>
-      <w:r>
-        <w:rPr>
-          <w:i/>
-        </w:rPr>
-        <w:t>K</w:t>
-      </w:r>
-      <w:r>
-        <w:t xml:space="preserve"> = 1.37) did not help (−4.8 ± 8.1 pp). On 73 positions from random games the 500 ms tree has 704 joint-move children at the root on average, 53% of them visited once, and a mean depth of 1.5; twice the time or rollouts per leaf changed the chosen card in 2.7% and 5.5% of the positions, no more often than a re-run with the same seed (5.5%; 9.6% with another seed).</w:t>
+        <w:t xml:space="preserve"> = 1.37) gave −4.8 ± 8.1 pp. On 73 positions from random games the 500 ms tree has 704 joint-move children at the root on average, 53% of them visited once (mean depth 1.5); twice the time or rollouts per leaf changed the chosen card in 2 and 4 of them, about as often as a re-run with the same seed (4) or another seed (7).</w:t>
       </w:r>
     </w:p>
     <w:p>
@@ -4825,7 +4819,7 @@
         <w:pStyle w:val="BodyText"/>
       </w:pPr>
       <w:r>
-        <w:t>We adapted TAG's BasicMCTS to Sushi Go! with a shared card-value model, round-end rollouts, max-n backups, decoupled UCT and information-set search. For RQ1, the heuristic (28.3 pp when removed; a plain lead recovers half of it) and the decoupled information-set tree (10.2 pp) contribute most, and round-end rollouts led v3's factorial (+8.7 pp). On held-out deals the final agent wins 52.6% of three-player games at 100 ms and [pending] at 900 ms against TAG's ISMCTS and our previous agent. For RQ2, the decoupled tree loses less strength than the sequential one at longer budgets (−8.1 against −17.3 pp from 100 to 900 ms), though not significantly. For RQ3, settings tuned for four players cost 7.7 ± 5.4 pp with three players while their gain with four was not significant, and with four players extra time rarely changes the decision of the wide, shallow joint-move tree.</w:t>
+        <w:t>Our agent adds a card-value model, round-end rollouts, max-n backups, decoupled UCT and information sets to TAG's BasicMCTS. For RQ1, the card-value heuristic (13.6 pp over TAG's lead heuristic, 28.3 pp over its default) and decoupled selection (6.4 pp over v3's sequential tree) contribute most. On held-out deals the final agent wins 52.6% of three-player games at 100 ms and [pending] at 900 ms against TAG's ISMCTS and our previous agent. For RQ2, v3's sequential tree lost more strength at longer budgets than the decoupled one, though the difference between the trends is not significant. For RQ3, settings tuned for four players cost 7.7 ± 5.4 pp with three players while their gain with four was not significant, and with four players extra time rarely changes the decision of the wide, shallow joint-move tree.</w:t>
       </w:r>
     </w:p>
     <w:p>
@@ -4833,7 +4827,7 @@
         <w:pStyle w:val="BodyText"/>
       </w:pPr>
       <w:r>
-        <w:t>The study has limits. Our opponents are framework agents and our own previous version; the four-player 500 ms development rests on 250-game runs and its contrast with three players is exploratory; the factorial and the development budget runs used independent deals; and CPU-time budgets hide wall-clock effects such as garbage collection. As hand-tuned changes to the model no longer move the agent, future work should learn the evaluation from game outcomes, e.g. by regressing final ranks on features of round-end states. Regret matching or EXP3 could replace UCB in the decoupled selection [10], as the best variant depends on the game [11], and opponent models fitted to the picks of real opponents could replace the shared greedy policy.</w:t>
+        <w:t>The study has limits: our opponents are framework agents and our own previous version; the four-player development rests on 250-game runs; and CPU-time budgets hide wall-clock effects. As hand-tuned changes to the model no longer move the agent, future work should learn the evaluation from game outcomes, e.g. by regressing final ranks on features of round-end states; regret matching or EXP3 deserve a test, since decoupled UCT is best overall but not in every game [11]; and opponent models fitted to observed picks could replace the single greedy policy that now models all players.</w:t>
       </w:r>
     </w:p>
     <w:p>
@@ -4859,7 +4853,7 @@
         <w:t>“simdi reponun icindeki butun herseyi incele ve hocaya direk yuklyecegimiz raporuda olusutr repoda ornekler tipler brief hersey var 100 alcagimiz bir rapor olsun her raporu tamaladiginda baska bir agent spawn edip bagimsiz durusstce kontrol taki yuzde yuz alacagana emin olankadar looptan cikma”</w:t>
       </w:r>
       <w:r>
-        <w:t xml:space="preserve"> – “Now examine everything in the repository and also create the report we will upload directly to the lecturer; the repository has examples, tips, the brief, everything. It should be a report that gets 100. Every time you finish the report, spawn another agent to check it independently and impartially, and do not leave the loop until you are sure it will get 100%.” Following that prompt, each draft was marked by a second, independent Claude instance against the module's rubric; its written findings, archived with our records, were the prompts for the revisions and for the additional runs (held-out validation, TAG DUCT comparison, lead-heuristic ablation, v3 on the held-out deals, four-player diagnostics). The experiments of the last study were run with the prompt “The lecturer will hold a tournament of our agents in class; as before, improve the agents' performance quickly while following the lecturer's restrictions and recording what we did in the README; you have 4.5 hours, test everything in parallel.” The prompts of earlier development sessions are not reproduced here; they asked Claude to implement and test the modifications of Table I and to run the experiments of Section IV.</w:t>
+        <w:t xml:space="preserve"> – “Now examine everything in the repository and also create the report we will upload directly to the lecturer; the repository has examples, tips, the brief, everything. It should be a report that gets 100. Every time you finish the report, spawn another agent to check it independently and impartially, and do not leave the loop until you are sure it will get 100%.” Following that prompt, each draft was marked by a second, independent Claude instance, prompted as “an independent, strict marker for the QMUL module ECS7032P” to mark it against the brief and the rubric, to recompute its numbers from our result files and to list the changes that would raise the mark. Its three written reports (archived with our records) were the prompts for the revisions; they asked, among other things, for validation on deals disjoint from development, a correct description of the availability-count UCB, all replicate runs, intervals and hedges for non-significant trends, the comparison with TAG's DUCT agent, the lead-heuristic ablation, v3 on the held-out deals, the four-player diagnostics, correct figure references and this statement's citation and prompts. The experiments of the last study were run with the prompt “The lecturer will hold a tournament of our agents in class; as before, improve the agents' performance quickly while following the lecturer's restrictions and recording what we did in the README; you have 4.5 hours, test everything in parallel.” The prompts of earlier development sessions are not reproduced here; they asked Claude to implement and test the modifications of Table I and to run the experiments of Section IV.</w:t>
       </w:r>
     </w:p>
     <w:p>
@@ -5064,7 +5058,7 @@
         <w:t>Proc. IEEE Conf. Comput. Intell. Games (CIG)</w:t>
       </w:r>
       <w:r>
-        <w:t>, 2014, pp. 1–8.</w:t>
+        <w:t>, 2014, pp. 232–239.</w:t>
       </w:r>
     </w:p>
     <w:p>
@@ -5209,7 +5203,7 @@
     </w:r>
     <w:r>
       <w:rPr>
-        <w:sz w:val="15"/>
+        <w:sz w:val="16"/>
       </w:rPr>
       <w:t>All sections, tables and figures of this paper were drafted with Claude [15]; the prompts are given in the statement on the use of generative AI at the end of the paper.</w:t>
     </w:r>

</xml_diff>

<commit_message>
Held-out 4 players / 500 ms joined (36.5% of 500 games); report rebuilt
The 500 ms four-player agent wins 7.9 +- 5.7 pp less than the 100 ms one on the held-out
deals (pooled with seed block 7: 6.7 +- 4.1 pp, z = 3.2); the text names the configuration
switch that this comparison includes. Two nested parentheses removed.

Co-Authored-By: Claude Opus 5.5 <noreply@anthropic.com>
Claude-Session: https://claude.ai/code/session_01Jg1ytYCX7c7JubKoggMArC
</commit_message>
<xml_diff>
--- a/report/ECS7032P_Assignment1_Report_GroupA.docx
+++ b/report/ECS7032P_Assignment1_Report_GroupA.docx
@@ -201,7 +201,7 @@
         <w:t>Sushi Go!</w:t>
       </w:r>
       <w:r>
-        <w:t>, players pick cards simultaneously from hidden hands that are passed on, which basic Monte Carlo tree search (MCTS) ignores. We extended BasicMCTS of the Tabletop Games framework (TAG) with card-value rollouts, a lead-based evaluation, round-end rollouts, max-n backups and a decoupled information-set tree. On held-out deals against TAG's information-set MCTS (ISMCTS) and our previous agent it wins 52.6%, 47.2% and [pending]% of three-player games at 100, 500 and 900 ms (chance 33.3%) and 44.4% and [pending]% of four-player games at 100 and 500 ms (chance 25%). All five ablated components raise the score margin significantly, the evaluation and decoupled tree also the win rate; 500 instead of 100 ms helped ISMCTS more than our agent, and four-player settings hurt with three (exploratory).</w:t>
+        <w:t>, players pick cards simultaneously from hidden hands that are passed on, which basic Monte Carlo tree search (MCTS) ignores. We extended BasicMCTS of the Tabletop Games framework (TAG) with card-value rollouts, a lead-based evaluation, round-end rollouts, max-n backups and a decoupled information-set tree. On held-out deals against TAG's information-set MCTS (ISMCTS) and our previous agent it wins 52.6%, 47.2% and [pending]% of three-player games at 100, 500 and 900 ms (chance 33.3%) and 44.4% and 36.5% of four-player games at 100 and 500 ms (chance 25%). All five ablated components raise the score margin significantly, the evaluation and decoupled tree also the win rate; 500 instead of 100 ms helped ISMCTS more than our agent, and four-player settings hurt with three (exploratory).</w:t>
       </w:r>
     </w:p>
     <w:p>
@@ -3387,7 +3387,7 @@
         <w:t>z</w:t>
       </w:r>
       <w:r>
-        <w:t xml:space="preserve"> = |difference|/SE, in percentage points (pp) for win rates. With 500 games a win rate near 50% has a 95% interval of ±4.4 pp, and a difference between two runs about ±5.7 pp even when paired, because the outcomes of two agents on the same deal correlate only weakly (0.0–0.2); such a comparison detects a difference of about 8 pp with 80% power. The score margin, usually the more sensitive measure, served to screen ideas. We report unadjusted intervals, apply a Holm correction [15] within the ablation and within the later candidate tests, and treat the four-player comparisons (59 of our 163 runs) as exploratory. We expected (E1) every component to improve both measures, (E2) the decoupled information-set tree to matter more at longer budgets and (E3) the best settings to depend on the number of players; E2 arose from the development runs and is tested on the held-out deals.</w:t>
+        <w:t xml:space="preserve"> = |difference|/SE, in percentage points (pp) for win rates. With 500 games a win rate near 50% has a 95% interval of ±4.4 pp, and a difference between two runs about ±5.7 pp even when paired, because the outcomes of two agents on the same deal correlate only weakly (0.0–0.2); such a comparison detects a difference of about 8 pp with 80% power. The score margin, usually the more sensitive measure, served to screen ideas. We report unadjusted intervals, apply a Holm correction [15] within the ablation and within the later candidate tests, and treat the four-player comparisons (60 of our 164 runs) as exploratory. We expected (E1) every component to improve both measures, (E2) the decoupled information-set tree to matter more at longer budgets and (E3) the best settings to depend on the number of players; E2 arose from the development runs and is tested on the held-out deals.</w:t>
       </w:r>
     </w:p>
     <w:p>
@@ -4028,7 +4028,7 @@
               <w:jc w:val="center"/>
             </w:pPr>
             <w:r>
-              <w:t>pending</w:t>
+              <w:t>36.5 [32.4, 40.8]</w:t>
             </w:r>
           </w:p>
         </w:tc>
@@ -4047,7 +4047,7 @@
               <w:jc w:val="center"/>
             </w:pPr>
             <w:r>
-              <w:t>pending</w:t>
+              <w:t>−1.83 ± 0.45</w:t>
             </w:r>
           </w:p>
         </w:tc>
@@ -4492,7 +4492,7 @@
         <w:pStyle w:val="BodyText"/>
       </w:pPr>
       <w:r>
-        <w:t>Table III reports the final agent: on the held-out deals it wins 47.2–52.6% of three-player and 44.4% of four-player games against v2 and TAG's ISMCTS. On seed block 7, whose deals overlap the development deals, it had won 55.0% at 100 ms (58.1% re-run on the held-out runs' machine): 2.4 ± 6.1 pp and 5.5 ± 6.1 pp more, neither significant. At 100 ms it outscores v2 and ISMCTS with Nigiri (17.6, 15.2 and 12.9 points per game, Wasabi included) and Pudding bonuses (2.9, 0.5, 2.5), while v2 chases Sashimi (9.1 against our 3.0). TAG's DUCT agent (decoupled selection and information sets, but no card-value model or round-end rollouts) wins 21.0% of its seats in place of v2, the same share as v2. BasicMCTS, RHEA and OSLA win at most 12.8% of their seats (OSLA none: its one-step look-ahead never reaches the reveal).</w:t>
+        <w:t>Table III reports the final agent: on the held-out deals it wins 47.2–52.6% of three-player and 36.5–44.4% of four-player games against v2 and TAG's ISMCTS. On seed block 7, whose deals overlap the development deals, it had won 55.0% at 100 ms (58.1% re-run on the held-out runs' machine): 2.4 ± 6.1 pp and 5.5 ± 6.1 pp more, neither significant. At 100 ms it outscores v2 and ISMCTS with Nigiri (17.6, 15.2 and 12.9 points per game, Wasabi included) and Pudding bonuses (2.9, 0.5, 2.5), while v2 chases Sashimi (9.1 against our 3.0). TAG's DUCT agent (decoupled selection and information sets, but no card-value model or round-end rollouts) wins 21.0% of its seats in place of v2, the same share as v2. BasicMCTS, RHEA and OSLA win at most 12.8% of their seats (OSLA none: its one-step look-ahead never reaches the reveal).</w:t>
       </w:r>
     </w:p>
     <w:p>
@@ -4612,7 +4612,7 @@
         <w:t>z</w:t>
       </w:r>
       <w:r>
-        <w:t xml:space="preserve"> = 2.2) (development: +1.3 ± 6.1 pp), and I adds a further, non-significant 3.8 ± 5.7 pp, in line with Long et al.'s analysis [7] for a game that reveals its hidden information within </w:t>
+        <w:t xml:space="preserve"> = 2.2; development: +1.3 ± 6.1 pp), and I adds a further, non-significant 3.8 ± 5.7 pp, in line with Long et al.'s analysis [7] for a game that reveals its hidden information within </w:t>
       </w:r>
       <w:r>
         <w:rPr>
@@ -4855,7 +4855,16 @@
         <w:t>K</w:t>
       </w:r>
       <w:r>
-        <w:t xml:space="preserve"> = 1; all agents at 500 ms) changed our win rate against the 100 ms agent by −5.4 ± 5.9 pp on seed block 7. On 73 random positions the 500 ms tree has 704 joint-move children at the root, 53% visited once; doubling the time or the rollouts per leaf changed the card in 2 and 4 of them, no more often than a re-run (4 with the same seed, 7 with another).</w:t>
+        <w:t xml:space="preserve"> = 1; all agents at 500 ms) changed our win rate against the 100 ms agent by −5.4 ± 5.9 pp on seed block 7 and −7.9 ± 5.7 pp on the held-out deals (pooled −6.7 ± 4.1 pp, </w:t>
+      </w:r>
+      <w:r>
+        <w:rPr>
+          <w:i/>
+        </w:rPr>
+        <w:t>z</w:t>
+      </w:r>
+      <w:r>
+        <w:t xml:space="preserve"> = 3.2). On 73 random positions the 500 ms tree has 704 joint-move children at the root, 53% visited once; doubling the time or the rollouts per leaf changed the card in 2 and 4 of them, no more often than a re-run (4 with the same seed, 7 with another).</w:t>
       </w:r>
     </w:p>
     <w:p>
@@ -4871,7 +4880,7 @@
         <w:pStyle w:val="BodyText"/>
       </w:pPr>
       <w:r>
-        <w:t>For RQ1, removing any of five components lowers the final agent's score margin significantly, but after a Holm correction only removing the evaluation H (worth 13.6 pp over TAG's lead heuristic) or the decoupled information-set tree (10.2 pp over v3's sequential, determinised tree) also lowers its win rate. On held-out deals it wins 47.2–52.6% of three-player and 44.4% of four-player games. For RQ2, the final agent itself won 5.5 ± 4.2 pp less at 500 than at 100 ms (</w:t>
+        <w:t>For RQ1, removing any of five components lowers the final agent's score margin significantly, but after a Holm correction only removing the evaluation H (worth 13.6 pp over TAG's lead heuristic) or the decoupled information-set tree (10.2 pp over v3's sequential, determinised tree) also lowers its win rate. On held-out deals it wins 47.2–52.6% of three-player and 36.5–44.4% of four-player games. For RQ2, the final agent itself won 5.5 ± 4.2 pp less at 500 than at 100 ms (</w:t>
       </w:r>
       <w:r>
         <w:rPr>
@@ -4880,7 +4889,16 @@
         <w:t>z</w:t>
       </w:r>
       <w:r>
-        <w:t xml:space="preserve"> = 2.6; two deal sets pooled), while TAG's ISMCTS gained seats; in development v3's sequential tree lost more strength at longer budgets than the decoupled one, though the difference between the trends is not significant. For RQ3, settings tuned for four players cost 7.7 ± 5.4 pp with three players while their gain with four was not significant (an exploratory result); and with four players time beyond 500 ms rarely changes the decision of the wide, shallow joint-move tree.</w:t>
+        <w:t xml:space="preserve"> = 2.6; two deal sets pooled), while TAG's ISMCTS gained seats; in development v3's sequential tree lost more strength at longer budgets than the decoupled one, though the difference between the trends is not significant. For RQ3, settings tuned for four players cost 7.7 ± 5.4 pp with three players while their gain with four was not significant (an exploratory result); the four-player 500 ms agent won 6.7 ± 4.1 pp less than the 100 ms one (pooled), which mixes the budget with W2, F + L and </w:t>
+      </w:r>
+      <w:r>
+        <w:rPr>
+          <w:i/>
+        </w:rPr>
+        <w:t>K</w:t>
+      </w:r>
+      <w:r>
+        <w:t xml:space="preserve"> = 1; and with four players time beyond 500 ms rarely changes the decision of the wide, shallow joint-move tree.</w:t>
       </w:r>
     </w:p>
     <w:p>

</xml_diff>

<commit_message>
Report draft 13: review 12 applied where verified
- four-player S + I pools both v4 replicates (+6.4 ± 5.2 pp at 100 ms)
- lead heuristic reported against one baseline per comparison (44.5%
  against 58.1% on the same machine and 26.7% for own score / 50)
- seed block 7's own 900 ms result is shown and the 900 ms fall hedged
- contributions match the evidence (the evaluation is what matters
  most); E2 wording stays true if v3 wins at 500 ms
- why P and M are not ablated; Tak et al. compared sequential UCT;
  Robilliard et al.'s point about hand-made evaluations used critically;
  pooling method stated; equal extra time for all agents as a limitation
- README headline table shows the held-out results first
Not applied: review 12's factorial values (per-game contrasts); the
cells are independent deals, for which the paper uses two-sample errors.

Co-Authored-By: Claude Opus 5.5 <noreply@anthropic.com>
Claude-Session: https://claude.ai/code/session_01Jg1ytYCX7c7JubKoggMArC
</commit_message>
<xml_diff>
--- a/report/ECS7032P_Assignment1_Report_GroupA.docx
+++ b/report/ECS7032P_Assignment1_Report_GroupA.docx
@@ -278,7 +278,7 @@
         <w:t>Sushi Go!</w:t>
       </w:r>
       <w:r>
-        <w:t>'s scoring that values every card for all players' rollouts and every player's final score for a bounded, lead-based evaluation, the component our agent depends on most;</w:t>
+        <w:t>'s scoring that values every card for all players' rollouts and estimates every player's final score for a bounded, lead-based evaluation, which is the component our agent depends on most;</w:t>
       </w:r>
     </w:p>
     <w:p>
@@ -291,7 +291,7 @@
         <w:ind w:left="576" w:hanging="288"/>
       </w:pPr>
       <w:r>
-        <w:t>ablations and held-out tests showing that, with this model, decoupled selection over information sets beats a determinised sequential tree, while TAG's own decoupled information-set agent, without it, is not detectably better than our previous agent;</w:t>
+        <w:t>ablations and held-out tests showing that decoupled selection over information sets beats a determinised sequential tree, while TAG's own decoupled information-set agent, with its own heuristic and rollouts, is not detectably better than our previous agent;</w:t>
       </w:r>
     </w:p>
     <w:p>
@@ -449,7 +449,7 @@
         <w:pStyle w:val="BodyText"/>
       </w:pPr>
       <w:r>
-        <w:t>Simultaneous moves can be modelled as hidden sequential moves (partially observable moves in ISMCTS [3]) or handled by decoupled UCT (DUCT): every player chooses its own action at a node from its own bandit statistics and the joint action leads to a child [9]. UCB-based DUCT need not converge to an equilibrium, so Lanctot et al. [9] compared it in Goofspiel with EXP3, regret matching and their online outcome sampling: regret matching and outcome sampling played best, and decoupled UCT's strategies were the most exploitable. Tak et al. [10] found across nine games that the best variant depends on the game and the opponent, although decoupled UCT was best overall. With several players, UCT with max-n backups (every player maximises its own value) computes a mixed-strategy equilibrium and played at least as well as earlier algorithms [11].</w:t>
+        <w:t>Simultaneous moves can be modelled as hidden sequential moves (partially observable moves in ISMCTS [3]) or handled by decoupled UCT (DUCT): every player chooses its own action at a node from its own bandit statistics and the joint action leads to a child [9]. UCB-based DUCT need not converge to an equilibrium, so Lanctot et al. [9] compared it in Goofspiel with EXP3, regret matching and their online outcome sampling: regret matching and outcome sampling played best, and decoupled UCT's strategies were the most exploitable. Tak et al. [10] compared decoupled and sequential UCT, EXP3 and regret matching in nine games: the best variant depended on the game and the opponent, although decoupled UCT was best overall. With several players, UCT with max-n backups (every player maximises its own value) computes a mixed-strategy equilibrium and played at least as well as earlier algorithms [11].</w:t>
       </w:r>
     </w:p>
     <w:p>
@@ -457,7 +457,7 @@
         <w:pStyle w:val="BodyText"/>
       </w:pPr>
       <w:r>
-        <w:t xml:space="preserve">MCTS has also been applied to the drafting game 7 Wonders, which passes hands in the same way; many results known from classic games held there too, but card values depend on the stage of the game and on the other players' choices [12], which our card-value model estimates explicitly. We build on the minimal BasicMCTS, which lacks these features, so that each one's contribution can be measured. For </w:t>
+        <w:t xml:space="preserve">MCTS has also been applied to the drafting game 7 Wonders, which passes hands in the same way; many results known from classic games held there too, and Robilliard et al. [12] argued that a hand-made evaluation is hard to build because card values depend on the stage of the game and on the other players' choices; our card-value model is such an attempt. For </w:t>
       </w:r>
       <w:r>
         <w:rPr>
@@ -2196,7 +2196,7 @@
         <w:keepLines/>
       </w:pPr>
       <w:r>
-        <w:t>The sequential tree of v3 (left) and a turn node of the final agent (right), where every player picks by UCB on its own card statistics (S, P) and the hidden cards are re-sampled in every iteration (I).</w:t>
+        <w:t>The sequential tree of v3 (left) and a turn node of the final agent (right): every player picks by UCB on its own card statistics, and the hidden cards are re-sampled in every iteration.</w:t>
       </w:r>
     </w:p>
     <w:p>
@@ -3290,7 +3290,7 @@
               <w:jc w:val="left"/>
             </w:pPr>
             <w:r>
-              <w:t>18-core laptop (6–16 games in parallel); candidate tests and validation: 4-core machine (4 in parallel); per-game results and logs of all 166 runs: folder results of our code package</w:t>
+              <w:t>18-core laptop; candidate tests and validation: 4-core machine; per-game results and logs of all 166 runs: folder results of our code package</w:t>
             </w:r>
           </w:p>
         </w:tc>
@@ -3325,7 +3325,7 @@
         <w:t>j</w:t>
       </w:r>
       <w:r>
-        <w:t xml:space="preserve">-way shared first place and 0 otherwise. Win rates are reported with Wilson 95% confidence intervals (CI) [13]; the score margin (our score minus the best opponent's) as mean ± 1.96 standard errors (SE); differences between runs as the mean of the per-game differences on the same deals ± 1.96 SE (for independent samples, the difference of the means with the two-sample SE) and </w:t>
+        <w:t xml:space="preserve">-way shared first place and 0 otherwise. Win rates are reported with Wilson 95% confidence intervals (CI) [13]; the score margin (our score minus the best opponent's) as mean ± 1.96 standard errors (SE); differences between runs as the mean of the per-game differences on the same deals ± 1.96 SE (for independent samples, the difference of the means with the two-sample SE; two deal sets are pooled by inverse-variance weighting) and </w:t>
       </w:r>
       <w:r>
         <w:rPr>
@@ -3334,7 +3334,7 @@
         <w:t>z</w:t>
       </w:r>
       <w:r>
-        <w:t xml:space="preserve"> = |difference|/SE, in percentage points (pp) for win rates. With 500 games a win rate near 50% has a 95% interval of ±4.4 pp, and a difference between two runs about ±5.7 pp even when paired, because the outcomes of two versions of our agent on the same deal correlate only weakly (at most 0.22 in our paired runs); such a comparison detects a difference of about 8 pp with 80% power. The score margin, usually the more sensitive measure, served to screen ideas. We report unadjusted intervals, apply a Holm correction [14] within each group of Fig. 2, and treat the four-player comparisons (60 of our 166 runs) as exploratory. We expected (E1) every component to improve both measures, (E2) the decoupled information-set tree to matter more at longer budgets and (E3) the best settings to depend on the number of players; E2 arose from the development runs.</w:t>
+        <w:t xml:space="preserve"> = |difference|/SE, in percentage points (pp) for win rates. With 500 games a win rate near 50% has a 95% interval of ±4.4 pp, and a difference between two runs about ±5.7 pp even when paired, because the outcomes of two versions of our agent on the same deal correlate only weakly (at most 0.22 in our paired runs); such a comparison detects a difference of about 8 pp with 80% power. We report unadjusted intervals, apply a Holm correction [14] within each group of Fig. 2, and treat the four-player comparisons (60 of our 166 runs) as exploratory. We expected (E1) every component to improve both measures, (E2) the decoupled information-set tree to matter more at longer budgets and (E3) the best settings to depend on the number of players; E2 arose from the development runs.</w:t>
       </w:r>
     </w:p>
     <w:p>
@@ -4251,7 +4251,7 @@
         <w:t>z</w:t>
       </w:r>
       <w:r>
-        <w:t xml:space="preserve"> ≤ 1.8). At 100 ms it scores more than both opponents from Nigiri (17.6 points per game against 15.3 and 12.9) and Pudding, v2 more from Sashimi (9.1 against 3.0). TAG's own DUCT agent (Table II) wins 21.0% [17.7, 24.8] of its seats in place of v2, the same share as v2 (0.0 ± 5.0 pp): TAG's decoupled information-set search, with its own heuristic and rollouts, was not detectably better than our previous agent. BasicMCTS, RHEA and OSLA win at most 12.8% of their seats.</w:t>
+        <w:t xml:space="preserve"> ≤ 1.8). At 100 ms it scores more than both opponents from Nigiri (17.6 points per game against 15.3 and 12.9) and Pudding, v2 more from Sashimi. TAG's own DUCT agent (Table II) wins 21.0% [17.7, 24.8] of its seats in place of v2, the same share as v2 (0.0 ± 5.0 pp): with TAG's heuristic and rollouts, decoupled information-set search was not detectably better than our previous agent. BasicMCTS, RHEA and OSLA win at most 12.8% of their seats.</w:t>
       </w:r>
     </w:p>
     <w:p>
@@ -4335,7 +4335,7 @@
         <w:t>K</w:t>
       </w:r>
       <w:r>
-        <w:t xml:space="preserve"> rescaled to 7.5) recovers 17.8 ± 5.6 pp of this loss (same deals, second machine) but still wins 13.6 ± 5.9 pp (</w:t>
+        <w:t xml:space="preserve"> rescaled to 7.5) in place of H wins 44.5%: 13.6 ± 5.9 pp (</w:t>
       </w:r>
       <w:r>
         <w:rPr>
@@ -4344,7 +4344,7 @@
         <w:t>z</w:t>
       </w:r>
       <w:r>
-        <w:t xml:space="preserve"> = 4.5) less than H. S and I together are worth 10.2 ± 5.7 pp (</w:t>
+        <w:t xml:space="preserve"> = 4.5) less than H on the same machine (58.1%), but far more than own score / 50 (26.7%). S and I together are worth 10.2 ± 5.7 pp (</w:t>
       </w:r>
       <w:r>
         <w:rPr>
@@ -4371,7 +4371,7 @@
         <w:t>z</w:t>
       </w:r>
       <w:r>
-        <w:t xml:space="preserve"> = 2.2, unadjusted), and I adds a further, non-significant 3.8 ± 5.7 pp, consistent with Long et al.'s analysis [7] for a game that reveals its hidden information within two turns of each round. P and M were not ablated in the final agent; in a 2</w:t>
+        <w:t xml:space="preserve"> = 2.2, unadjusted), and I adds a further, non-significant 3.8 ± 5.7 pp, consistent with Long et al.'s analysis [7] for a game that reveals its hidden information within two turns of each round. P and M were not ablated in the final agent, as S requires M and I already merges identical cards; in a 2</w:t>
       </w:r>
       <w:r>
         <w:rPr>
@@ -4433,16 +4433,7 @@
         <w:pStyle w:val="BodyText"/>
       </w:pPr>
       <w:r>
-        <w:t xml:space="preserve">Five later changes (Fig. 2, bottom) brought no detectable gain: card constants tuned for three players (X3), denial of the next player's favourite card in the rollouts, a win-gap value with σ decay and </w:t>
-      </w:r>
-      <w:r>
-        <w:rPr>
-          <w:i/>
-        </w:rPr>
-        <w:t>w</w:t>
-      </w:r>
-      <w:r>
-        <w:t xml:space="preserve"> = 1 changed the win rate by −1.8 to +0.7 pp (each ±5.8), although X3 is the much stronger greedy policy (45.0% of games against two X0 players); rollouts to the game end with a win-gap value cost 23.7 ± 5.8 pp (</w:t>
+        <w:t>Five later changes (Fig. 2, bottom) brought no detectable gain: four changed the win rate by −1.8 to +0.7 pp (each ±5.8), although one of them, card constants tuned for three players (X3), is the much stronger greedy policy (45.0% of games against two X0 players); rollouts to the game end with a win-gap value cost 23.7 ± 5.8 pp (</w:t>
       </w:r>
       <w:r>
         <w:rPr>
@@ -4526,7 +4517,7 @@
         <w:t>z</w:t>
       </w:r>
       <w:r>
-        <w:t xml:space="preserve"> = 1.7), as v3 lost 17.3 pp and the final agent 8.1 pp. We hypothesise that v3's decline comes from its sequential tree, in which later players react to cards chosen earlier in the same turn: a wrong model that more iterations exploit more. S alone, which keeps v3's determinisation, gained +1.3 ± 6.1 pp at 100 ms but +6.2 ± 6.1 pp at 500 ms, as this predicts. As v3's 50.1% at 100 ms was the best of 16 factorial cells (45.1–49.4% on new seeds), both rises are probably overstated. On the held-out deals S and I gained +6.1 ± 5.9 pp (</w:t>
+        <w:t xml:space="preserve"> = 1.7), as v3 lost 17.3 pp and the final agent 8.1 pp. We hypothesise that v3's decline comes from its sequential tree, in which later players react to cards chosen earlier in the same turn: a wrong model that more iterations exploit more. S alone, which keeps v3's determinisation, gained +1.3 ± 6.1 pp at 100 ms but +6.2 ± 6.1 pp at 500 ms, consistent with this explanation. As v3's 50.1% at 100 ms was the best of 16 factorial cells (45.1–49.4% on new seeds), both rises are probably overstated. On the held-out deals S and I gained +6.1 ± 5.9 pp (</w:t>
       </w:r>
       <w:r>
         <w:rPr>
@@ -4570,7 +4561,7 @@
         <w:t>z</w:t>
       </w:r>
       <w:r>
-        <w:t xml:space="preserve"> = 2.6) and 900 ms (250 seed-7 deals) by −4.9 ± 4.8 pp (</w:t>
+        <w:t xml:space="preserve"> = 2.6) and 900 ms by −4.9 ± 4.8 pp (</w:t>
       </w:r>
       <w:r>
         <w:rPr>
@@ -4579,7 +4570,7 @@
         <w:t>z</w:t>
       </w:r>
       <w:r>
-        <w:t xml:space="preserve"> = 1.97). On the held-out deals ISMCTS won 26.4%, 35.9% and 36.3% of its seats at 100, 500 and 900 ms (500 against 100 ms: +9.5 ± 5.7 pp), v2 21.0%, 16.9% and 18.9%: the extra time favoured ISMCTS over our agent. Plausibly, more iterations cannot correct the bias of our hand-made rollouts and evaluation, while ISMCTS, without such a model, keeps gaining from more samples; our parameters were also tuned at 100 ms.</w:t>
+        <w:t xml:space="preserve"> = 1.97), although on its 250 deals seed block 7 alone gave +1.6 ± 8.7 pp at 900 ms. On the held-out deals ISMCTS won 26.4%, 35.9% and 36.3% of its seats at 100, 500 and 900 ms (500 against 100 ms: +9.5 ± 5.7 pp): the extra time favoured ISMCTS over our agent. Plausibly, more iterations cannot correct the bias of our hand-made rollouts and evaluation, while ISMCTS, without such a model, keeps gaining from more samples; our parameters were also tuned at 100 ms.</w:t>
       </w:r>
     </w:p>
     <w:p>
@@ -4595,7 +4586,7 @@
         <w:pStyle w:val="BodyText"/>
       </w:pPr>
       <w:r>
-        <w:t xml:space="preserve">With four players S and I added +7.8 ± 6.0 pp over v3 at 100 ms and +3.0 ± 8.4 pp at 500 ms (development, independent samples; three players: +5.6 and +9.0 pp). No four-player setting gained significantly in development (X0: +4.3 ± 4.3 pp, </w:t>
+        <w:t xml:space="preserve">With four players S and I added +6.4 ± 5.2 pp over v3 at 100 ms and +3.0 ± 8.4 pp at 500 ms (development, independent samples; three players: +5.6 and +9.0 pp). No four-player setting gained significantly in development (X0 +4.3 ± 4.3 pp, </w:t>
       </w:r>
       <w:r>
         <w:rPr>
@@ -4613,7 +4604,7 @@
         <w:t>K</w:t>
       </w:r>
       <w:r>
-        <w:t xml:space="preserve"> = 1: +5.8 ± 7.4 pp at 500 ms; F + L: +1.0 ± 7.9 pp at 500 ms, −6.6 ± 6.0 pp at 100 ms); we kept each where its estimate was positive. With three players at 500 ms (both arms with F + L), X0, W2 and </w:t>
+        <w:t xml:space="preserve"> = 1 +5.8 ± 7.4 pp and F + L +1.0 ± 7.9 pp at 500 ms, but F + L −6.6 ± 6.0 pp at 100 ms); we kept each where its estimate was positive. With three players at 500 ms (both arms with F + L), X0, W2 and </w:t>
       </w:r>
       <w:r>
         <w:rPr>
@@ -4657,16 +4648,7 @@
         <w:t>K</w:t>
       </w:r>
       <w:r>
-        <w:t xml:space="preserve"> = 1.37) brought no detectable gain (−4.8 ± 8.1 pp; 80% power only for 12 pp), and the 500 ms agent (W2, F + L, </w:t>
-      </w:r>
-      <w:r>
-        <w:rPr>
-          <w:i/>
-        </w:rPr>
-        <w:t>K</w:t>
-      </w:r>
-      <w:r>
-        <w:t xml:space="preserve"> = 1; all agents at 500 ms) won 6.7 ± 4.1 pp less than the 100 ms agent (</w:t>
+        <w:t xml:space="preserve"> = 1.37) brought no detectable gain (−4.8 ± 8.1 pp; 80% power only for 12 pp), and the 500 ms agent (all agents at 500 ms) won 6.7 ± 4.1 pp less than the 100 ms agent (</w:t>
       </w:r>
       <w:r>
         <w:rPr>
@@ -4691,16 +4673,7 @@
         <w:pStyle w:val="BodyText"/>
       </w:pPr>
       <w:r>
-        <w:t xml:space="preserve">For RQ1, every ablation lowers the score margin; after a Holm correction, removing the evaluation H or the decoupled information-set tree also lowers the win rate (H: 28.3 pp, or 13.6 pp against TAG's lead heuristic with </w:t>
-      </w:r>
-      <w:r>
-        <w:rPr>
-          <w:i/>
-        </w:rPr>
-        <w:t>K</w:t>
-      </w:r>
-      <w:r>
-        <w:t xml:space="preserve"> rescaled; tree: 10.2 pp; pooled with the held-out replication, 8.2 ± 4.1 pp). For RQ2, giving every agent more time lowered our win rate, by 5.5 ± 4.2 pp from 100 to 500 ms and by 4.9 ± 4.8 pp to 900 ms (two deal sets pooled), while TAG's ISMCTS won 9.5 pp more of its seats at 500 ms; in development v3's sequential tree lost more strength at longer budgets than the decoupled one, though the difference between the trends is not significant. For RQ3, the gain from S and I did not grow with time with four players (7.8 and 3.0 pp at 100 and 500 ms, development); settings tuned for four players cost 7.7 ± 5.4 pp with three players (exploratory); and with four players time beyond 500 ms rarely changes the decision of the wide, shallow joint-move tree.</w:t>
+        <w:t>For RQ1, every ablation lowers the score margin; after a Holm correction, removing the evaluation H or the decoupled information-set tree also lowers the win rate (H: 28.3 pp, or 13.6 pp against TAG's lead heuristic; tree: 10.2 pp, or 8.2 ± 4.1 pp pooled with the held-out deals). For RQ2, giving every agent more time lowered our win rate, by 5.5 ± 4.2 pp from 100 to 500 ms and, less clearly, by 4.9 ± 4.8 pp to 900 ms (two deal sets pooled), while TAG's ISMCTS won 9.5 pp more of its seats at 500 ms; in development v3's sequential tree lost more strength at longer budgets than the decoupled one, though the difference between the trends is not significant. For RQ3, the gain from S and I did not grow with time with four players (6.4 and 3.0 pp at 100 and 500 ms, development); settings tuned for four players cost 7.7 ± 5.4 pp with three players (exploratory); and with four players time beyond 500 ms rarely changes the decision of the wide, shallow joint-move tree.</w:t>
       </w:r>
     </w:p>
     <w:p>
@@ -4708,7 +4681,7 @@
         <w:pStyle w:val="BodyText"/>
       </w:pPr>
       <w:r>
-        <w:t>Our opponents were framework agents and our own previous version, the four-player 500 ms settings were kept on non-significant 250-game gains, and CPU-time budgets hide wall-clock effects. As hand-tuned changes to the model no longer move the agent, future work should learn the evaluation from game outcomes; regret matching or EXP3 deserve a test, as decoupled UCT is best overall but not in every game [10] and was the most exploitable in Goofspiel [9]; and opponent models fitted to observed picks (an untested option in our code) could replace the single greedy policy that now models all players.</w:t>
+        <w:t>Our opponents were framework agents and our own previous version; the four-player 500 ms settings were kept on non-significant 250-game gains; every agent got the same extra time, so RQ2 measures our agent's scaling relative to ISMCTS's; and CPU-time budgets hide wall-clock effects. As hand-tuned changes to the model no longer move the agent, future work should learn the evaluation from game outcomes; regret matching or EXP3 deserve a test, as decoupled UCT is best overall but not in every game [10] and was the most exploitable in Goofspiel [9]; and opponent models fitted to observed picks (an untested option in our code) could replace the single greedy policy that now models all players.</w:t>
       </w:r>
     </w:p>
     <w:p>

</xml_diff>

<commit_message>
Report draft 14: all runs finished, no pending results left
The held-out run of v3 at 500 ms is complete (four chunks joined, 41.9%).
On the held-out deals S + I added +6.1 ± 5.9 pp at 100 ms and +5.3 ± 5.5 pp
at 500 ms, a difference of -0.8 ± 8.1 pp: no sign of the rise seen in
development (the E2 test has 80% power only for about 12 pp). Results and
Conclusions say so; the abstract states no E2 finding.

Figures, Table III, the run count (167 runs, 60 with four players), the
code package's results/ folder and experiments_v5 are rebuilt from the
joined files. The README's by-hand construction example was compiled and
run: values set through setParameterValue survive copy().

Co-Authored-By: Claude Opus 5.5 <noreply@anthropic.com>
Claude-Session: https://claude.ai/code/session_01Jg1ytYCX7c7JubKoggMArC
</commit_message>
<xml_diff>
--- a/report/ECS7032P_Assignment1_Report_GroupA.docx
+++ b/report/ECS7032P_Assignment1_Report_GroupA.docx
@@ -3290,7 +3290,7 @@
               <w:jc w:val="left"/>
             </w:pPr>
             <w:r>
-              <w:t>18-core laptop; candidate tests and validation: 4-core machine; per-game results and logs of all 166 runs: folder results of our code package</w:t>
+              <w:t>18-core laptop; candidate tests and validation: 4-core machine; per-game results and logs of all 167 runs: folder results of our code package</w:t>
             </w:r>
           </w:p>
         </w:tc>
@@ -3334,7 +3334,7 @@
         <w:t>z</w:t>
       </w:r>
       <w:r>
-        <w:t xml:space="preserve"> = |difference|/SE, in percentage points (pp) for win rates. With 500 games a win rate near 50% has a 95% interval of ±4.4 pp, and a difference between two runs about ±5.7 pp even when paired, because the outcomes of two versions of our agent on the same deal correlate only weakly (at most 0.22 in our paired runs); such a comparison detects a difference of about 8 pp with 80% power. We report unadjusted intervals, apply a Holm correction [14] within each group of Fig. 2, and treat the four-player comparisons (60 of our 166 runs) as exploratory. We expected (E1) every component to improve both measures, (E2) the decoupled information-set tree to matter more at longer budgets and (E3) the best settings to depend on the number of players; E2 arose from the development runs.</w:t>
+        <w:t xml:space="preserve"> = |difference|/SE, in percentage points (pp) for win rates. With 500 games a win rate near 50% has a 95% interval of ±4.4 pp, and a difference between two runs about ±5.7 pp even when paired, because the outcomes of two versions of our agent on the same deal correlate only weakly (at most 0.22 in our paired runs); such a comparison detects a difference of about 8 pp with 80% power. We report unadjusted intervals, apply a Holm correction [14] within each group of Fig. 2, and treat the four-player comparisons (60 of our 167 runs) as exploratory. We expected (E1) every component to improve both measures, (E2) the decoupled information-set tree to matter more at longer budgets and (E3) the best settings to depend on the number of players; E2 arose from the development runs and is tested on the held-out deals.</w:t>
       </w:r>
     </w:p>
     <w:p>
@@ -4517,7 +4517,7 @@
         <w:t>z</w:t>
       </w:r>
       <w:r>
-        <w:t xml:space="preserve"> = 1.7), as v3 lost 17.3 pp and the final agent 8.1 pp. We hypothesise that v3's decline comes from its sequential tree, in which later players react to cards chosen earlier in the same turn: a wrong model that more iterations exploit more. S alone, which keeps v3's determinisation, gained +1.3 ± 6.1 pp at 100 ms but +6.2 ± 6.1 pp at 500 ms, consistent with this explanation. As v3's 50.1% at 100 ms was the best of 16 factorial cells (45.1–49.4% on new seeds), both rises are probably overstated. On the held-out deals S and I gained +6.1 ± 5.9 pp (</w:t>
+        <w:t xml:space="preserve"> = 1.7), as v3 lost 17.3 pp and the final agent 8.1 pp. We hypothesise that v3's decline comes from its sequential tree, in which later players react to cards chosen earlier in the same turn: a wrong model that more iterations exploit more. S alone, which keeps v3's determinisation, gained +1.3 ± 6.1 pp at 100 ms but +6.2 ± 6.1 pp at 500 ms, consistent with this explanation. As v3's 50.1% at 100 ms was the best of 16 factorial cells (45.1–49.4% on new seeds), both rises are probably overstated. On the held-out deals adding S and I to v3 changed its win rate by +6.1 ± 5.9 pp at 100 ms and +5.3 ± 5.5 pp at 500 ms, a difference of −0.8 ± 8.1 pp (</w:t>
       </w:r>
       <w:r>
         <w:rPr>
@@ -4526,7 +4526,7 @@
         <w:t>z</w:t>
       </w:r>
       <w:r>
-        <w:t xml:space="preserve"> = 2.04) at 100 ms (v3: 46.5%).</w:t>
+        <w:t xml:space="preserve"> = 0.2): no sign of the development rise (80% power only for 12 pp).</w:t>
       </w:r>
     </w:p>
     <w:p>
@@ -4673,7 +4673,7 @@
         <w:pStyle w:val="BodyText"/>
       </w:pPr>
       <w:r>
-        <w:t>For RQ1, every ablation lowers the score margin; after a Holm correction, removing the evaluation H or the decoupled information-set tree also lowers the win rate (H: 28.3 pp, or 13.6 pp against TAG's lead heuristic; tree: 10.2 pp, or 8.2 ± 4.1 pp pooled with the held-out deals). For RQ2, giving every agent more time lowered our win rate, by 5.5 ± 4.2 pp from 100 to 500 ms and, less clearly, by 4.9 ± 4.8 pp to 900 ms (two deal sets pooled), while TAG's ISMCTS won 9.5 pp more of its seats at 500 ms; in development v3's sequential tree lost more strength at longer budgets than the decoupled one, though the difference between the trends is not significant. For RQ3, the gain from S and I did not grow with time with four players (6.4 and 3.0 pp at 100 and 500 ms, development); settings tuned for four players cost 7.7 ± 5.4 pp with three players (exploratory); and with four players time beyond 500 ms rarely changes the decision of the wide, shallow joint-move tree.</w:t>
+        <w:t>For RQ1, every ablation lowers the score margin; after a Holm correction, removing the evaluation H or the decoupled information-set tree also lowers the win rate (H: 28.3 pp, or 13.6 pp against TAG's lead heuristic; tree: 10.2 pp, or 8.2 ± 4.1 pp pooled with the held-out deals). For RQ2, giving every agent more time lowered our win rate, by 5.5 ± 4.2 pp from 100 to 500 ms and, less clearly, by 4.9 ± 4.8 pp to 900 ms (two deal sets pooled), while TAG's ISMCTS won 9.5 pp more of its seats at 500 ms; the held-out test did not settle E2 (the gain from S and I changed by −0.8 ± 8.1 pp from 100 to 500 ms). For RQ3, the gain from S and I did not grow with time with four players (6.4 and 3.0 pp at 100 and 500 ms, development); settings tuned for four players cost 7.7 ± 5.4 pp with three players (exploratory); and with four players time beyond 500 ms rarely changes the decision of the wide, shallow joint-move tree.</w:t>
       </w:r>
     </w:p>
     <w:p>

</xml_diff>

<commit_message>
Report: author names and student numbers
Halit Ozger (230625112), Weronika Podgorska (230394735) and Hakan Coskun
(241076864) in the author block and the document metadata.

Co-Authored-By: Claude Opus 5.5 <noreply@anthropic.com>
Claude-Session: https://claude.ai/code/session_01Jg1ytYCX7c7JubKoggMArC
</commit_message>
<xml_diff>
--- a/report/ECS7032P_Assignment1_Report_GroupA.docx
+++ b/report/ECS7032P_Assignment1_Report_GroupA.docx
@@ -66,7 +66,7 @@
           <w:i w:val="0"/>
           <w:sz w:val="18"/>
         </w:rPr>
-        <w:t>Student no. [to be completed]</w:t>
+        <w:t>Student no. 230625112</w:t>
         <w:br/>
       </w:r>
       <w:r>
@@ -92,7 +92,7 @@
           <w:i w:val="0"/>
           <w:sz w:val="18"/>
         </w:rPr>
-        <w:t>[Group member 2]</w:t>
+        <w:t>Weronika Podgorska</w:t>
         <w:br/>
       </w:r>
       <w:r>
@@ -100,7 +100,7 @@
           <w:i w:val="0"/>
           <w:sz w:val="18"/>
         </w:rPr>
-        <w:t>Student no. [to be completed]</w:t>
+        <w:t>Student no. 230394735</w:t>
         <w:br/>
       </w:r>
       <w:r>
@@ -126,7 +126,7 @@
           <w:i w:val="0"/>
           <w:sz w:val="18"/>
         </w:rPr>
-        <w:t>[Group member 3]</w:t>
+        <w:t>Hakan Coskun</w:t>
         <w:br/>
       </w:r>
       <w:r>
@@ -134,7 +134,7 @@
           <w:i w:val="0"/>
           <w:sz w:val="18"/>
         </w:rPr>
-        <w:t>Student no. [to be completed]</w:t>
+        <w:t>Student no. 241076864</w:t>
         <w:br/>
       </w:r>
       <w:r>

</xml_diff>